<commit_message>
ADR 0005 and document updates for numbering and the reference seeds
- Request (req:<TypeCode>) and PROFORMA numbering definitions must be
  GAP_FREE (owner decision Q-PLT-08, DQ-B02-4); the definition trigger
  refuses ALLOW_GAPS for them (50031). Test N1 covers it.
- ADR 0005: allocation inside the business transaction, voiding, patterns,
  the ISO and permission seeds, error numbers 50029-50032, residual risks.
- O-12 closed and O-25 updated in tools/dbgen/erd_open_items.py.
- Design document, ADR 0004, readiness documents DOC-B02, DOC-B05,
  DOC-F07 and DOC-F09, and the owner decisions register updated; their
  Word files and volumes, and the ERD Word file, rebuilt.

Claude-Session: https://claude.ai/code/session_012HHcRrzuvMBTL2FYxXtsyv
</commit_message>
<xml_diff>
--- a/treasury-platform/docs/30-readiness/word/DOC-B02-acceptance-criteria-register-s0-s1.docx
+++ b/treasury-platform/docs/30-readiness/word/DOC-B02-acceptance-criteria-register-s0-s1.docx
@@ -871,6 +871,186 @@
     </w:p>
     <w:p>
       <w:pPr>
+        <w:pBdr>
+          <w:top w:val="single" w:color="E8C766" w:sz="6" w:space="6"/>
+          <w:left w:val="single" w:color="E8C766" w:sz="6" w:space="6"/>
+          <w:bottom w:val="single" w:color="E8C766" w:sz="6" w:space="6"/>
+          <w:right w:val="single" w:color="E8C766" w:sz="6" w:space="6"/>
+        </w:pBdr>
+        <w:shd w:fill="FFF8E1" w:color="auto" w:val="clear"/>
+        <w:bidi/>
+        <w:spacing w:after="160" w:before="60" w:line="300"/>
+        <w:ind w:left="140" w:right="140"/>
+      </w:pPr>
+      <w:r>
+        <w:rPr>
+          <w:rFonts w:ascii="Arial" w:cs="Arial" w:eastAsia="Arial" w:hAnsi="Arial"/>
+          <w:b/>
+          <w:bCs/>
+          <w:sz w:val="20"/>
+          <w:szCs w:val="20"/>
+          <w:rtl/>
+        </w:rPr>
+        <w:t xml:space="preserve">تحديث التنفيذ (2026-10-12):</w:t>
+      </w:r>
+      <w:r>
+        <w:rPr>
+          <w:rFonts w:ascii="Arial" w:cs="Arial" w:eastAsia="Arial" w:hAnsi="Arial"/>
+          <w:b w:val="false"/>
+          <w:bCs w:val="false"/>
+          <w:sz w:val="20"/>
+          <w:szCs w:val="20"/>
+          <w:rtl/>
+        </w:rPr>
+        <w:t xml:space="preserve"> AC-PLT-3 مؤتمت في القاعدة (docs/adr/0005-document-numbering-and-reference-seeds.md، db/static/039_numbering.sql) ويمر في CI: الحالة N2 في db/tests/numbering_tests.sql تعطي </w:t>
+      </w:r>
+      <w:r>
+        <w:rPr>
+          <w:rFonts w:ascii="Courier New" w:cs="Courier New" w:eastAsia="Courier New" w:hAnsi="Courier New"/>
+          <w:b w:val="false"/>
+          <w:bCs w:val="false"/>
+          <w:color w:val="1F2937"/>
+          <w:sz w:val="18"/>
+          <w:szCs w:val="18"/>
+          <w:shd w:fill="F1F3F5" w:color="auto" w:val="clear"/>
+          <w:rtl/>
+        </w:rPr>
+        <w:t xml:space="preserve">‎003-XX01-26‎</w:t>
+      </w:r>
+      <w:r>
+        <w:rPr>
+          <w:rFonts w:ascii="Arial" w:cs="Arial" w:eastAsia="Arial" w:hAnsi="Arial"/>
+          <w:b w:val="false"/>
+          <w:bCs w:val="false"/>
+          <w:sz w:val="20"/>
+          <w:szCs w:val="20"/>
+          <w:rtl/>
+        </w:rPr>
+        <w:t xml:space="preserve"> ثم </w:t>
+      </w:r>
+      <w:r>
+        <w:rPr>
+          <w:rFonts w:ascii="Courier New" w:cs="Courier New" w:eastAsia="Courier New" w:hAnsi="Courier New"/>
+          <w:b w:val="false"/>
+          <w:bCs w:val="false"/>
+          <w:color w:val="1F2937"/>
+          <w:sz w:val="18"/>
+          <w:szCs w:val="18"/>
+          <w:shd w:fill="F1F3F5" w:color="auto" w:val="clear"/>
+          <w:rtl/>
+        </w:rPr>
+        <w:t xml:space="preserve">‎004-XX01-26‎</w:t>
+      </w:r>
+      <w:r>
+        <w:rPr>
+          <w:rFonts w:ascii="Arial" w:cs="Arial" w:eastAsia="Arial" w:hAnsi="Arial"/>
+          <w:b w:val="false"/>
+          <w:bCs w:val="false"/>
+          <w:sz w:val="20"/>
+          <w:szCs w:val="20"/>
+          <w:rtl/>
+        </w:rPr>
+        <w:t xml:space="preserve"> بعد رقمين، والرقم الملغى يبقى «ملغى» بسببه ولا يُعاد فيأتي بعده </w:t>
+      </w:r>
+      <w:r>
+        <w:rPr>
+          <w:rFonts w:ascii="Courier New" w:cs="Courier New" w:eastAsia="Courier New" w:hAnsi="Courier New"/>
+          <w:b w:val="false"/>
+          <w:bCs w:val="false"/>
+          <w:color w:val="1F2937"/>
+          <w:sz w:val="18"/>
+          <w:szCs w:val="18"/>
+          <w:shd w:fill="F1F3F5" w:color="auto" w:val="clear"/>
+          <w:rtl/>
+        </w:rPr>
+        <w:t xml:space="preserve">‎005-XX01-26‎</w:t>
+      </w:r>
+      <w:r>
+        <w:rPr>
+          <w:rFonts w:ascii="Arial" w:cs="Arial" w:eastAsia="Arial" w:hAnsi="Arial"/>
+          <w:b w:val="false"/>
+          <w:bCs w:val="false"/>
+          <w:sz w:val="20"/>
+          <w:szCs w:val="20"/>
+          <w:rtl/>
+        </w:rPr>
+        <w:t xml:space="preserve">، وأول رقم في 2027 هو </w:t>
+      </w:r>
+      <w:r>
+        <w:rPr>
+          <w:rFonts w:ascii="Courier New" w:cs="Courier New" w:eastAsia="Courier New" w:hAnsi="Courier New"/>
+          <w:b w:val="false"/>
+          <w:bCs w:val="false"/>
+          <w:color w:val="1F2937"/>
+          <w:sz w:val="18"/>
+          <w:szCs w:val="18"/>
+          <w:shd w:fill="F1F3F5" w:color="auto" w:val="clear"/>
+          <w:rtl/>
+        </w:rPr>
+        <w:t xml:space="preserve">‎001-XX01-27‎</w:t>
+      </w:r>
+      <w:r>
+        <w:rPr>
+          <w:rFonts w:ascii="Arial" w:cs="Arial" w:eastAsia="Arial" w:hAnsi="Arial"/>
+          <w:b w:val="false"/>
+          <w:bCs w:val="false"/>
+          <w:sz w:val="20"/>
+          <w:szCs w:val="20"/>
+          <w:rtl/>
+        </w:rPr>
+        <w:t xml:space="preserve">؛ وفحص التزامن tools/ci/numbering_concurrency.sh يشغّل ستة اتصالات معًا ويتراجع عن ربع المعاملات، فتأتي الأرقام الملتزمة من 1 إلى 114 بلا تكرار ولا فجوة. قرار DQ-B02-4 (بلا فجوات للطلبات والبروفورما) مفروض في القاعدة: تعريفا </w:t>
+      </w:r>
+      <w:r>
+        <w:rPr>
+          <w:rFonts w:ascii="Courier New" w:cs="Courier New" w:eastAsia="Courier New" w:hAnsi="Courier New"/>
+          <w:b w:val="false"/>
+          <w:bCs w:val="false"/>
+          <w:color w:val="1F2937"/>
+          <w:sz w:val="18"/>
+          <w:szCs w:val="18"/>
+          <w:shd w:fill="F1F3F5" w:color="auto" w:val="clear"/>
+          <w:rtl/>
+        </w:rPr>
+        <w:t xml:space="preserve">‎req:&lt;TypeCode&gt;‎</w:t>
+      </w:r>
+      <w:r>
+        <w:rPr>
+          <w:rFonts w:ascii="Arial" w:cs="Arial" w:eastAsia="Arial" w:hAnsi="Arial"/>
+          <w:b w:val="false"/>
+          <w:bCs w:val="false"/>
+          <w:sz w:val="20"/>
+          <w:szCs w:val="20"/>
+          <w:rtl/>
+        </w:rPr>
+        <w:t xml:space="preserve"> و</w:t>
+      </w:r>
+      <w:r>
+        <w:rPr>
+          <w:rFonts w:ascii="Courier New" w:cs="Courier New" w:eastAsia="Courier New" w:hAnsi="Courier New"/>
+          <w:b w:val="false"/>
+          <w:bCs w:val="false"/>
+          <w:color w:val="1F2937"/>
+          <w:sz w:val="18"/>
+          <w:szCs w:val="18"/>
+          <w:shd w:fill="F1F3F5" w:color="auto" w:val="clear"/>
+          <w:rtl/>
+        </w:rPr>
+        <w:t xml:space="preserve">‎PROFORMA‎</w:t>
+      </w:r>
+      <w:r>
+        <w:rPr>
+          <w:rFonts w:ascii="Arial" w:cs="Arial" w:eastAsia="Arial" w:hAnsi="Arial"/>
+          <w:b w:val="false"/>
+          <w:bCs w:val="false"/>
+          <w:sz w:val="20"/>
+          <w:szCs w:val="20"/>
+          <w:rtl/>
+        </w:rPr>
+        <w:t xml:space="preserve"> لا يقبلان غير GAP_FREE. ويبقى سيناريو API نفسه على التطبيق.</w:t>
+      </w:r>
+    </w:p>
+    <w:p>
+      <w:pPr>
         <w:pStyle w:val="Heading1"/>
         <w:bidi/>
       </w:pPr>
@@ -35159,14 +35339,23 @@
             </w:pPr>
             <w:r>
               <w:rPr>
-                <w:rFonts w:ascii="Arial" w:cs="Arial" w:eastAsia="Arial" w:hAnsi="Arial"/>
-                <w:b w:val="false"/>
-                <w:bCs w:val="false"/>
-                <w:sz w:val="18"/>
-                <w:szCs w:val="18"/>
-                <w:rtl/>
-              </w:rPr>
-              <w:t xml:space="preserve">الإنجليزية، اللغة الأساس</w:t>
+                <w:rFonts w:ascii="Segoe UI Emoji" w:cs="Segoe UI Emoji" w:eastAsia="Segoe UI Emoji" w:hAnsi="Segoe UI Emoji"/>
+                <w:sz w:val="18"/>
+                <w:szCs w:val="18"/>
+                <w:rtl/>
+              </w:rPr>
+              <w:t xml:space="preserve">✅</w:t>
+            </w:r>
+            <w:r>
+              <w:rPr>
+                <w:rFonts w:ascii="Arial" w:cs="Arial" w:eastAsia="Arial" w:hAnsi="Arial"/>
+                <w:b w:val="false"/>
+                <w:bCs w:val="false"/>
+                <w:sz w:val="18"/>
+                <w:szCs w:val="18"/>
+                <w:rtl/>
+              </w:rPr>
+              <w:t xml:space="preserve"> معتمد من المالك (2026-10-12): الإنجليزية، اللغة الأساس</w:t>
             </w:r>
           </w:p>
         </w:tc>
@@ -35346,14 +35535,23 @@
             </w:pPr>
             <w:r>
               <w:rPr>
-                <w:rFonts w:ascii="Arial" w:cs="Arial" w:eastAsia="Arial" w:hAnsi="Arial"/>
-                <w:b w:val="false"/>
-                <w:bCs w:val="false"/>
-                <w:sz w:val="18"/>
-                <w:szCs w:val="18"/>
-                <w:rtl/>
-              </w:rPr>
-              <w:t xml:space="preserve">تتبع قرار O-18 (erd_open_items)</w:t>
+                <w:rFonts w:ascii="Segoe UI Emoji" w:cs="Segoe UI Emoji" w:eastAsia="Segoe UI Emoji" w:hAnsi="Segoe UI Emoji"/>
+                <w:sz w:val="18"/>
+                <w:szCs w:val="18"/>
+                <w:rtl/>
+              </w:rPr>
+              <w:t xml:space="preserve">✅</w:t>
+            </w:r>
+            <w:r>
+              <w:rPr>
+                <w:rFonts w:ascii="Arial" w:cs="Arial" w:eastAsia="Arial" w:hAnsi="Arial"/>
+                <w:b w:val="false"/>
+                <w:bCs w:val="false"/>
+                <w:sz w:val="18"/>
+                <w:szCs w:val="18"/>
+                <w:rtl/>
+              </w:rPr>
+              <w:t xml:space="preserve"> معتمد من المالك (2026-10-12): تتبع قرار O-18 (erd_open_items)</w:t>
             </w:r>
           </w:p>
         </w:tc>
@@ -35534,14 +35732,23 @@
             </w:pPr>
             <w:r>
               <w:rPr>
-                <w:rFonts w:ascii="Arial" w:cs="Arial" w:eastAsia="Arial" w:hAnsi="Arial"/>
-                <w:b w:val="false"/>
-                <w:bCs w:val="false"/>
-                <w:sz w:val="18"/>
-                <w:szCs w:val="18"/>
-                <w:rtl/>
-              </w:rPr>
-              <w:t xml:space="preserve">بلا فجوات للطلبات والبروفورما كما في Q-PLT-08، وإلا يُعدَّل AC-PLT-3</w:t>
+                <w:rFonts w:ascii="Segoe UI Emoji" w:cs="Segoe UI Emoji" w:eastAsia="Segoe UI Emoji" w:hAnsi="Segoe UI Emoji"/>
+                <w:sz w:val="18"/>
+                <w:szCs w:val="18"/>
+                <w:rtl/>
+              </w:rPr>
+              <w:t xml:space="preserve">✅</w:t>
+            </w:r>
+            <w:r>
+              <w:rPr>
+                <w:rFonts w:ascii="Arial" w:cs="Arial" w:eastAsia="Arial" w:hAnsi="Arial"/>
+                <w:b w:val="false"/>
+                <w:bCs w:val="false"/>
+                <w:sz w:val="18"/>
+                <w:szCs w:val="18"/>
+                <w:rtl/>
+              </w:rPr>
+              <w:t xml:space="preserve"> معتمد من المالك (2026-10-12): بلا فجوات للطلبات والبروفورما كما في Q-PLT-08، وإلا يُعدَّل AC-PLT-3</w:t>
             </w:r>
           </w:p>
         </w:tc>
@@ -35721,14 +35928,23 @@
             </w:pPr>
             <w:r>
               <w:rPr>
-                <w:rFonts w:ascii="Arial" w:cs="Arial" w:eastAsia="Arial" w:hAnsi="Arial"/>
-                <w:b w:val="false"/>
-                <w:bCs w:val="false"/>
-                <w:sz w:val="18"/>
-                <w:szCs w:val="18"/>
-                <w:rtl/>
-              </w:rPr>
-              <w:t xml:space="preserve">Must يوقف الخروج، وShould يوقفه إلا بتأجيل مكتوب، وCould لا يوقفه</w:t>
+                <w:rFonts w:ascii="Segoe UI Emoji" w:cs="Segoe UI Emoji" w:eastAsia="Segoe UI Emoji" w:hAnsi="Segoe UI Emoji"/>
+                <w:sz w:val="18"/>
+                <w:szCs w:val="18"/>
+                <w:rtl/>
+              </w:rPr>
+              <w:t xml:space="preserve">✅</w:t>
+            </w:r>
+            <w:r>
+              <w:rPr>
+                <w:rFonts w:ascii="Arial" w:cs="Arial" w:eastAsia="Arial" w:hAnsi="Arial"/>
+                <w:b w:val="false"/>
+                <w:bCs w:val="false"/>
+                <w:sz w:val="18"/>
+                <w:szCs w:val="18"/>
+                <w:rtl/>
+              </w:rPr>
+              <w:t xml:space="preserve"> معتمد من المالك (2026-10-12): Must يوقف الخروج، وShould يوقفه إلا بتأجيل مكتوب، وCould لا يوقفه</w:t>
             </w:r>
           </w:p>
         </w:tc>

</xml_diff>

<commit_message>
S1-b documents: docs/44, ADR 0042, docs/31 row 39, the DOC-B02 S1-b addendum
- docs/44 (Arabic): the batches, what works, the defaults OQ-1 to OQ-19 for the owner's
  approval, what was found on the way, the tests, and what stays outside S1-b.
- ADR 0042: the database changes (061, the AuthorityConflict columns, the setting) and the
  notable rules of the application.
- docs/31 row 39 records the build and that the defaults wait for approval.
- DOC-B02 section 9: the S1-b acceptance criteria and their tests, the new AC-ACC-7, and the
  corrections of AC-ACC-4 (OQ-13) and AC-ACC-3 (OQ-6). Word files regenerated.

Co-Authored-By: Claude Opus 5.5 <noreply@anthropic.com>
Claude-Session: https://claude.ai/code/session_012HHcRrzuvMBTL2FYxXtsyv
</commit_message>
<xml_diff>
--- a/treasury-platform/docs/30-readiness/word/DOC-B02-acceptance-criteria-register-s0-s1.docx
+++ b/treasury-platform/docs/30-readiness/word/DOC-B02-acceptance-criteria-register-s0-s1.docx
@@ -865,6 +865,27 @@
       </w:hyperlink>
     </w:p>
     <w:p>
+      <w:pPr>
+        <w:bidi/>
+        <w:spacing w:after="50" w:before="0"/>
+        <w:ind w:left="0"/>
+      </w:pPr>
+      <w:hyperlink w:history="1" w:anchor="_sec25">
+        <w:r>
+          <w:rPr>
+            <w:rFonts w:ascii="Arial" w:cs="Arial" w:eastAsia="Arial" w:hAnsi="Arial"/>
+            <w:b/>
+            <w:bCs/>
+            <w:color w:val="1F3A5F"/>
+            <w:sz w:val="20"/>
+            <w:szCs w:val="20"/>
+            <w:rtl/>
+          </w:rPr>
+          <w:t xml:space="preserve">9. ملحق S1-ب (2026-10-22)</w:t>
+        </w:r>
+      </w:hyperlink>
+    </w:p>
+    <w:p>
       <w:r>
         <w:br w:type="page"/>
       </w:r>
@@ -37891,6 +37912,1409 @@
       <w:pPr>
         <w:bidi/>
         <w:spacing w:after="120" w:before="0"/>
+      </w:pPr>
+    </w:p>
+    <w:p>
+      <w:pPr>
+        <w:pStyle w:val="Heading1"/>
+        <w:bidi/>
+      </w:pPr>
+      <w:bookmarkStart w:name="_sec25" w:id="25"/>
+      <w:r>
+        <w:rPr>
+          <w:rFonts w:ascii="Arial" w:cs="Arial" w:eastAsia="Arial" w:hAnsi="Arial"/>
+          <w:b/>
+          <w:bCs/>
+          <w:color w:val="1F3A5F"/>
+          <w:sz w:val="32"/>
+          <w:szCs w:val="32"/>
+          <w:rtl/>
+        </w:rPr>
+        <w:t xml:space="preserve">9. ملحق S1-ب (2026-10-22)</w:t>
+      </w:r>
+      <w:bookmarkEnd w:id="25"/>
+    </w:p>
+    <w:p>
+      <w:pPr>
+        <w:bidi/>
+        <w:spacing w:after="110" w:before="0" w:line="312"/>
+      </w:pPr>
+      <w:r>
+        <w:rPr>
+          <w:rFonts w:ascii="Arial" w:cs="Arial" w:eastAsia="Arial" w:hAnsi="Arial"/>
+          <w:b w:val="false"/>
+          <w:bCs w:val="false"/>
+          <w:sz w:val="21"/>
+          <w:szCs w:val="21"/>
+          <w:rtl/>
+        </w:rPr>
+        <w:t xml:space="preserve">كتبه وكيل ذكاء اصطناعي مع بناء S1-ب (</w:t>
+      </w:r>
+      <w:r>
+        <w:rPr>
+          <w:rFonts w:ascii="Courier New" w:cs="Courier New" w:eastAsia="Courier New" w:hAnsi="Courier New"/>
+          <w:b w:val="false"/>
+          <w:bCs w:val="false"/>
+          <w:color w:val="1F2937"/>
+          <w:sz w:val="18"/>
+          <w:szCs w:val="18"/>
+          <w:shd w:fill="F1F3F5" w:color="auto" w:val="clear"/>
+          <w:rtl/>
+        </w:rPr>
+        <w:t xml:space="preserve">‎docs/44‎</w:t>
+      </w:r>
+      <w:r>
+        <w:rPr>
+          <w:rFonts w:ascii="Arial" w:cs="Arial" w:eastAsia="Arial" w:hAnsi="Arial"/>
+          <w:b w:val="false"/>
+          <w:bCs w:val="false"/>
+          <w:sz w:val="21"/>
+          <w:szCs w:val="21"/>
+          <w:rtl/>
+        </w:rPr>
+        <w:t xml:space="preserve">، ADR 0042). مسار الخروج بقرار OQ-12 هو AC-ACC-3 مع AC-ACC-7، ويُعامَل FR-ACC-018 كمتطلب إلزامي لهذا الخروج.</w:t>
+      </w:r>
+    </w:p>
+    <w:tbl>
+      <w:tblPr>
+        <w:bidiVisual/>
+        <w:tblW w:type="dxa" w:w="9864"/>
+        <w:tblBorders>
+          <w:top w:val="single" w:color="auto" w:sz="4"/>
+          <w:left w:val="single" w:color="auto" w:sz="4"/>
+          <w:bottom w:val="single" w:color="auto" w:sz="4"/>
+          <w:right w:val="single" w:color="auto" w:sz="4"/>
+          <w:insideH w:val="single" w:color="auto" w:sz="4"/>
+          <w:insideV w:val="single" w:color="auto" w:sz="4"/>
+        </w:tblBorders>
+      </w:tblPr>
+      <w:tblGrid>
+        <w:gridCol w:w="974"/>
+        <w:gridCol w:w="2600"/>
+        <w:gridCol w:w="5316"/>
+        <w:gridCol w:w="974"/>
+      </w:tblGrid>
+      <w:tr>
+        <w:trPr>
+          <w:cantSplit/>
+          <w:tblHeader/>
+        </w:trPr>
+        <w:tc>
+          <w:tcPr>
+            <w:tcW w:type="dxa" w:w="974"/>
+            <w:tcBorders>
+              <w:top w:val="single" w:color="BFC9D6" w:sz="4"/>
+              <w:left w:val="single" w:color="BFC9D6" w:sz="4"/>
+              <w:bottom w:val="single" w:color="BFC9D6" w:sz="4"/>
+              <w:right w:val="single" w:color="BFC9D6" w:sz="4"/>
+            </w:tcBorders>
+            <w:shd w:fill="1F3A5F" w:color="auto" w:val="clear"/>
+            <w:tcMar>
+              <w:top w:type="dxa" w:w="50"/>
+              <w:left w:type="dxa" w:w="90"/>
+              <w:bottom w:type="dxa" w:w="50"/>
+              <w:right w:type="dxa" w:w="90"/>
+            </w:tcMar>
+            <w:vAlign w:val="center"/>
+          </w:tcPr>
+          <w:p>
+            <w:pPr>
+              <w:keepNext w:val="false"/>
+              <w:bidi/>
+              <w:spacing w:after="30" w:before="30" w:line="264"/>
+            </w:pPr>
+            <w:r>
+              <w:rPr>
+                <w:rFonts w:ascii="Arial" w:cs="Arial" w:eastAsia="Arial" w:hAnsi="Arial"/>
+                <w:b/>
+                <w:bCs/>
+                <w:color w:val="FFFFFF"/>
+                <w:sz w:val="18"/>
+                <w:szCs w:val="18"/>
+                <w:rtl/>
+              </w:rPr>
+              <w:t xml:space="preserve">المعيار</w:t>
+            </w:r>
+          </w:p>
+        </w:tc>
+        <w:tc>
+          <w:tcPr>
+            <w:tcW w:type="dxa" w:w="2600"/>
+            <w:tcBorders>
+              <w:top w:val="single" w:color="BFC9D6" w:sz="4"/>
+              <w:left w:val="single" w:color="BFC9D6" w:sz="4"/>
+              <w:bottom w:val="single" w:color="BFC9D6" w:sz="4"/>
+              <w:right w:val="single" w:color="BFC9D6" w:sz="4"/>
+            </w:tcBorders>
+            <w:shd w:fill="1F3A5F" w:color="auto" w:val="clear"/>
+            <w:tcMar>
+              <w:top w:type="dxa" w:w="50"/>
+              <w:left w:type="dxa" w:w="90"/>
+              <w:bottom w:type="dxa" w:w="50"/>
+              <w:right w:type="dxa" w:w="90"/>
+            </w:tcMar>
+            <w:vAlign w:val="center"/>
+          </w:tcPr>
+          <w:p>
+            <w:pPr>
+              <w:keepNext w:val="false"/>
+              <w:bidi/>
+              <w:spacing w:after="30" w:before="30" w:line="264"/>
+            </w:pPr>
+            <w:r>
+              <w:rPr>
+                <w:rFonts w:ascii="Arial" w:cs="Arial" w:eastAsia="Arial" w:hAnsi="Arial"/>
+                <w:b/>
+                <w:bCs/>
+                <w:color w:val="FFFFFF"/>
+                <w:sz w:val="18"/>
+                <w:szCs w:val="18"/>
+                <w:rtl/>
+              </w:rPr>
+              <w:t xml:space="preserve">ما يثبته</w:t>
+            </w:r>
+          </w:p>
+        </w:tc>
+        <w:tc>
+          <w:tcPr>
+            <w:tcW w:type="dxa" w:w="5316"/>
+            <w:tcBorders>
+              <w:top w:val="single" w:color="BFC9D6" w:sz="4"/>
+              <w:left w:val="single" w:color="BFC9D6" w:sz="4"/>
+              <w:bottom w:val="single" w:color="BFC9D6" w:sz="4"/>
+              <w:right w:val="single" w:color="BFC9D6" w:sz="4"/>
+            </w:tcBorders>
+            <w:shd w:fill="1F3A5F" w:color="auto" w:val="clear"/>
+            <w:tcMar>
+              <w:top w:type="dxa" w:w="50"/>
+              <w:left w:type="dxa" w:w="90"/>
+              <w:bottom w:type="dxa" w:w="50"/>
+              <w:right w:type="dxa" w:w="90"/>
+            </w:tcMar>
+            <w:vAlign w:val="center"/>
+          </w:tcPr>
+          <w:p>
+            <w:pPr>
+              <w:keepNext w:val="false"/>
+              <w:bidi/>
+              <w:spacing w:after="30" w:before="30" w:line="264"/>
+            </w:pPr>
+            <w:r>
+              <w:rPr>
+                <w:rFonts w:ascii="Arial" w:cs="Arial" w:eastAsia="Arial" w:hAnsi="Arial"/>
+                <w:b/>
+                <w:bCs/>
+                <w:color w:val="FFFFFF"/>
+                <w:sz w:val="18"/>
+                <w:szCs w:val="18"/>
+                <w:rtl/>
+              </w:rPr>
+              <w:t xml:space="preserve">الاختبار</w:t>
+            </w:r>
+          </w:p>
+        </w:tc>
+        <w:tc>
+          <w:tcPr>
+            <w:tcW w:type="dxa" w:w="974"/>
+            <w:tcBorders>
+              <w:top w:val="single" w:color="BFC9D6" w:sz="4"/>
+              <w:left w:val="single" w:color="BFC9D6" w:sz="4"/>
+              <w:bottom w:val="single" w:color="BFC9D6" w:sz="4"/>
+              <w:right w:val="single" w:color="BFC9D6" w:sz="4"/>
+            </w:tcBorders>
+            <w:shd w:fill="1F3A5F" w:color="auto" w:val="clear"/>
+            <w:tcMar>
+              <w:top w:type="dxa" w:w="50"/>
+              <w:left w:type="dxa" w:w="90"/>
+              <w:bottom w:type="dxa" w:w="50"/>
+              <w:right w:type="dxa" w:w="90"/>
+            </w:tcMar>
+            <w:vAlign w:val="center"/>
+          </w:tcPr>
+          <w:p>
+            <w:pPr>
+              <w:keepNext w:val="false"/>
+              <w:bidi/>
+              <w:spacing w:after="30" w:before="30" w:line="264"/>
+            </w:pPr>
+            <w:r>
+              <w:rPr>
+                <w:rFonts w:ascii="Arial" w:cs="Arial" w:eastAsia="Arial" w:hAnsi="Arial"/>
+                <w:b/>
+                <w:bCs/>
+                <w:color w:val="FFFFFF"/>
+                <w:sz w:val="18"/>
+                <w:szCs w:val="18"/>
+                <w:rtl/>
+              </w:rPr>
+              <w:t xml:space="preserve">الحالة</w:t>
+            </w:r>
+          </w:p>
+        </w:tc>
+      </w:tr>
+      <w:tr>
+        <w:trPr>
+          <w:cantSplit/>
+        </w:trPr>
+        <w:tc>
+          <w:tcPr>
+            <w:tcW w:type="dxa" w:w="974"/>
+            <w:tcBorders>
+              <w:top w:val="single" w:color="BFC9D6" w:sz="4"/>
+              <w:left w:val="single" w:color="BFC9D6" w:sz="4"/>
+              <w:bottom w:val="single" w:color="BFC9D6" w:sz="4"/>
+              <w:right w:val="single" w:color="BFC9D6" w:sz="4"/>
+            </w:tcBorders>
+            <w:tcMar>
+              <w:top w:type="dxa" w:w="50"/>
+              <w:left w:type="dxa" w:w="90"/>
+              <w:bottom w:type="dxa" w:w="50"/>
+              <w:right w:type="dxa" w:w="90"/>
+            </w:tcMar>
+            <w:vAlign w:val="top"/>
+          </w:tcPr>
+          <w:p>
+            <w:pPr>
+              <w:keepNext w:val="false"/>
+              <w:bidi/>
+              <w:spacing w:after="30" w:before="30" w:line="264"/>
+            </w:pPr>
+            <w:r>
+              <w:rPr>
+                <w:rFonts w:ascii="Arial" w:cs="Arial" w:eastAsia="Arial" w:hAnsi="Arial"/>
+                <w:b w:val="false"/>
+                <w:bCs w:val="false"/>
+                <w:sz w:val="18"/>
+                <w:szCs w:val="18"/>
+                <w:rtl/>
+              </w:rPr>
+              <w:t xml:space="preserve">AC-ORG-1</w:t>
+            </w:r>
+          </w:p>
+        </w:tc>
+        <w:tc>
+          <w:tcPr>
+            <w:tcW w:type="dxa" w:w="2600"/>
+            <w:tcBorders>
+              <w:top w:val="single" w:color="BFC9D6" w:sz="4"/>
+              <w:left w:val="single" w:color="BFC9D6" w:sz="4"/>
+              <w:bottom w:val="single" w:color="BFC9D6" w:sz="4"/>
+              <w:right w:val="single" w:color="BFC9D6" w:sz="4"/>
+            </w:tcBorders>
+            <w:tcMar>
+              <w:top w:type="dxa" w:w="50"/>
+              <w:left w:type="dxa" w:w="90"/>
+              <w:bottom w:type="dxa" w:w="50"/>
+              <w:right w:type="dxa" w:w="90"/>
+            </w:tcMar>
+            <w:vAlign w:val="top"/>
+          </w:tcPr>
+          <w:p>
+            <w:pPr>
+              <w:keepNext w:val="false"/>
+              <w:bidi/>
+              <w:spacing w:after="30" w:before="30" w:line="264"/>
+            </w:pPr>
+            <w:r>
+              <w:rPr>
+                <w:rFonts w:ascii="Arial" w:cs="Arial" w:eastAsia="Arial" w:hAnsi="Arial"/>
+                <w:b w:val="false"/>
+                <w:bCs w:val="false"/>
+                <w:sz w:val="18"/>
+                <w:szCs w:val="18"/>
+                <w:rtl/>
+              </w:rPr>
+              <w:t xml:space="preserve">مجموع الملكية 100% والفرق في الرسالة، وإغلاق الصفوف في اليوم السابق، وحدث تدقيق واحد</w:t>
+            </w:r>
+          </w:p>
+        </w:tc>
+        <w:tc>
+          <w:tcPr>
+            <w:tcW w:type="dxa" w:w="5316"/>
+            <w:tcBorders>
+              <w:top w:val="single" w:color="BFC9D6" w:sz="4"/>
+              <w:left w:val="single" w:color="BFC9D6" w:sz="4"/>
+              <w:bottom w:val="single" w:color="BFC9D6" w:sz="4"/>
+              <w:right w:val="single" w:color="BFC9D6" w:sz="4"/>
+            </w:tcBorders>
+            <w:tcMar>
+              <w:top w:type="dxa" w:w="50"/>
+              <w:left w:type="dxa" w:w="90"/>
+              <w:bottom w:type="dxa" w:w="50"/>
+              <w:right w:type="dxa" w:w="90"/>
+            </w:tcMar>
+            <w:vAlign w:val="top"/>
+          </w:tcPr>
+          <w:p>
+            <w:pPr>
+              <w:keepNext w:val="false"/>
+              <w:bidi/>
+              <w:spacing w:after="30" w:before="30" w:line="264"/>
+            </w:pPr>
+            <w:r>
+              <w:rPr>
+                <w:rFonts w:ascii="Courier New" w:cs="Courier New" w:eastAsia="Courier New" w:hAnsi="Courier New"/>
+                <w:b w:val="false"/>
+                <w:bCs w:val="false"/>
+                <w:color w:val="1F2937"/>
+                <w:sz w:val="16"/>
+                <w:szCs w:val="16"/>
+                <w:shd w:fill="F1F3F5" w:color="auto" w:val="clear"/>
+                <w:rtl/>
+              </w:rPr>
+              <w:t xml:space="preserve">‎OwnershipTests.AC_ORG_1_*‎</w:t>
+            </w:r>
+          </w:p>
+        </w:tc>
+        <w:tc>
+          <w:tcPr>
+            <w:tcW w:type="dxa" w:w="974"/>
+            <w:tcBorders>
+              <w:top w:val="single" w:color="BFC9D6" w:sz="4"/>
+              <w:left w:val="single" w:color="BFC9D6" w:sz="4"/>
+              <w:bottom w:val="single" w:color="BFC9D6" w:sz="4"/>
+              <w:right w:val="single" w:color="BFC9D6" w:sz="4"/>
+            </w:tcBorders>
+            <w:tcMar>
+              <w:top w:type="dxa" w:w="50"/>
+              <w:left w:type="dxa" w:w="90"/>
+              <w:bottom w:type="dxa" w:w="50"/>
+              <w:right w:type="dxa" w:w="90"/>
+            </w:tcMar>
+            <w:vAlign w:val="top"/>
+          </w:tcPr>
+          <w:p>
+            <w:pPr>
+              <w:keepNext w:val="false"/>
+              <w:bidi/>
+              <w:spacing w:after="30" w:before="30" w:line="264"/>
+            </w:pPr>
+            <w:r>
+              <w:rPr>
+                <w:rFonts w:ascii="Arial" w:cs="Arial" w:eastAsia="Arial" w:hAnsi="Arial"/>
+                <w:b w:val="false"/>
+                <w:bCs w:val="false"/>
+                <w:sz w:val="18"/>
+                <w:szCs w:val="18"/>
+                <w:rtl/>
+              </w:rPr>
+              <w:t xml:space="preserve">ناجح</w:t>
+            </w:r>
+          </w:p>
+        </w:tc>
+      </w:tr>
+      <w:tr>
+        <w:trPr>
+          <w:cantSplit/>
+        </w:trPr>
+        <w:tc>
+          <w:tcPr>
+            <w:tcW w:type="dxa" w:w="974"/>
+            <w:tcBorders>
+              <w:top w:val="single" w:color="BFC9D6" w:sz="4"/>
+              <w:left w:val="single" w:color="BFC9D6" w:sz="4"/>
+              <w:bottom w:val="single" w:color="BFC9D6" w:sz="4"/>
+              <w:right w:val="single" w:color="BFC9D6" w:sz="4"/>
+            </w:tcBorders>
+            <w:shd w:fill="F5F8FC" w:color="auto" w:val="clear"/>
+            <w:tcMar>
+              <w:top w:type="dxa" w:w="50"/>
+              <w:left w:type="dxa" w:w="90"/>
+              <w:bottom w:type="dxa" w:w="50"/>
+              <w:right w:type="dxa" w:w="90"/>
+            </w:tcMar>
+            <w:vAlign w:val="top"/>
+          </w:tcPr>
+          <w:p>
+            <w:pPr>
+              <w:keepNext w:val="false"/>
+              <w:bidi/>
+              <w:spacing w:after="30" w:before="30" w:line="264"/>
+            </w:pPr>
+            <w:r>
+              <w:rPr>
+                <w:rFonts w:ascii="Arial" w:cs="Arial" w:eastAsia="Arial" w:hAnsi="Arial"/>
+                <w:b w:val="false"/>
+                <w:bCs w:val="false"/>
+                <w:sz w:val="18"/>
+                <w:szCs w:val="18"/>
+                <w:rtl/>
+              </w:rPr>
+              <w:t xml:space="preserve">AC-ORG-2</w:t>
+            </w:r>
+          </w:p>
+        </w:tc>
+        <w:tc>
+          <w:tcPr>
+            <w:tcW w:type="dxa" w:w="2600"/>
+            <w:tcBorders>
+              <w:top w:val="single" w:color="BFC9D6" w:sz="4"/>
+              <w:left w:val="single" w:color="BFC9D6" w:sz="4"/>
+              <w:bottom w:val="single" w:color="BFC9D6" w:sz="4"/>
+              <w:right w:val="single" w:color="BFC9D6" w:sz="4"/>
+            </w:tcBorders>
+            <w:shd w:fill="F5F8FC" w:color="auto" w:val="clear"/>
+            <w:tcMar>
+              <w:top w:type="dxa" w:w="50"/>
+              <w:left w:type="dxa" w:w="90"/>
+              <w:bottom w:type="dxa" w:w="50"/>
+              <w:right w:type="dxa" w:w="90"/>
+            </w:tcMar>
+            <w:vAlign w:val="top"/>
+          </w:tcPr>
+          <w:p>
+            <w:pPr>
+              <w:keepNext w:val="false"/>
+              <w:bidi/>
+              <w:spacing w:after="30" w:before="30" w:line="264"/>
+            </w:pPr>
+            <w:r>
+              <w:rPr>
+                <w:rFonts w:ascii="Arial" w:cs="Arial" w:eastAsia="Arial" w:hAnsi="Arial"/>
+                <w:b w:val="false"/>
+                <w:bCs w:val="false"/>
+                <w:sz w:val="18"/>
+                <w:szCs w:val="18"/>
+                <w:rtl/>
+              </w:rPr>
+              <w:t xml:space="preserve">استعلام الصلاحية: المنفردة ثم المشتركة، و«مراجعة يدوية للعملة»، وعدم جمع السقوف المشتركة</w:t>
+            </w:r>
+          </w:p>
+        </w:tc>
+        <w:tc>
+          <w:tcPr>
+            <w:tcW w:type="dxa" w:w="5316"/>
+            <w:tcBorders>
+              <w:top w:val="single" w:color="BFC9D6" w:sz="4"/>
+              <w:left w:val="single" w:color="BFC9D6" w:sz="4"/>
+              <w:bottom w:val="single" w:color="BFC9D6" w:sz="4"/>
+              <w:right w:val="single" w:color="BFC9D6" w:sz="4"/>
+            </w:tcBorders>
+            <w:shd w:fill="F5F8FC" w:color="auto" w:val="clear"/>
+            <w:tcMar>
+              <w:top w:type="dxa" w:w="50"/>
+              <w:left w:type="dxa" w:w="90"/>
+              <w:bottom w:type="dxa" w:w="50"/>
+              <w:right w:type="dxa" w:w="90"/>
+            </w:tcMar>
+            <w:vAlign w:val="top"/>
+          </w:tcPr>
+          <w:p>
+            <w:pPr>
+              <w:keepNext w:val="false"/>
+              <w:bidi/>
+              <w:spacing w:after="30" w:before="30" w:line="264"/>
+            </w:pPr>
+            <w:r>
+              <w:rPr>
+                <w:rFonts w:ascii="Courier New" w:cs="Courier New" w:eastAsia="Courier New" w:hAnsi="Courier New"/>
+                <w:b w:val="false"/>
+                <w:bCs w:val="false"/>
+                <w:color w:val="1F2937"/>
+                <w:sz w:val="16"/>
+                <w:szCs w:val="16"/>
+                <w:shd w:fill="F1F3F5" w:color="auto" w:val="clear"/>
+                <w:rtl/>
+              </w:rPr>
+              <w:t xml:space="preserve">‎GovernanceTests.AC_ORG_2_*‎</w:t>
+            </w:r>
+          </w:p>
+        </w:tc>
+        <w:tc>
+          <w:tcPr>
+            <w:tcW w:type="dxa" w:w="974"/>
+            <w:tcBorders>
+              <w:top w:val="single" w:color="BFC9D6" w:sz="4"/>
+              <w:left w:val="single" w:color="BFC9D6" w:sz="4"/>
+              <w:bottom w:val="single" w:color="BFC9D6" w:sz="4"/>
+              <w:right w:val="single" w:color="BFC9D6" w:sz="4"/>
+            </w:tcBorders>
+            <w:shd w:fill="F5F8FC" w:color="auto" w:val="clear"/>
+            <w:tcMar>
+              <w:top w:type="dxa" w:w="50"/>
+              <w:left w:type="dxa" w:w="90"/>
+              <w:bottom w:type="dxa" w:w="50"/>
+              <w:right w:type="dxa" w:w="90"/>
+            </w:tcMar>
+            <w:vAlign w:val="top"/>
+          </w:tcPr>
+          <w:p>
+            <w:pPr>
+              <w:keepNext w:val="false"/>
+              <w:bidi/>
+              <w:spacing w:after="30" w:before="30" w:line="264"/>
+            </w:pPr>
+            <w:r>
+              <w:rPr>
+                <w:rFonts w:ascii="Arial" w:cs="Arial" w:eastAsia="Arial" w:hAnsi="Arial"/>
+                <w:b w:val="false"/>
+                <w:bCs w:val="false"/>
+                <w:sz w:val="18"/>
+                <w:szCs w:val="18"/>
+                <w:rtl/>
+              </w:rPr>
+              <w:t xml:space="preserve">ناجح</w:t>
+            </w:r>
+          </w:p>
+        </w:tc>
+      </w:tr>
+      <w:tr>
+        <w:trPr>
+          <w:cantSplit/>
+        </w:trPr>
+        <w:tc>
+          <w:tcPr>
+            <w:tcW w:type="dxa" w:w="974"/>
+            <w:tcBorders>
+              <w:top w:val="single" w:color="BFC9D6" w:sz="4"/>
+              <w:left w:val="single" w:color="BFC9D6" w:sz="4"/>
+              <w:bottom w:val="single" w:color="BFC9D6" w:sz="4"/>
+              <w:right w:val="single" w:color="BFC9D6" w:sz="4"/>
+            </w:tcBorders>
+            <w:tcMar>
+              <w:top w:type="dxa" w:w="50"/>
+              <w:left w:type="dxa" w:w="90"/>
+              <w:bottom w:type="dxa" w:w="50"/>
+              <w:right w:type="dxa" w:w="90"/>
+            </w:tcMar>
+            <w:vAlign w:val="top"/>
+          </w:tcPr>
+          <w:p>
+            <w:pPr>
+              <w:keepNext w:val="false"/>
+              <w:bidi/>
+              <w:spacing w:after="30" w:before="30" w:line="264"/>
+            </w:pPr>
+            <w:r>
+              <w:rPr>
+                <w:rFonts w:ascii="Arial" w:cs="Arial" w:eastAsia="Arial" w:hAnsi="Arial"/>
+                <w:b w:val="false"/>
+                <w:bCs w:val="false"/>
+                <w:sz w:val="18"/>
+                <w:szCs w:val="18"/>
+                <w:rtl/>
+              </w:rPr>
+              <w:t xml:space="preserve">AC-ACC-2 (جزء SVC-03)</w:t>
+            </w:r>
+          </w:p>
+        </w:tc>
+        <w:tc>
+          <w:tcPr>
+            <w:tcW w:type="dxa" w:w="2600"/>
+            <w:tcBorders>
+              <w:top w:val="single" w:color="BFC9D6" w:sz="4"/>
+              <w:left w:val="single" w:color="BFC9D6" w:sz="4"/>
+              <w:bottom w:val="single" w:color="BFC9D6" w:sz="4"/>
+              <w:right w:val="single" w:color="BFC9D6" w:sz="4"/>
+            </w:tcBorders>
+            <w:tcMar>
+              <w:top w:type="dxa" w:w="50"/>
+              <w:left w:type="dxa" w:w="90"/>
+              <w:bottom w:type="dxa" w:w="50"/>
+              <w:right w:type="dxa" w:w="90"/>
+            </w:tcMar>
+            <w:vAlign w:val="top"/>
+          </w:tcPr>
+          <w:p>
+            <w:pPr>
+              <w:keepNext w:val="false"/>
+              <w:bidi/>
+              <w:spacing w:after="30" w:before="30" w:line="264"/>
+            </w:pPr>
+            <w:r>
+              <w:rPr>
+                <w:rFonts w:ascii="Arial" w:cs="Arial" w:eastAsia="Arial" w:hAnsi="Arial"/>
+                <w:b w:val="false"/>
+                <w:bCs w:val="false"/>
+                <w:sz w:val="18"/>
+                <w:szCs w:val="18"/>
+                <w:rtl/>
+              </w:rPr>
+              <w:t xml:space="preserve">250,000 على X، و1,000,000 على Y، و250,000 على V بالمستوى MASTER، وشارة المفوَّض بعدد علاقاته</w:t>
+            </w:r>
+          </w:p>
+        </w:tc>
+        <w:tc>
+          <w:tcPr>
+            <w:tcW w:type="dxa" w:w="5316"/>
+            <w:tcBorders>
+              <w:top w:val="single" w:color="BFC9D6" w:sz="4"/>
+              <w:left w:val="single" w:color="BFC9D6" w:sz="4"/>
+              <w:bottom w:val="single" w:color="BFC9D6" w:sz="4"/>
+              <w:right w:val="single" w:color="BFC9D6" w:sz="4"/>
+            </w:tcBorders>
+            <w:tcMar>
+              <w:top w:type="dxa" w:w="50"/>
+              <w:left w:type="dxa" w:w="90"/>
+              <w:bottom w:type="dxa" w:w="50"/>
+              <w:right w:type="dxa" w:w="90"/>
+            </w:tcMar>
+            <w:vAlign w:val="top"/>
+          </w:tcPr>
+          <w:p>
+            <w:pPr>
+              <w:keepNext w:val="false"/>
+              <w:bidi/>
+              <w:spacing w:after="30" w:before="30" w:line="264"/>
+            </w:pPr>
+            <w:r>
+              <w:rPr>
+                <w:rFonts w:ascii="Courier New" w:cs="Courier New" w:eastAsia="Courier New" w:hAnsi="Courier New"/>
+                <w:b w:val="false"/>
+                <w:bCs w:val="false"/>
+                <w:color w:val="1F2937"/>
+                <w:sz w:val="16"/>
+                <w:szCs w:val="16"/>
+                <w:shd w:fill="F1F3F5" w:color="auto" w:val="clear"/>
+                <w:rtl/>
+              </w:rPr>
+              <w:t xml:space="preserve">‎SignatoryTests.AC_ACC_2_*‎</w:t>
+            </w:r>
+          </w:p>
+        </w:tc>
+        <w:tc>
+          <w:tcPr>
+            <w:tcW w:type="dxa" w:w="974"/>
+            <w:tcBorders>
+              <w:top w:val="single" w:color="BFC9D6" w:sz="4"/>
+              <w:left w:val="single" w:color="BFC9D6" w:sz="4"/>
+              <w:bottom w:val="single" w:color="BFC9D6" w:sz="4"/>
+              <w:right w:val="single" w:color="BFC9D6" w:sz="4"/>
+            </w:tcBorders>
+            <w:tcMar>
+              <w:top w:type="dxa" w:w="50"/>
+              <w:left w:type="dxa" w:w="90"/>
+              <w:bottom w:type="dxa" w:w="50"/>
+              <w:right w:type="dxa" w:w="90"/>
+            </w:tcMar>
+            <w:vAlign w:val="top"/>
+          </w:tcPr>
+          <w:p>
+            <w:pPr>
+              <w:keepNext w:val="false"/>
+              <w:bidi/>
+              <w:spacing w:after="30" w:before="30" w:line="264"/>
+            </w:pPr>
+            <w:r>
+              <w:rPr>
+                <w:rFonts w:ascii="Arial" w:cs="Arial" w:eastAsia="Arial" w:hAnsi="Arial"/>
+                <w:b w:val="false"/>
+                <w:bCs w:val="false"/>
+                <w:sz w:val="18"/>
+                <w:szCs w:val="18"/>
+                <w:rtl/>
+              </w:rPr>
+              <w:t xml:space="preserve">ناجح؛ فحص الكفاية في S3</w:t>
+            </w:r>
+          </w:p>
+        </w:tc>
+      </w:tr>
+      <w:tr>
+        <w:trPr>
+          <w:cantSplit/>
+        </w:trPr>
+        <w:tc>
+          <w:tcPr>
+            <w:tcW w:type="dxa" w:w="974"/>
+            <w:tcBorders>
+              <w:top w:val="single" w:color="BFC9D6" w:sz="4"/>
+              <w:left w:val="single" w:color="BFC9D6" w:sz="4"/>
+              <w:bottom w:val="single" w:color="BFC9D6" w:sz="4"/>
+              <w:right w:val="single" w:color="BFC9D6" w:sz="4"/>
+            </w:tcBorders>
+            <w:shd w:fill="F5F8FC" w:color="auto" w:val="clear"/>
+            <w:tcMar>
+              <w:top w:type="dxa" w:w="50"/>
+              <w:left w:type="dxa" w:w="90"/>
+              <w:bottom w:type="dxa" w:w="50"/>
+              <w:right w:type="dxa" w:w="90"/>
+            </w:tcMar>
+            <w:vAlign w:val="top"/>
+          </w:tcPr>
+          <w:p>
+            <w:pPr>
+              <w:keepNext w:val="false"/>
+              <w:bidi/>
+              <w:spacing w:after="30" w:before="30" w:line="264"/>
+            </w:pPr>
+            <w:r>
+              <w:rPr>
+                <w:rFonts w:ascii="Arial" w:cs="Arial" w:eastAsia="Arial" w:hAnsi="Arial"/>
+                <w:b w:val="false"/>
+                <w:bCs w:val="false"/>
+                <w:sz w:val="18"/>
+                <w:szCs w:val="18"/>
+                <w:rtl/>
+              </w:rPr>
+              <w:t xml:space="preserve">AC-ACC-3</w:t>
+            </w:r>
+          </w:p>
+        </w:tc>
+        <w:tc>
+          <w:tcPr>
+            <w:tcW w:type="dxa" w:w="2600"/>
+            <w:tcBorders>
+              <w:top w:val="single" w:color="BFC9D6" w:sz="4"/>
+              <w:left w:val="single" w:color="BFC9D6" w:sz="4"/>
+              <w:bottom w:val="single" w:color="BFC9D6" w:sz="4"/>
+              <w:right w:val="single" w:color="BFC9D6" w:sz="4"/>
+            </w:tcBorders>
+            <w:shd w:fill="F5F8FC" w:color="auto" w:val="clear"/>
+            <w:tcMar>
+              <w:top w:type="dxa" w:w="50"/>
+              <w:left w:type="dxa" w:w="90"/>
+              <w:bottom w:type="dxa" w:w="50"/>
+              <w:right w:type="dxa" w:w="90"/>
+            </w:tcMar>
+            <w:vAlign w:val="top"/>
+          </w:tcPr>
+          <w:p>
+            <w:pPr>
+              <w:keepNext w:val="false"/>
+              <w:bidi/>
+              <w:spacing w:after="30" w:before="30" w:line="264"/>
+            </w:pPr>
+            <w:r>
+              <w:rPr>
+                <w:rFonts w:ascii="Arial" w:cs="Arial" w:eastAsia="Arial" w:hAnsi="Arial"/>
+                <w:b w:val="false"/>
+                <w:bCs w:val="false"/>
+                <w:sz w:val="18"/>
+                <w:szCs w:val="18"/>
+                <w:rtl/>
+              </w:rPr>
+              <w:t xml:space="preserve">تعارض CEILING_EXCEEDS يُفتح بتحذير وإشعار، ويُقرّ بسبب، ويُحلّ آليًا برفع المنحة؛ NOT_COMPARABLE_CURRENCY بالدولار؛ NO_GRANT ببصمة جديدة عند تقييد المنحة ببنك آخر</w:t>
+            </w:r>
+          </w:p>
+        </w:tc>
+        <w:tc>
+          <w:tcPr>
+            <w:tcW w:type="dxa" w:w="5316"/>
+            <w:tcBorders>
+              <w:top w:val="single" w:color="BFC9D6" w:sz="4"/>
+              <w:left w:val="single" w:color="BFC9D6" w:sz="4"/>
+              <w:bottom w:val="single" w:color="BFC9D6" w:sz="4"/>
+              <w:right w:val="single" w:color="BFC9D6" w:sz="4"/>
+            </w:tcBorders>
+            <w:shd w:fill="F5F8FC" w:color="auto" w:val="clear"/>
+            <w:tcMar>
+              <w:top w:type="dxa" w:w="50"/>
+              <w:left w:type="dxa" w:w="90"/>
+              <w:bottom w:type="dxa" w:w="50"/>
+              <w:right w:type="dxa" w:w="90"/>
+            </w:tcMar>
+            <w:vAlign w:val="top"/>
+          </w:tcPr>
+          <w:p>
+            <w:pPr>
+              <w:keepNext w:val="false"/>
+              <w:bidi/>
+              <w:spacing w:after="30" w:before="30" w:line="264"/>
+            </w:pPr>
+            <w:r>
+              <w:rPr>
+                <w:rFonts w:ascii="Courier New" w:cs="Courier New" w:eastAsia="Courier New" w:hAnsi="Courier New"/>
+                <w:b w:val="false"/>
+                <w:bCs w:val="false"/>
+                <w:color w:val="1F2937"/>
+                <w:sz w:val="16"/>
+                <w:szCs w:val="16"/>
+                <w:shd w:fill="F1F3F5" w:color="auto" w:val="clear"/>
+                <w:rtl/>
+              </w:rPr>
+              <w:t xml:space="preserve">‎GovernanceConflictTests.AC_ACC_3_and_AC_ACC_7_*‎</w:t>
+            </w:r>
+          </w:p>
+        </w:tc>
+        <w:tc>
+          <w:tcPr>
+            <w:tcW w:type="dxa" w:w="974"/>
+            <w:tcBorders>
+              <w:top w:val="single" w:color="BFC9D6" w:sz="4"/>
+              <w:left w:val="single" w:color="BFC9D6" w:sz="4"/>
+              <w:bottom w:val="single" w:color="BFC9D6" w:sz="4"/>
+              <w:right w:val="single" w:color="BFC9D6" w:sz="4"/>
+            </w:tcBorders>
+            <w:shd w:fill="F5F8FC" w:color="auto" w:val="clear"/>
+            <w:tcMar>
+              <w:top w:type="dxa" w:w="50"/>
+              <w:left w:type="dxa" w:w="90"/>
+              <w:bottom w:type="dxa" w:w="50"/>
+              <w:right w:type="dxa" w:w="90"/>
+            </w:tcMar>
+            <w:vAlign w:val="top"/>
+          </w:tcPr>
+          <w:p>
+            <w:pPr>
+              <w:keepNext w:val="false"/>
+              <w:bidi/>
+              <w:spacing w:after="30" w:before="30" w:line="264"/>
+            </w:pPr>
+            <w:r>
+              <w:rPr>
+                <w:rFonts w:ascii="Arial" w:cs="Arial" w:eastAsia="Arial" w:hAnsi="Arial"/>
+                <w:b w:val="false"/>
+                <w:bCs w:val="false"/>
+                <w:sz w:val="18"/>
+                <w:szCs w:val="18"/>
+                <w:rtl/>
+              </w:rPr>
+              <w:t xml:space="preserve">ناجح</w:t>
+            </w:r>
+          </w:p>
+        </w:tc>
+      </w:tr>
+      <w:tr>
+        <w:trPr>
+          <w:cantSplit/>
+        </w:trPr>
+        <w:tc>
+          <w:tcPr>
+            <w:tcW w:type="dxa" w:w="974"/>
+            <w:tcBorders>
+              <w:top w:val="single" w:color="BFC9D6" w:sz="4"/>
+              <w:left w:val="single" w:color="BFC9D6" w:sz="4"/>
+              <w:bottom w:val="single" w:color="BFC9D6" w:sz="4"/>
+              <w:right w:val="single" w:color="BFC9D6" w:sz="4"/>
+            </w:tcBorders>
+            <w:tcMar>
+              <w:top w:type="dxa" w:w="50"/>
+              <w:left w:type="dxa" w:w="90"/>
+              <w:bottom w:type="dxa" w:w="50"/>
+              <w:right w:type="dxa" w:w="90"/>
+            </w:tcMar>
+            <w:vAlign w:val="top"/>
+          </w:tcPr>
+          <w:p>
+            <w:pPr>
+              <w:keepNext w:val="false"/>
+              <w:bidi/>
+              <w:spacing w:after="30" w:before="30" w:line="264"/>
+            </w:pPr>
+            <w:r>
+              <w:rPr>
+                <w:rFonts w:ascii="Arial" w:cs="Arial" w:eastAsia="Arial" w:hAnsi="Arial"/>
+                <w:b w:val="false"/>
+                <w:bCs w:val="false"/>
+                <w:sz w:val="18"/>
+                <w:szCs w:val="18"/>
+                <w:rtl/>
+              </w:rPr>
+              <w:t xml:space="preserve">AC-ACC-4</w:t>
+            </w:r>
+          </w:p>
+        </w:tc>
+        <w:tc>
+          <w:tcPr>
+            <w:tcW w:type="dxa" w:w="2600"/>
+            <w:tcBorders>
+              <w:top w:val="single" w:color="BFC9D6" w:sz="4"/>
+              <w:left w:val="single" w:color="BFC9D6" w:sz="4"/>
+              <w:bottom w:val="single" w:color="BFC9D6" w:sz="4"/>
+              <w:right w:val="single" w:color="BFC9D6" w:sz="4"/>
+            </w:tcBorders>
+            <w:tcMar>
+              <w:top w:type="dxa" w:w="50"/>
+              <w:left w:type="dxa" w:w="90"/>
+              <w:bottom w:type="dxa" w:w="50"/>
+              <w:right w:type="dxa" w:w="90"/>
+            </w:tcMar>
+            <w:vAlign w:val="top"/>
+          </w:tcPr>
+          <w:p>
+            <w:pPr>
+              <w:keepNext w:val="false"/>
+              <w:bidi/>
+              <w:spacing w:after="30" w:before="30" w:line="264"/>
+            </w:pPr>
+            <w:r>
+              <w:rPr>
+                <w:rFonts w:ascii="Arial" w:cs="Arial" w:eastAsia="Arial" w:hAnsi="Arial"/>
+                <w:b w:val="false"/>
+                <w:bCs w:val="false"/>
+                <w:sz w:val="18"/>
+                <w:szCs w:val="18"/>
+                <w:rtl/>
+              </w:rPr>
+              <w:t xml:space="preserve">التنبيهات في 11-15 و11-30 و12-08 و12-15 بلا تكرار في اليوم، وEXPIRED في 12-16، والحساب في R-ACC-05</w:t>
+            </w:r>
+          </w:p>
+        </w:tc>
+        <w:tc>
+          <w:tcPr>
+            <w:tcW w:type="dxa" w:w="5316"/>
+            <w:tcBorders>
+              <w:top w:val="single" w:color="BFC9D6" w:sz="4"/>
+              <w:left w:val="single" w:color="BFC9D6" w:sz="4"/>
+              <w:bottom w:val="single" w:color="BFC9D6" w:sz="4"/>
+              <w:right w:val="single" w:color="BFC9D6" w:sz="4"/>
+            </w:tcBorders>
+            <w:tcMar>
+              <w:top w:type="dxa" w:w="50"/>
+              <w:left w:type="dxa" w:w="90"/>
+              <w:bottom w:type="dxa" w:w="50"/>
+              <w:right w:type="dxa" w:w="90"/>
+            </w:tcMar>
+            <w:vAlign w:val="top"/>
+          </w:tcPr>
+          <w:p>
+            <w:pPr>
+              <w:keepNext w:val="false"/>
+              <w:bidi/>
+              <w:spacing w:after="30" w:before="30" w:line="264"/>
+            </w:pPr>
+            <w:r>
+              <w:rPr>
+                <w:rFonts w:ascii="Courier New" w:cs="Courier New" w:eastAsia="Courier New" w:hAnsi="Courier New"/>
+                <w:b w:val="false"/>
+                <w:bCs w:val="false"/>
+                <w:color w:val="1F2937"/>
+                <w:sz w:val="16"/>
+                <w:szCs w:val="16"/>
+                <w:shd w:fill="F1F3F5" w:color="auto" w:val="clear"/>
+                <w:rtl/>
+              </w:rPr>
+              <w:t xml:space="preserve">‎SignatoryTests.AC_ACC_4_*‎</w:t>
+            </w:r>
+          </w:p>
+        </w:tc>
+        <w:tc>
+          <w:tcPr>
+            <w:tcW w:type="dxa" w:w="974"/>
+            <w:tcBorders>
+              <w:top w:val="single" w:color="BFC9D6" w:sz="4"/>
+              <w:left w:val="single" w:color="BFC9D6" w:sz="4"/>
+              <w:bottom w:val="single" w:color="BFC9D6" w:sz="4"/>
+              <w:right w:val="single" w:color="BFC9D6" w:sz="4"/>
+            </w:tcBorders>
+            <w:tcMar>
+              <w:top w:type="dxa" w:w="50"/>
+              <w:left w:type="dxa" w:w="90"/>
+              <w:bottom w:type="dxa" w:w="50"/>
+              <w:right w:type="dxa" w:w="90"/>
+            </w:tcMar>
+            <w:vAlign w:val="top"/>
+          </w:tcPr>
+          <w:p>
+            <w:pPr>
+              <w:keepNext w:val="false"/>
+              <w:bidi/>
+              <w:spacing w:after="30" w:before="30" w:line="264"/>
+            </w:pPr>
+            <w:r>
+              <w:rPr>
+                <w:rFonts w:ascii="Arial" w:cs="Arial" w:eastAsia="Arial" w:hAnsi="Arial"/>
+                <w:b w:val="false"/>
+                <w:bCs w:val="false"/>
+                <w:sz w:val="18"/>
+                <w:szCs w:val="18"/>
+                <w:rtl/>
+              </w:rPr>
+              <w:t xml:space="preserve">ناجح</w:t>
+            </w:r>
+          </w:p>
+        </w:tc>
+      </w:tr>
+      <w:tr>
+        <w:trPr>
+          <w:cantSplit/>
+        </w:trPr>
+        <w:tc>
+          <w:tcPr>
+            <w:tcW w:type="dxa" w:w="974"/>
+            <w:tcBorders>
+              <w:top w:val="single" w:color="BFC9D6" w:sz="4"/>
+              <w:left w:val="single" w:color="BFC9D6" w:sz="4"/>
+              <w:bottom w:val="single" w:color="BFC9D6" w:sz="4"/>
+              <w:right w:val="single" w:color="BFC9D6" w:sz="4"/>
+            </w:tcBorders>
+            <w:shd w:fill="F5F8FC" w:color="auto" w:val="clear"/>
+            <w:tcMar>
+              <w:top w:type="dxa" w:w="50"/>
+              <w:left w:type="dxa" w:w="90"/>
+              <w:bottom w:type="dxa" w:w="50"/>
+              <w:right w:type="dxa" w:w="90"/>
+            </w:tcMar>
+            <w:vAlign w:val="top"/>
+          </w:tcPr>
+          <w:p>
+            <w:pPr>
+              <w:keepNext w:val="false"/>
+              <w:bidi/>
+              <w:spacing w:after="30" w:before="30" w:line="264"/>
+            </w:pPr>
+            <w:r>
+              <w:rPr>
+                <w:rFonts w:ascii="Arial" w:cs="Arial" w:eastAsia="Arial" w:hAnsi="Arial"/>
+                <w:b w:val="false"/>
+                <w:bCs w:val="false"/>
+                <w:sz w:val="18"/>
+                <w:szCs w:val="18"/>
+                <w:rtl/>
+              </w:rPr>
+              <w:t xml:space="preserve">AC-ACC-6</w:t>
+            </w:r>
+          </w:p>
+        </w:tc>
+        <w:tc>
+          <w:tcPr>
+            <w:tcW w:type="dxa" w:w="2600"/>
+            <w:tcBorders>
+              <w:top w:val="single" w:color="BFC9D6" w:sz="4"/>
+              <w:left w:val="single" w:color="BFC9D6" w:sz="4"/>
+              <w:bottom w:val="single" w:color="BFC9D6" w:sz="4"/>
+              <w:right w:val="single" w:color="BFC9D6" w:sz="4"/>
+            </w:tcBorders>
+            <w:shd w:fill="F5F8FC" w:color="auto" w:val="clear"/>
+            <w:tcMar>
+              <w:top w:type="dxa" w:w="50"/>
+              <w:left w:type="dxa" w:w="90"/>
+              <w:bottom w:type="dxa" w:w="50"/>
+              <w:right w:type="dxa" w:w="90"/>
+            </w:tcMar>
+            <w:vAlign w:val="top"/>
+          </w:tcPr>
+          <w:p>
+            <w:pPr>
+              <w:keepNext w:val="false"/>
+              <w:bidi/>
+              <w:spacing w:after="30" w:before="30" w:line="264"/>
+            </w:pPr>
+            <w:r>
+              <w:rPr>
+                <w:rFonts w:ascii="Arial" w:cs="Arial" w:eastAsia="Arial" w:hAnsi="Arial"/>
+                <w:b w:val="false"/>
+                <w:bCs w:val="false"/>
+                <w:sz w:val="18"/>
+                <w:szCs w:val="18"/>
+                <w:rtl/>
+              </w:rPr>
+              <w:t xml:space="preserve">نموذج التوقيع: رفض لموظف الخزينة مع سجل، وفتح للمسؤول المالي مع سجل</w:t>
+            </w:r>
+          </w:p>
+        </w:tc>
+        <w:tc>
+          <w:tcPr>
+            <w:tcW w:type="dxa" w:w="5316"/>
+            <w:tcBorders>
+              <w:top w:val="single" w:color="BFC9D6" w:sz="4"/>
+              <w:left w:val="single" w:color="BFC9D6" w:sz="4"/>
+              <w:bottom w:val="single" w:color="BFC9D6" w:sz="4"/>
+              <w:right w:val="single" w:color="BFC9D6" w:sz="4"/>
+            </w:tcBorders>
+            <w:shd w:fill="F5F8FC" w:color="auto" w:val="clear"/>
+            <w:tcMar>
+              <w:top w:type="dxa" w:w="50"/>
+              <w:left w:type="dxa" w:w="90"/>
+              <w:bottom w:type="dxa" w:w="50"/>
+              <w:right w:type="dxa" w:w="90"/>
+            </w:tcMar>
+            <w:vAlign w:val="top"/>
+          </w:tcPr>
+          <w:p>
+            <w:pPr>
+              <w:keepNext w:val="false"/>
+              <w:bidi/>
+              <w:spacing w:after="30" w:before="30" w:line="264"/>
+            </w:pPr>
+            <w:r>
+              <w:rPr>
+                <w:rFonts w:ascii="Courier New" w:cs="Courier New" w:eastAsia="Courier New" w:hAnsi="Courier New"/>
+                <w:b w:val="false"/>
+                <w:bCs w:val="false"/>
+                <w:color w:val="1F2937"/>
+                <w:sz w:val="16"/>
+                <w:szCs w:val="16"/>
+                <w:shd w:fill="F1F3F5" w:color="auto" w:val="clear"/>
+                <w:rtl/>
+              </w:rPr>
+              <w:t xml:space="preserve">‎SignatoryTests.AC_ACC_6_*‎</w:t>
+            </w:r>
+          </w:p>
+        </w:tc>
+        <w:tc>
+          <w:tcPr>
+            <w:tcW w:type="dxa" w:w="974"/>
+            <w:tcBorders>
+              <w:top w:val="single" w:color="BFC9D6" w:sz="4"/>
+              <w:left w:val="single" w:color="BFC9D6" w:sz="4"/>
+              <w:bottom w:val="single" w:color="BFC9D6" w:sz="4"/>
+              <w:right w:val="single" w:color="BFC9D6" w:sz="4"/>
+            </w:tcBorders>
+            <w:shd w:fill="F5F8FC" w:color="auto" w:val="clear"/>
+            <w:tcMar>
+              <w:top w:type="dxa" w:w="50"/>
+              <w:left w:type="dxa" w:w="90"/>
+              <w:bottom w:type="dxa" w:w="50"/>
+              <w:right w:type="dxa" w:w="90"/>
+            </w:tcMar>
+            <w:vAlign w:val="top"/>
+          </w:tcPr>
+          <w:p>
+            <w:pPr>
+              <w:keepNext w:val="false"/>
+              <w:bidi/>
+              <w:spacing w:after="30" w:before="30" w:line="264"/>
+            </w:pPr>
+            <w:r>
+              <w:rPr>
+                <w:rFonts w:ascii="Arial" w:cs="Arial" w:eastAsia="Arial" w:hAnsi="Arial"/>
+                <w:b w:val="false"/>
+                <w:bCs w:val="false"/>
+                <w:sz w:val="18"/>
+                <w:szCs w:val="18"/>
+                <w:rtl/>
+              </w:rPr>
+              <w:t xml:space="preserve">ناجح</w:t>
+            </w:r>
+          </w:p>
+        </w:tc>
+      </w:tr>
+      <w:tr>
+        <w:trPr>
+          <w:cantSplit/>
+        </w:trPr>
+        <w:tc>
+          <w:tcPr>
+            <w:tcW w:type="dxa" w:w="974"/>
+            <w:tcBorders>
+              <w:top w:val="single" w:color="BFC9D6" w:sz="4"/>
+              <w:left w:val="single" w:color="BFC9D6" w:sz="4"/>
+              <w:bottom w:val="single" w:color="BFC9D6" w:sz="4"/>
+              <w:right w:val="single" w:color="BFC9D6" w:sz="4"/>
+            </w:tcBorders>
+            <w:tcMar>
+              <w:top w:type="dxa" w:w="50"/>
+              <w:left w:type="dxa" w:w="90"/>
+              <w:bottom w:type="dxa" w:w="50"/>
+              <w:right w:type="dxa" w:w="90"/>
+            </w:tcMar>
+            <w:vAlign w:val="top"/>
+          </w:tcPr>
+          <w:p>
+            <w:pPr>
+              <w:keepNext w:val="false"/>
+              <w:bidi/>
+              <w:spacing w:after="30" w:before="30" w:line="264"/>
+            </w:pPr>
+            <w:r>
+              <w:rPr>
+                <w:rFonts w:ascii="Arial" w:cs="Arial" w:eastAsia="Arial" w:hAnsi="Arial"/>
+                <w:b/>
+                <w:bCs/>
+                <w:sz w:val="18"/>
+                <w:szCs w:val="18"/>
+                <w:rtl/>
+              </w:rPr>
+              <w:t xml:space="preserve">AC-ACC-7 (جديد)</w:t>
+            </w:r>
+          </w:p>
+        </w:tc>
+        <w:tc>
+          <w:tcPr>
+            <w:tcW w:type="dxa" w:w="2600"/>
+            <w:tcBorders>
+              <w:top w:val="single" w:color="BFC9D6" w:sz="4"/>
+              <w:left w:val="single" w:color="BFC9D6" w:sz="4"/>
+              <w:bottom w:val="single" w:color="BFC9D6" w:sz="4"/>
+              <w:right w:val="single" w:color="BFC9D6" w:sz="4"/>
+            </w:tcBorders>
+            <w:tcMar>
+              <w:top w:type="dxa" w:w="50"/>
+              <w:left w:type="dxa" w:w="90"/>
+              <w:bottom w:type="dxa" w:w="50"/>
+              <w:right w:type="dxa" w:w="90"/>
+            </w:tcMar>
+            <w:vAlign w:val="top"/>
+          </w:tcPr>
+          <w:p>
+            <w:pPr>
+              <w:keepNext w:val="false"/>
+              <w:bidi/>
+              <w:spacing w:after="30" w:before="30" w:line="264"/>
+            </w:pPr>
+            <w:r>
+              <w:rPr>
+                <w:rFonts w:ascii="Arial" w:cs="Arial" w:eastAsia="Arial" w:hAnsi="Arial"/>
+                <w:b w:val="false"/>
+                <w:bCs w:val="false"/>
+                <w:sz w:val="18"/>
+                <w:szCs w:val="18"/>
+                <w:rtl/>
+              </w:rPr>
+              <w:t xml:space="preserve">تقرير R-ACC-04 يسرد تعارضات السيناريو بالشركة والرمز؛ يقرؤه المدقق ولا يقرّ؛ الطباعة تُدقَّق؛ تشغيل المقارنة الليلية مرتين لا يضيف شيئًا</w:t>
+            </w:r>
+          </w:p>
+        </w:tc>
+        <w:tc>
+          <w:tcPr>
+            <w:tcW w:type="dxa" w:w="5316"/>
+            <w:tcBorders>
+              <w:top w:val="single" w:color="BFC9D6" w:sz="4"/>
+              <w:left w:val="single" w:color="BFC9D6" w:sz="4"/>
+              <w:bottom w:val="single" w:color="BFC9D6" w:sz="4"/>
+              <w:right w:val="single" w:color="BFC9D6" w:sz="4"/>
+            </w:tcBorders>
+            <w:tcMar>
+              <w:top w:type="dxa" w:w="50"/>
+              <w:left w:type="dxa" w:w="90"/>
+              <w:bottom w:type="dxa" w:w="50"/>
+              <w:right w:type="dxa" w:w="90"/>
+            </w:tcMar>
+            <w:vAlign w:val="top"/>
+          </w:tcPr>
+          <w:p>
+            <w:pPr>
+              <w:keepNext w:val="false"/>
+              <w:bidi/>
+              <w:spacing w:after="30" w:before="30" w:line="264"/>
+            </w:pPr>
+            <w:r>
+              <w:rPr>
+                <w:rFonts w:ascii="Courier New" w:cs="Courier New" w:eastAsia="Courier New" w:hAnsi="Courier New"/>
+                <w:b w:val="false"/>
+                <w:bCs w:val="false"/>
+                <w:color w:val="1F2937"/>
+                <w:sz w:val="16"/>
+                <w:szCs w:val="16"/>
+                <w:shd w:fill="F1F3F5" w:color="auto" w:val="clear"/>
+                <w:rtl/>
+              </w:rPr>
+              <w:t xml:space="preserve">‎GovernanceConflictTests.AC_ACC_3_and_AC_ACC_7_*‎</w:t>
+            </w:r>
+          </w:p>
+        </w:tc>
+        <w:tc>
+          <w:tcPr>
+            <w:tcW w:type="dxa" w:w="974"/>
+            <w:tcBorders>
+              <w:top w:val="single" w:color="BFC9D6" w:sz="4"/>
+              <w:left w:val="single" w:color="BFC9D6" w:sz="4"/>
+              <w:bottom w:val="single" w:color="BFC9D6" w:sz="4"/>
+              <w:right w:val="single" w:color="BFC9D6" w:sz="4"/>
+            </w:tcBorders>
+            <w:tcMar>
+              <w:top w:type="dxa" w:w="50"/>
+              <w:left w:type="dxa" w:w="90"/>
+              <w:bottom w:type="dxa" w:w="50"/>
+              <w:right w:type="dxa" w:w="90"/>
+            </w:tcMar>
+            <w:vAlign w:val="top"/>
+          </w:tcPr>
+          <w:p>
+            <w:pPr>
+              <w:keepNext w:val="false"/>
+              <w:bidi/>
+              <w:spacing w:after="30" w:before="30" w:line="264"/>
+            </w:pPr>
+            <w:r>
+              <w:rPr>
+                <w:rFonts w:ascii="Arial" w:cs="Arial" w:eastAsia="Arial" w:hAnsi="Arial"/>
+                <w:b w:val="false"/>
+                <w:bCs w:val="false"/>
+                <w:sz w:val="18"/>
+                <w:szCs w:val="18"/>
+                <w:rtl/>
+              </w:rPr>
+              <w:t xml:space="preserve">ناجح</w:t>
+            </w:r>
+          </w:p>
+        </w:tc>
+      </w:tr>
+    </w:tbl>
+    <w:p>
+      <w:pPr>
+        <w:bidi/>
+        <w:spacing w:after="120" w:before="0"/>
+      </w:pPr>
+    </w:p>
+    <w:p>
+      <w:pPr>
+        <w:bidi/>
+        <w:spacing w:after="110" w:before="0" w:line="312"/>
+      </w:pPr>
+      <w:r>
+        <w:rPr>
+          <w:rFonts w:ascii="Arial" w:cs="Arial" w:eastAsia="Arial" w:hAnsi="Arial"/>
+          <w:b w:val="false"/>
+          <w:bCs w:val="false"/>
+          <w:sz w:val="21"/>
+          <w:szCs w:val="21"/>
+          <w:rtl/>
+        </w:rPr>
+        <w:t xml:space="preserve">تصحيحان لنص المعايير بقرارات الموجز:</w:t>
+      </w:r>
+    </w:p>
+    <w:p>
+      <w:pPr>
+        <w:pStyle w:val="ListParagraph"/>
+        <w:numPr>
+          <w:ilvl w:val="0"/>
+          <w:numId w:val="2"/>
+        </w:numPr>
+        <w:bidi/>
+        <w:spacing w:after="70" w:before="0" w:line="300"/>
+      </w:pPr>
+      <w:r>
+        <w:rPr>
+          <w:rFonts w:ascii="Arial" w:cs="Arial" w:eastAsia="Arial" w:hAnsi="Arial"/>
+          <w:b/>
+          <w:bCs/>
+          <w:sz w:val="21"/>
+          <w:szCs w:val="21"/>
+          <w:rtl/>
+        </w:rPr>
+        <w:t xml:space="preserve">AC-ACC-4 (OQ-13):</w:t>
+      </w:r>
+      <w:r>
+        <w:rPr>
+          <w:rFonts w:ascii="Arial" w:cs="Arial" w:eastAsia="Arial" w:hAnsi="Arial"/>
+          <w:b w:val="false"/>
+          <w:bCs w:val="false"/>
+          <w:sz w:val="21"/>
+          <w:szCs w:val="21"/>
+          <w:rtl/>
+        </w:rPr>
+        <w:t xml:space="preserve"> «وثيقة تفويض بلا انتهاء» تُقرأ قرارَ مجلس الإدارة (BOARD_RESOLUTION)، لأن البذور تجعل للوكالة ولتفويض المفوَّضين تاريخ انتهاء إلزاميًا.</w:t>
+      </w:r>
+    </w:p>
+    <w:p>
+      <w:pPr>
+        <w:pStyle w:val="ListParagraph"/>
+        <w:numPr>
+          <w:ilvl w:val="0"/>
+          <w:numId w:val="2"/>
+        </w:numPr>
+        <w:bidi/>
+        <w:spacing w:after="70" w:before="0" w:line="300"/>
+      </w:pPr>
+      <w:r>
+        <w:rPr>
+          <w:rFonts w:ascii="Arial" w:cs="Arial" w:eastAsia="Arial" w:hAnsi="Arial"/>
+          <w:b/>
+          <w:bCs/>
+          <w:sz w:val="21"/>
+          <w:szCs w:val="21"/>
+          <w:rtl/>
+        </w:rPr>
+        <w:t xml:space="preserve">AC-ACC-3 (OQ-6):</w:t>
+      </w:r>
+      <w:r>
+        <w:rPr>
+          <w:rFonts w:ascii="Arial" w:cs="Arial" w:eastAsia="Arial" w:hAnsi="Arial"/>
+          <w:b w:val="false"/>
+          <w:bCs w:val="false"/>
+          <w:sz w:val="21"/>
+          <w:szCs w:val="21"/>
+          <w:rtl/>
+        </w:rPr>
+        <w:t xml:space="preserve"> رفع المنحة إلى 3,500,000 منحة جديدة يوافق عليها مستخدم آخر، ثم يُحلّ التعارض.</w:t>
+      </w:r>
+    </w:p>
+    <w:p>
+      <w:pPr>
+        <w:bidi/>
+        <w:spacing w:after="60" w:before="0"/>
       </w:pPr>
     </w:p>
     <w:sectPr>
@@ -38059,7 +39483,7 @@
         <w:szCs w:val="17"/>
         <w:rtl/>
       </w:rPr>
-      <w:t xml:space="preserve">DOC-B02 · BankFas · مستندات الجاهزية P0 · 0.1 مسودة</w:t>
+      <w:t xml:space="preserve">BankFas — DOC-B02</w:t>
     </w:r>
   </w:p>
 </w:hdr>

</xml_diff>

<commit_message>
S3: AC-FAC-12 over HTTP, form template screen, e2e S3 part, B02/B07 addenda, docs
- AC-FAC-12 through the reservation hook: 100 concurrent TM approvals of
  100,000 on a 4,000,000 line, replayed with the same keys (written, not run).
- Bank form templates readable by lc.print or lc.template.manage; read-only
  screen SCR-LCT-08 with its maps; Arabic strings.
- Browser test: the dashboards, the inbox and the bank form templates.
- DOC-B02 section 12 and DOC-B07 section 11 (S3); docs/48 section 3.4 and 5,
  ADR 0045 batches E and H; Word files regenerated.

Co-Authored-By: Claude Opus 5.5 <noreply@anthropic.com>
Claude-Session: https://claude.ai/code/session_012HHcRrzuvMBTL2FYxXtsyv
</commit_message>
<xml_diff>
--- a/treasury-platform/docs/30-readiness/word/DOC-B02-acceptance-criteria-register-s0-s1.docx
+++ b/treasury-platform/docs/30-readiness/word/DOC-B02-acceptance-criteria-register-s0-s1.docx
@@ -928,6 +928,27 @@
       </w:hyperlink>
     </w:p>
     <w:p>
+      <w:pPr>
+        <w:bidi/>
+        <w:spacing w:after="50" w:before="0"/>
+        <w:ind w:left="0"/>
+      </w:pPr>
+      <w:hyperlink w:history="1" w:anchor="_sec28">
+        <w:r>
+          <w:rPr>
+            <w:rFonts w:ascii="Arial" w:cs="Arial" w:eastAsia="Arial" w:hAnsi="Arial"/>
+            <w:b/>
+            <w:bCs/>
+            <w:color w:val="1F3A5F"/>
+            <w:sz w:val="20"/>
+            <w:szCs w:val="20"/>
+            <w:rtl/>
+          </w:rPr>
+          <w:t xml:space="preserve">12. ملحق S3 (2026-10-23)</w:t>
+        </w:r>
+      </w:hyperlink>
+    </w:p>
+    <w:p>
       <w:r>
         <w:br w:type="page"/>
       </w:r>
@@ -44678,6 +44699,3029 @@
           <w:rtl/>
         </w:rPr>
         <w:t xml:space="preserve">تنبيه على الحزمة DS-FIN-C: كتبها وكيل ذكاء اصطناعي، وأرقامها مخترعة. أدوار المُعِدّ والمراجع والمعتمِد تُوقَّع قبل UAT، وحالتها في البيان PROPOSED.</w:t>
+      </w:r>
+    </w:p>
+    <w:p>
+      <w:pPr>
+        <w:pStyle w:val="Heading1"/>
+        <w:bidi/>
+      </w:pPr>
+      <w:bookmarkStart w:name="_sec28" w:id="28"/>
+      <w:r>
+        <w:rPr>
+          <w:rFonts w:ascii="Arial" w:cs="Arial" w:eastAsia="Arial" w:hAnsi="Arial"/>
+          <w:b/>
+          <w:bCs/>
+          <w:color w:val="1F3A5F"/>
+          <w:sz w:val="32"/>
+          <w:szCs w:val="32"/>
+          <w:rtl/>
+        </w:rPr>
+        <w:t xml:space="preserve">12. ملحق S3 (2026-10-23)</w:t>
+      </w:r>
+      <w:bookmarkEnd w:id="28"/>
+    </w:p>
+    <w:p>
+      <w:pPr>
+        <w:bidi/>
+        <w:spacing w:after="110" w:before="0" w:line="312"/>
+      </w:pPr>
+      <w:r>
+        <w:rPr>
+          <w:rFonts w:ascii="Arial" w:cs="Arial" w:eastAsia="Arial" w:hAnsi="Arial"/>
+          <w:b w:val="false"/>
+          <w:bCs w:val="false"/>
+          <w:sz w:val="21"/>
+          <w:szCs w:val="21"/>
+          <w:rtl/>
+        </w:rPr>
+        <w:t xml:space="preserve">كتبه وكيل ذكاء اصطناعي مع بناء S3 (</w:t>
+      </w:r>
+      <w:r>
+        <w:rPr>
+          <w:rFonts w:ascii="Courier New" w:cs="Courier New" w:eastAsia="Courier New" w:hAnsi="Courier New"/>
+          <w:b w:val="false"/>
+          <w:bCs w:val="false"/>
+          <w:color w:val="1F2937"/>
+          <w:sz w:val="18"/>
+          <w:szCs w:val="18"/>
+          <w:shd w:fill="F1F3F5" w:color="auto" w:val="clear"/>
+          <w:rtl/>
+        </w:rPr>
+        <w:t xml:space="preserve">‎docs/48‎</w:t>
+      </w:r>
+      <w:r>
+        <w:rPr>
+          <w:rFonts w:ascii="Arial" w:cs="Arial" w:eastAsia="Arial" w:hAnsi="Arial"/>
+          <w:b w:val="false"/>
+          <w:bCs w:val="false"/>
+          <w:sz w:val="21"/>
+          <w:szCs w:val="21"/>
+          <w:rtl/>
+        </w:rPr>
+        <w:t xml:space="preserve">، ADR 0045). بُني S3 على الافتراضات التسعة عشر (OQ-1 إلى OQ-19) في موجزه، وهي </w:t>
+      </w:r>
+      <w:r>
+        <w:rPr>
+          <w:rFonts w:ascii="Arial" w:cs="Arial" w:eastAsia="Arial" w:hAnsi="Arial"/>
+          <w:b/>
+          <w:bCs/>
+          <w:sz w:val="21"/>
+          <w:szCs w:val="21"/>
+          <w:rtl/>
+        </w:rPr>
+        <w:t xml:space="preserve">بانتظار اعتماد المالك</w:t>
+      </w:r>
+      <w:r>
+        <w:rPr>
+          <w:rFonts w:ascii="Arial" w:cs="Arial" w:eastAsia="Arial" w:hAnsi="Arial"/>
+          <w:b w:val="false"/>
+          <w:bCs w:val="false"/>
+          <w:sz w:val="21"/>
+          <w:szCs w:val="21"/>
+          <w:rtl/>
+        </w:rPr>
+        <w:t xml:space="preserve">. مسار الخروج بالافتراض OQ-19: </w:t>
+      </w:r>
+      <w:r>
+        <w:rPr>
+          <w:rFonts w:ascii="Arial" w:cs="Arial" w:eastAsia="Arial" w:hAnsi="Arial"/>
+          <w:b/>
+          <w:bCs/>
+          <w:sz w:val="21"/>
+          <w:szCs w:val="21"/>
+          <w:rtl/>
+        </w:rPr>
+        <w:t xml:space="preserve">AC-REQ-1</w:t>
+      </w:r>
+      <w:r>
+        <w:rPr>
+          <w:rFonts w:ascii="Arial" w:cs="Arial" w:eastAsia="Arial" w:hAnsi="Arial"/>
+          <w:b w:val="false"/>
+          <w:bCs w:val="false"/>
+          <w:sz w:val="21"/>
+          <w:szCs w:val="21"/>
+          <w:rtl/>
+        </w:rPr>
+        <w:t xml:space="preserve"> و</w:t>
+      </w:r>
+      <w:r>
+        <w:rPr>
+          <w:rFonts w:ascii="Arial" w:cs="Arial" w:eastAsia="Arial" w:hAnsi="Arial"/>
+          <w:b/>
+          <w:bCs/>
+          <w:sz w:val="21"/>
+          <w:szCs w:val="21"/>
+          <w:rtl/>
+        </w:rPr>
+        <w:t xml:space="preserve">AC-WFL-3</w:t>
+      </w:r>
+      <w:r>
+        <w:rPr>
+          <w:rFonts w:ascii="Arial" w:cs="Arial" w:eastAsia="Arial" w:hAnsi="Arial"/>
+          <w:b w:val="false"/>
+          <w:bCs w:val="false"/>
+          <w:sz w:val="21"/>
+          <w:szCs w:val="21"/>
+          <w:rtl/>
+        </w:rPr>
+        <w:t xml:space="preserve"> و</w:t>
+      </w:r>
+      <w:r>
+        <w:rPr>
+          <w:rFonts w:ascii="Arial" w:cs="Arial" w:eastAsia="Arial" w:hAnsi="Arial"/>
+          <w:b/>
+          <w:bCs/>
+          <w:sz w:val="21"/>
+          <w:szCs w:val="21"/>
+          <w:rtl/>
+        </w:rPr>
+        <w:t xml:space="preserve">AC-LCI-1</w:t>
+      </w:r>
+      <w:r>
+        <w:rPr>
+          <w:rFonts w:ascii="Arial" w:cs="Arial" w:eastAsia="Arial" w:hAnsi="Arial"/>
+          <w:b w:val="false"/>
+          <w:bCs w:val="false"/>
+          <w:sz w:val="21"/>
+          <w:szCs w:val="21"/>
+          <w:rtl/>
+        </w:rPr>
+        <w:t xml:space="preserve">، ومعها اختبارات التعديلات والطابور والتفويض والمهل، وAC-FAC-12 عبر الخطاف، والخروج على البيانات الاصطناعية بالافتراض OQ-13.</w:t>
+      </w:r>
+    </w:p>
+    <w:p>
+      <w:pPr>
+        <w:bidi/>
+        <w:spacing w:after="110" w:before="0" w:line="312"/>
+      </w:pPr>
+      <w:r>
+        <w:rPr>
+          <w:rFonts w:ascii="Arial" w:cs="Arial" w:eastAsia="Arial" w:hAnsi="Arial"/>
+          <w:b/>
+          <w:bCs/>
+          <w:sz w:val="21"/>
+          <w:szCs w:val="21"/>
+          <w:rtl/>
+        </w:rPr>
+        <w:t xml:space="preserve">الحالة:</w:t>
+      </w:r>
+      <w:r>
+        <w:rPr>
+          <w:rFonts w:ascii="Arial" w:cs="Arial" w:eastAsia="Arial" w:hAnsi="Arial"/>
+          <w:b w:val="false"/>
+          <w:bCs w:val="false"/>
+          <w:sz w:val="21"/>
+          <w:szCs w:val="21"/>
+          <w:rtl/>
+        </w:rPr>
+        <w:t xml:space="preserve"> بطلب المالك («اكمل البناء ليتم الفحص لاحقا بعد اكتمال البناء») كُتبت الاختبارات المعلَّمة «مكتوب» وجُمِّعت دون تشغيل. تُشغَّل كلها في دورة CI واحدة بعد اكتمال البناء، ويُحدَّث هذا الجدول بنتيجتها. «ناجح» معناه أنه نجح في CI على الالتزام f63a30e أو eaff077 أو e4f16c3.</w:t>
+      </w:r>
+    </w:p>
+    <w:tbl>
+      <w:tblPr>
+        <w:bidiVisual/>
+        <w:tblW w:type="dxa" w:w="9864"/>
+        <w:tblBorders>
+          <w:top w:val="single" w:color="auto" w:sz="4"/>
+          <w:left w:val="single" w:color="auto" w:sz="4"/>
+          <w:bottom w:val="single" w:color="auto" w:sz="4"/>
+          <w:right w:val="single" w:color="auto" w:sz="4"/>
+          <w:insideH w:val="single" w:color="auto" w:sz="4"/>
+          <w:insideV w:val="single" w:color="auto" w:sz="4"/>
+        </w:tblBorders>
+      </w:tblPr>
+      <w:tblGrid>
+        <w:gridCol w:w="1440"/>
+        <w:gridCol w:w="2438"/>
+        <w:gridCol w:w="4878"/>
+        <w:gridCol w:w="1108"/>
+      </w:tblGrid>
+      <w:tr>
+        <w:trPr>
+          <w:cantSplit/>
+          <w:tblHeader/>
+        </w:trPr>
+        <w:tc>
+          <w:tcPr>
+            <w:tcW w:type="dxa" w:w="1440"/>
+            <w:tcBorders>
+              <w:top w:val="single" w:color="BFC9D6" w:sz="4"/>
+              <w:left w:val="single" w:color="BFC9D6" w:sz="4"/>
+              <w:bottom w:val="single" w:color="BFC9D6" w:sz="4"/>
+              <w:right w:val="single" w:color="BFC9D6" w:sz="4"/>
+            </w:tcBorders>
+            <w:shd w:fill="1F3A5F" w:color="auto" w:val="clear"/>
+            <w:tcMar>
+              <w:top w:type="dxa" w:w="50"/>
+              <w:left w:type="dxa" w:w="90"/>
+              <w:bottom w:type="dxa" w:w="50"/>
+              <w:right w:type="dxa" w:w="90"/>
+            </w:tcMar>
+            <w:vAlign w:val="center"/>
+          </w:tcPr>
+          <w:p>
+            <w:pPr>
+              <w:keepNext w:val="false"/>
+              <w:bidi/>
+              <w:spacing w:after="30" w:before="30" w:line="264"/>
+            </w:pPr>
+            <w:r>
+              <w:rPr>
+                <w:rFonts w:ascii="Arial" w:cs="Arial" w:eastAsia="Arial" w:hAnsi="Arial"/>
+                <w:b/>
+                <w:bCs/>
+                <w:color w:val="FFFFFF"/>
+                <w:sz w:val="18"/>
+                <w:szCs w:val="18"/>
+                <w:rtl/>
+              </w:rPr>
+              <w:t xml:space="preserve">المعيار</w:t>
+            </w:r>
+          </w:p>
+        </w:tc>
+        <w:tc>
+          <w:tcPr>
+            <w:tcW w:type="dxa" w:w="2438"/>
+            <w:tcBorders>
+              <w:top w:val="single" w:color="BFC9D6" w:sz="4"/>
+              <w:left w:val="single" w:color="BFC9D6" w:sz="4"/>
+              <w:bottom w:val="single" w:color="BFC9D6" w:sz="4"/>
+              <w:right w:val="single" w:color="BFC9D6" w:sz="4"/>
+            </w:tcBorders>
+            <w:shd w:fill="1F3A5F" w:color="auto" w:val="clear"/>
+            <w:tcMar>
+              <w:top w:type="dxa" w:w="50"/>
+              <w:left w:type="dxa" w:w="90"/>
+              <w:bottom w:type="dxa" w:w="50"/>
+              <w:right w:type="dxa" w:w="90"/>
+            </w:tcMar>
+            <w:vAlign w:val="center"/>
+          </w:tcPr>
+          <w:p>
+            <w:pPr>
+              <w:keepNext w:val="false"/>
+              <w:bidi/>
+              <w:spacing w:after="30" w:before="30" w:line="264"/>
+            </w:pPr>
+            <w:r>
+              <w:rPr>
+                <w:rFonts w:ascii="Arial" w:cs="Arial" w:eastAsia="Arial" w:hAnsi="Arial"/>
+                <w:b/>
+                <w:bCs/>
+                <w:color w:val="FFFFFF"/>
+                <w:sz w:val="18"/>
+                <w:szCs w:val="18"/>
+                <w:rtl/>
+              </w:rPr>
+              <w:t xml:space="preserve">ما يثبته</w:t>
+            </w:r>
+          </w:p>
+        </w:tc>
+        <w:tc>
+          <w:tcPr>
+            <w:tcW w:type="dxa" w:w="4878"/>
+            <w:tcBorders>
+              <w:top w:val="single" w:color="BFC9D6" w:sz="4"/>
+              <w:left w:val="single" w:color="BFC9D6" w:sz="4"/>
+              <w:bottom w:val="single" w:color="BFC9D6" w:sz="4"/>
+              <w:right w:val="single" w:color="BFC9D6" w:sz="4"/>
+            </w:tcBorders>
+            <w:shd w:fill="1F3A5F" w:color="auto" w:val="clear"/>
+            <w:tcMar>
+              <w:top w:type="dxa" w:w="50"/>
+              <w:left w:type="dxa" w:w="90"/>
+              <w:bottom w:type="dxa" w:w="50"/>
+              <w:right w:type="dxa" w:w="90"/>
+            </w:tcMar>
+            <w:vAlign w:val="center"/>
+          </w:tcPr>
+          <w:p>
+            <w:pPr>
+              <w:keepNext w:val="false"/>
+              <w:bidi/>
+              <w:spacing w:after="30" w:before="30" w:line="264"/>
+            </w:pPr>
+            <w:r>
+              <w:rPr>
+                <w:rFonts w:ascii="Arial" w:cs="Arial" w:eastAsia="Arial" w:hAnsi="Arial"/>
+                <w:b/>
+                <w:bCs/>
+                <w:color w:val="FFFFFF"/>
+                <w:sz w:val="18"/>
+                <w:szCs w:val="18"/>
+                <w:rtl/>
+              </w:rPr>
+              <w:t xml:space="preserve">الاختبار</w:t>
+            </w:r>
+          </w:p>
+        </w:tc>
+        <w:tc>
+          <w:tcPr>
+            <w:tcW w:type="dxa" w:w="1108"/>
+            <w:tcBorders>
+              <w:top w:val="single" w:color="BFC9D6" w:sz="4"/>
+              <w:left w:val="single" w:color="BFC9D6" w:sz="4"/>
+              <w:bottom w:val="single" w:color="BFC9D6" w:sz="4"/>
+              <w:right w:val="single" w:color="BFC9D6" w:sz="4"/>
+            </w:tcBorders>
+            <w:shd w:fill="1F3A5F" w:color="auto" w:val="clear"/>
+            <w:tcMar>
+              <w:top w:type="dxa" w:w="50"/>
+              <w:left w:type="dxa" w:w="90"/>
+              <w:bottom w:type="dxa" w:w="50"/>
+              <w:right w:type="dxa" w:w="90"/>
+            </w:tcMar>
+            <w:vAlign w:val="center"/>
+          </w:tcPr>
+          <w:p>
+            <w:pPr>
+              <w:keepNext w:val="false"/>
+              <w:bidi/>
+              <w:spacing w:after="30" w:before="30" w:line="264"/>
+            </w:pPr>
+            <w:r>
+              <w:rPr>
+                <w:rFonts w:ascii="Arial" w:cs="Arial" w:eastAsia="Arial" w:hAnsi="Arial"/>
+                <w:b/>
+                <w:bCs/>
+                <w:color w:val="FFFFFF"/>
+                <w:sz w:val="18"/>
+                <w:szCs w:val="18"/>
+                <w:rtl/>
+              </w:rPr>
+              <w:t xml:space="preserve">الحالة</w:t>
+            </w:r>
+          </w:p>
+        </w:tc>
+      </w:tr>
+      <w:tr>
+        <w:trPr>
+          <w:cantSplit/>
+        </w:trPr>
+        <w:tc>
+          <w:tcPr>
+            <w:tcW w:type="dxa" w:w="1440"/>
+            <w:tcBorders>
+              <w:top w:val="single" w:color="BFC9D6" w:sz="4"/>
+              <w:left w:val="single" w:color="BFC9D6" w:sz="4"/>
+              <w:bottom w:val="single" w:color="BFC9D6" w:sz="4"/>
+              <w:right w:val="single" w:color="BFC9D6" w:sz="4"/>
+            </w:tcBorders>
+            <w:tcMar>
+              <w:top w:type="dxa" w:w="50"/>
+              <w:left w:type="dxa" w:w="90"/>
+              <w:bottom w:type="dxa" w:w="50"/>
+              <w:right w:type="dxa" w:w="90"/>
+            </w:tcMar>
+            <w:vAlign w:val="top"/>
+          </w:tcPr>
+          <w:p>
+            <w:pPr>
+              <w:keepNext w:val="false"/>
+              <w:bidi/>
+              <w:spacing w:after="30" w:before="30" w:line="264"/>
+            </w:pPr>
+            <w:r>
+              <w:rPr>
+                <w:rFonts w:ascii="Arial" w:cs="Arial" w:eastAsia="Arial" w:hAnsi="Arial"/>
+                <w:b/>
+                <w:bCs/>
+                <w:sz w:val="18"/>
+                <w:szCs w:val="18"/>
+                <w:rtl/>
+              </w:rPr>
+              <w:t xml:space="preserve">AC-REQ-1</w:t>
+            </w:r>
+          </w:p>
+        </w:tc>
+        <w:tc>
+          <w:tcPr>
+            <w:tcW w:type="dxa" w:w="2438"/>
+            <w:tcBorders>
+              <w:top w:val="single" w:color="BFC9D6" w:sz="4"/>
+              <w:left w:val="single" w:color="BFC9D6" w:sz="4"/>
+              <w:bottom w:val="single" w:color="BFC9D6" w:sz="4"/>
+              <w:right w:val="single" w:color="BFC9D6" w:sz="4"/>
+            </w:tcBorders>
+            <w:tcMar>
+              <w:top w:type="dxa" w:w="50"/>
+              <w:left w:type="dxa" w:w="90"/>
+              <w:bottom w:type="dxa" w:w="50"/>
+              <w:right w:type="dxa" w:w="90"/>
+            </w:tcMar>
+            <w:vAlign w:val="top"/>
+          </w:tcPr>
+          <w:p>
+            <w:pPr>
+              <w:keepNext w:val="false"/>
+              <w:bidi/>
+              <w:spacing w:after="30" w:before="30" w:line="264"/>
+            </w:pPr>
+            <w:r>
+              <w:rPr>
+                <w:rFonts w:ascii="Arial" w:cs="Arial" w:eastAsia="Arial" w:hAnsi="Arial"/>
+                <w:b w:val="false"/>
+                <w:bCs w:val="false"/>
+                <w:sz w:val="18"/>
+                <w:szCs w:val="18"/>
+                <w:rtl/>
+              </w:rPr>
+              <w:t xml:space="preserve">طلب اعتماد شراء من المسودة إلى الإغلاق: الشروط وفحصها (V-LCT) وقفلها عند التقديم؛ موافقة المدير المباشر؛ الرقم مع الأصل الموقّع؛ اختيار الخط؛ حجز 3,000,000 مع التسامح 5% = 3,150,000 عند موافقة مدير الخزينة؛ مرجع ERP والموافقة الثانية؛ تسجيل التنفيذ بإيصال البنك (V-LCI-RECEIPT دونه)؛ الإصدار يحوّل الحجز إلى استخدام في معاملة واحدة؛ الإغلاق</w:t>
+            </w:r>
+          </w:p>
+        </w:tc>
+        <w:tc>
+          <w:tcPr>
+            <w:tcW w:type="dxa" w:w="4878"/>
+            <w:tcBorders>
+              <w:top w:val="single" w:color="BFC9D6" w:sz="4"/>
+              <w:left w:val="single" w:color="BFC9D6" w:sz="4"/>
+              <w:bottom w:val="single" w:color="BFC9D6" w:sz="4"/>
+              <w:right w:val="single" w:color="BFC9D6" w:sz="4"/>
+            </w:tcBorders>
+            <w:tcMar>
+              <w:top w:type="dxa" w:w="50"/>
+              <w:left w:type="dxa" w:w="90"/>
+              <w:bottom w:type="dxa" w:w="50"/>
+              <w:right w:type="dxa" w:w="90"/>
+            </w:tcMar>
+            <w:vAlign w:val="top"/>
+          </w:tcPr>
+          <w:p>
+            <w:pPr>
+              <w:keepNext w:val="false"/>
+              <w:bidi/>
+              <w:spacing w:after="30" w:before="30" w:line="264"/>
+            </w:pPr>
+            <w:r>
+              <w:rPr>
+                <w:rFonts w:ascii="Courier New" w:cs="Courier New" w:eastAsia="Courier New" w:hAnsi="Courier New"/>
+                <w:b w:val="false"/>
+                <w:bCs w:val="false"/>
+                <w:color w:val="1F2937"/>
+                <w:sz w:val="16"/>
+                <w:szCs w:val="16"/>
+                <w:shd w:fill="F1F3F5" w:color="auto" w:val="clear"/>
+                <w:rtl/>
+              </w:rPr>
+              <w:t xml:space="preserve">‎PurchaseLcTests.AC_REQ_1_*‎</w:t>
+            </w:r>
+          </w:p>
+        </w:tc>
+        <w:tc>
+          <w:tcPr>
+            <w:tcW w:type="dxa" w:w="1108"/>
+            <w:tcBorders>
+              <w:top w:val="single" w:color="BFC9D6" w:sz="4"/>
+              <w:left w:val="single" w:color="BFC9D6" w:sz="4"/>
+              <w:bottom w:val="single" w:color="BFC9D6" w:sz="4"/>
+              <w:right w:val="single" w:color="BFC9D6" w:sz="4"/>
+            </w:tcBorders>
+            <w:tcMar>
+              <w:top w:type="dxa" w:w="50"/>
+              <w:left w:type="dxa" w:w="90"/>
+              <w:bottom w:type="dxa" w:w="50"/>
+              <w:right w:type="dxa" w:w="90"/>
+            </w:tcMar>
+            <w:vAlign w:val="top"/>
+          </w:tcPr>
+          <w:p>
+            <w:pPr>
+              <w:keepNext w:val="false"/>
+              <w:bidi/>
+              <w:spacing w:after="30" w:before="30" w:line="264"/>
+            </w:pPr>
+            <w:r>
+              <w:rPr>
+                <w:rFonts w:ascii="Arial" w:cs="Arial" w:eastAsia="Arial" w:hAnsi="Arial"/>
+                <w:b w:val="false"/>
+                <w:bCs w:val="false"/>
+                <w:sz w:val="18"/>
+                <w:szCs w:val="18"/>
+                <w:rtl/>
+              </w:rPr>
+              <w:t xml:space="preserve">ناجح (eaff077)؛ يُعاد بعد إضافة التنفيذ والإيصال</w:t>
+            </w:r>
+          </w:p>
+        </w:tc>
+      </w:tr>
+      <w:tr>
+        <w:trPr>
+          <w:cantSplit/>
+        </w:trPr>
+        <w:tc>
+          <w:tcPr>
+            <w:tcW w:type="dxa" w:w="1440"/>
+            <w:tcBorders>
+              <w:top w:val="single" w:color="BFC9D6" w:sz="4"/>
+              <w:left w:val="single" w:color="BFC9D6" w:sz="4"/>
+              <w:bottom w:val="single" w:color="BFC9D6" w:sz="4"/>
+              <w:right w:val="single" w:color="BFC9D6" w:sz="4"/>
+            </w:tcBorders>
+            <w:shd w:fill="F5F8FC" w:color="auto" w:val="clear"/>
+            <w:tcMar>
+              <w:top w:type="dxa" w:w="50"/>
+              <w:left w:type="dxa" w:w="90"/>
+              <w:bottom w:type="dxa" w:w="50"/>
+              <w:right w:type="dxa" w:w="90"/>
+            </w:tcMar>
+            <w:vAlign w:val="top"/>
+          </w:tcPr>
+          <w:p>
+            <w:pPr>
+              <w:keepNext w:val="false"/>
+              <w:bidi/>
+              <w:spacing w:after="30" w:before="30" w:line="264"/>
+            </w:pPr>
+            <w:r>
+              <w:rPr>
+                <w:rFonts w:ascii="Arial" w:cs="Arial" w:eastAsia="Arial" w:hAnsi="Arial"/>
+                <w:b w:val="false"/>
+                <w:bCs w:val="false"/>
+                <w:sz w:val="18"/>
+                <w:szCs w:val="18"/>
+                <w:rtl/>
+              </w:rPr>
+              <w:t xml:space="preserve">AC-LCI-1</w:t>
+            </w:r>
+          </w:p>
+        </w:tc>
+        <w:tc>
+          <w:tcPr>
+            <w:tcW w:type="dxa" w:w="2438"/>
+            <w:tcBorders>
+              <w:top w:val="single" w:color="BFC9D6" w:sz="4"/>
+              <w:left w:val="single" w:color="BFC9D6" w:sz="4"/>
+              <w:bottom w:val="single" w:color="BFC9D6" w:sz="4"/>
+              <w:right w:val="single" w:color="BFC9D6" w:sz="4"/>
+            </w:tcBorders>
+            <w:shd w:fill="F5F8FC" w:color="auto" w:val="clear"/>
+            <w:tcMar>
+              <w:top w:type="dxa" w:w="50"/>
+              <w:left w:type="dxa" w:w="90"/>
+              <w:bottom w:type="dxa" w:w="50"/>
+              <w:right w:type="dxa" w:w="90"/>
+            </w:tcMar>
+            <w:vAlign w:val="top"/>
+          </w:tcPr>
+          <w:p>
+            <w:pPr>
+              <w:keepNext w:val="false"/>
+              <w:bidi/>
+              <w:spacing w:after="30" w:before="30" w:line="264"/>
+            </w:pPr>
+            <w:r>
+              <w:rPr>
+                <w:rFonts w:ascii="Arial" w:cs="Arial" w:eastAsia="Arial" w:hAnsi="Arial"/>
+                <w:b w:val="false"/>
+                <w:bCs w:val="false"/>
+                <w:sz w:val="18"/>
+                <w:szCs w:val="18"/>
+                <w:rtl/>
+              </w:rPr>
+              <w:t xml:space="preserve">السجل يجد الاعتماد برقمه مكتوبًا بشكل آخر؛ تقديم ضمن الانكشاف وآخر فوقه مرفوض (V-LCI-05)؛ قبول البنك والسداد يخفضان الاستخدام؛ الإغلاق ينتظر التقديمات المفتوحة؛ والتسوية الليلية لا تجد فرقًا؛ واعتماد بعد انتهائه EXPIRED بالمهمة</w:t>
+            </w:r>
+          </w:p>
+        </w:tc>
+        <w:tc>
+          <w:tcPr>
+            <w:tcW w:type="dxa" w:w="4878"/>
+            <w:tcBorders>
+              <w:top w:val="single" w:color="BFC9D6" w:sz="4"/>
+              <w:left w:val="single" w:color="BFC9D6" w:sz="4"/>
+              <w:bottom w:val="single" w:color="BFC9D6" w:sz="4"/>
+              <w:right w:val="single" w:color="BFC9D6" w:sz="4"/>
+            </w:tcBorders>
+            <w:shd w:fill="F5F8FC" w:color="auto" w:val="clear"/>
+            <w:tcMar>
+              <w:top w:type="dxa" w:w="50"/>
+              <w:left w:type="dxa" w:w="90"/>
+              <w:bottom w:type="dxa" w:w="50"/>
+              <w:right w:type="dxa" w:w="90"/>
+            </w:tcMar>
+            <w:vAlign w:val="top"/>
+          </w:tcPr>
+          <w:p>
+            <w:pPr>
+              <w:keepNext w:val="false"/>
+              <w:bidi/>
+              <w:spacing w:after="30" w:before="30" w:line="264"/>
+            </w:pPr>
+            <w:r>
+              <w:rPr>
+                <w:rFonts w:ascii="Courier New" w:cs="Courier New" w:eastAsia="Courier New" w:hAnsi="Courier New"/>
+                <w:b w:val="false"/>
+                <w:bCs w:val="false"/>
+                <w:color w:val="1F2937"/>
+                <w:sz w:val="16"/>
+                <w:szCs w:val="16"/>
+                <w:shd w:fill="F1F3F5" w:color="auto" w:val="clear"/>
+                <w:rtl/>
+              </w:rPr>
+              <w:t xml:space="preserve">‎PurchaseLcTests.An_issued_credit_*‎</w:t>
+            </w:r>
+          </w:p>
+        </w:tc>
+        <w:tc>
+          <w:tcPr>
+            <w:tcW w:type="dxa" w:w="1108"/>
+            <w:tcBorders>
+              <w:top w:val="single" w:color="BFC9D6" w:sz="4"/>
+              <w:left w:val="single" w:color="BFC9D6" w:sz="4"/>
+              <w:bottom w:val="single" w:color="BFC9D6" w:sz="4"/>
+              <w:right w:val="single" w:color="BFC9D6" w:sz="4"/>
+            </w:tcBorders>
+            <w:shd w:fill="F5F8FC" w:color="auto" w:val="clear"/>
+            <w:tcMar>
+              <w:top w:type="dxa" w:w="50"/>
+              <w:left w:type="dxa" w:w="90"/>
+              <w:bottom w:type="dxa" w:w="50"/>
+              <w:right w:type="dxa" w:w="90"/>
+            </w:tcMar>
+            <w:vAlign w:val="top"/>
+          </w:tcPr>
+          <w:p>
+            <w:pPr>
+              <w:keepNext w:val="false"/>
+              <w:bidi/>
+              <w:spacing w:after="30" w:before="30" w:line="264"/>
+            </w:pPr>
+            <w:r>
+              <w:rPr>
+                <w:rFonts w:ascii="Arial" w:cs="Arial" w:eastAsia="Arial" w:hAnsi="Arial"/>
+                <w:b w:val="false"/>
+                <w:bCs w:val="false"/>
+                <w:sz w:val="18"/>
+                <w:szCs w:val="18"/>
+                <w:rtl/>
+              </w:rPr>
+              <w:t xml:space="preserve">ناجح (eaff077)؛ يُعاد بعد إضافة الإيصال</w:t>
+            </w:r>
+          </w:p>
+        </w:tc>
+      </w:tr>
+      <w:tr>
+        <w:trPr>
+          <w:cantSplit/>
+        </w:trPr>
+        <w:tc>
+          <w:tcPr>
+            <w:tcW w:type="dxa" w:w="1440"/>
+            <w:tcBorders>
+              <w:top w:val="single" w:color="BFC9D6" w:sz="4"/>
+              <w:left w:val="single" w:color="BFC9D6" w:sz="4"/>
+              <w:bottom w:val="single" w:color="BFC9D6" w:sz="4"/>
+              <w:right w:val="single" w:color="BFC9D6" w:sz="4"/>
+            </w:tcBorders>
+            <w:tcMar>
+              <w:top w:type="dxa" w:w="50"/>
+              <w:left w:type="dxa" w:w="90"/>
+              <w:bottom w:type="dxa" w:w="50"/>
+              <w:right w:type="dxa" w:w="90"/>
+            </w:tcMar>
+            <w:vAlign w:val="top"/>
+          </w:tcPr>
+          <w:p>
+            <w:pPr>
+              <w:keepNext w:val="false"/>
+              <w:bidi/>
+              <w:spacing w:after="30" w:before="30" w:line="264"/>
+            </w:pPr>
+            <w:r>
+              <w:rPr>
+                <w:rFonts w:ascii="Arial" w:cs="Arial" w:eastAsia="Arial" w:hAnsi="Arial"/>
+                <w:b w:val="false"/>
+                <w:bCs w:val="false"/>
+                <w:sz w:val="18"/>
+                <w:szCs w:val="18"/>
+                <w:rtl/>
+              </w:rPr>
+              <w:t xml:space="preserve">AC-LCI-2 وAC-WFL-7</w:t>
+            </w:r>
+          </w:p>
+        </w:tc>
+        <w:tc>
+          <w:tcPr>
+            <w:tcW w:type="dxa" w:w="2438"/>
+            <w:tcBorders>
+              <w:top w:val="single" w:color="BFC9D6" w:sz="4"/>
+              <w:left w:val="single" w:color="BFC9D6" w:sz="4"/>
+              <w:bottom w:val="single" w:color="BFC9D6" w:sz="4"/>
+              <w:right w:val="single" w:color="BFC9D6" w:sz="4"/>
+            </w:tcBorders>
+            <w:tcMar>
+              <w:top w:type="dxa" w:w="50"/>
+              <w:left w:type="dxa" w:w="90"/>
+              <w:bottom w:type="dxa" w:w="50"/>
+              <w:right w:type="dxa" w:w="90"/>
+            </w:tcMar>
+            <w:vAlign w:val="top"/>
+          </w:tcPr>
+          <w:p>
+            <w:pPr>
+              <w:keepNext w:val="false"/>
+              <w:bidi/>
+              <w:spacing w:after="30" w:before="30" w:line="264"/>
+            </w:pPr>
+            <w:r>
+              <w:rPr>
+                <w:rFonts w:ascii="Arial" w:cs="Arial" w:eastAsia="Arial" w:hAnsi="Arial"/>
+                <w:b w:val="false"/>
+                <w:bCs w:val="false"/>
+                <w:sz w:val="18"/>
+                <w:szCs w:val="18"/>
+                <w:rtl/>
+              </w:rPr>
+              <w:t xml:space="preserve">زيادة 500,000 تُحجز عند موافقة مدير الخزينة، وتعديل ثانٍ مرفوض وهي مفتوحة (V-LCI-07)، وقبول المستفيد يطبقها؛ وزيادة ثانية مرفوضة INSUFFICIENT_AVAILABLE</w:t>
+            </w:r>
+          </w:p>
+        </w:tc>
+        <w:tc>
+          <w:tcPr>
+            <w:tcW w:type="dxa" w:w="4878"/>
+            <w:tcBorders>
+              <w:top w:val="single" w:color="BFC9D6" w:sz="4"/>
+              <w:left w:val="single" w:color="BFC9D6" w:sz="4"/>
+              <w:bottom w:val="single" w:color="BFC9D6" w:sz="4"/>
+              <w:right w:val="single" w:color="BFC9D6" w:sz="4"/>
+            </w:tcBorders>
+            <w:tcMar>
+              <w:top w:type="dxa" w:w="50"/>
+              <w:left w:type="dxa" w:w="90"/>
+              <w:bottom w:type="dxa" w:w="50"/>
+              <w:right w:type="dxa" w:w="90"/>
+            </w:tcMar>
+            <w:vAlign w:val="top"/>
+          </w:tcPr>
+          <w:p>
+            <w:pPr>
+              <w:keepNext w:val="false"/>
+              <w:bidi/>
+              <w:spacing w:after="30" w:before="30" w:line="264"/>
+            </w:pPr>
+            <w:r>
+              <w:rPr>
+                <w:rFonts w:ascii="Courier New" w:cs="Courier New" w:eastAsia="Courier New" w:hAnsi="Courier New"/>
+                <w:b w:val="false"/>
+                <w:bCs w:val="false"/>
+                <w:color w:val="1F2937"/>
+                <w:sz w:val="16"/>
+                <w:szCs w:val="16"/>
+                <w:shd w:fill="F1F3F5" w:color="auto" w:val="clear"/>
+                <w:rtl/>
+              </w:rPr>
+              <w:t xml:space="preserve">‎PurchaseLcTests.An_increase_*‎</w:t>
+            </w:r>
+          </w:p>
+        </w:tc>
+        <w:tc>
+          <w:tcPr>
+            <w:tcW w:type="dxa" w:w="1108"/>
+            <w:tcBorders>
+              <w:top w:val="single" w:color="BFC9D6" w:sz="4"/>
+              <w:left w:val="single" w:color="BFC9D6" w:sz="4"/>
+              <w:bottom w:val="single" w:color="BFC9D6" w:sz="4"/>
+              <w:right w:val="single" w:color="BFC9D6" w:sz="4"/>
+            </w:tcBorders>
+            <w:tcMar>
+              <w:top w:type="dxa" w:w="50"/>
+              <w:left w:type="dxa" w:w="90"/>
+              <w:bottom w:type="dxa" w:w="50"/>
+              <w:right w:type="dxa" w:w="90"/>
+            </w:tcMar>
+            <w:vAlign w:val="top"/>
+          </w:tcPr>
+          <w:p>
+            <w:pPr>
+              <w:keepNext w:val="false"/>
+              <w:bidi/>
+              <w:spacing w:after="30" w:before="30" w:line="264"/>
+            </w:pPr>
+            <w:r>
+              <w:rPr>
+                <w:rFonts w:ascii="Arial" w:cs="Arial" w:eastAsia="Arial" w:hAnsi="Arial"/>
+                <w:b w:val="false"/>
+                <w:bCs w:val="false"/>
+                <w:sz w:val="18"/>
+                <w:szCs w:val="18"/>
+                <w:rtl/>
+              </w:rPr>
+              <w:t xml:space="preserve">ناجح (eaff077)؛ يُعاد بعد إضافة الإيصال</w:t>
+            </w:r>
+          </w:p>
+        </w:tc>
+      </w:tr>
+      <w:tr>
+        <w:trPr>
+          <w:cantSplit/>
+        </w:trPr>
+        <w:tc>
+          <w:tcPr>
+            <w:tcW w:type="dxa" w:w="1440"/>
+            <w:tcBorders>
+              <w:top w:val="single" w:color="BFC9D6" w:sz="4"/>
+              <w:left w:val="single" w:color="BFC9D6" w:sz="4"/>
+              <w:bottom w:val="single" w:color="BFC9D6" w:sz="4"/>
+              <w:right w:val="single" w:color="BFC9D6" w:sz="4"/>
+            </w:tcBorders>
+            <w:shd w:fill="F5F8FC" w:color="auto" w:val="clear"/>
+            <w:tcMar>
+              <w:top w:type="dxa" w:w="50"/>
+              <w:left w:type="dxa" w:w="90"/>
+              <w:bottom w:type="dxa" w:w="50"/>
+              <w:right w:type="dxa" w:w="90"/>
+            </w:tcMar>
+            <w:vAlign w:val="top"/>
+          </w:tcPr>
+          <w:p>
+            <w:pPr>
+              <w:keepNext w:val="false"/>
+              <w:bidi/>
+              <w:spacing w:after="30" w:before="30" w:line="264"/>
+            </w:pPr>
+            <w:r>
+              <w:rPr>
+                <w:rFonts w:ascii="Arial" w:cs="Arial" w:eastAsia="Arial" w:hAnsi="Arial"/>
+                <w:b w:val="false"/>
+                <w:bCs w:val="false"/>
+                <w:sz w:val="18"/>
+                <w:szCs w:val="18"/>
+                <w:rtl/>
+              </w:rPr>
+              <w:t xml:space="preserve">AC-WFL-3</w:t>
+            </w:r>
+          </w:p>
+        </w:tc>
+        <w:tc>
+          <w:tcPr>
+            <w:tcW w:type="dxa" w:w="2438"/>
+            <w:tcBorders>
+              <w:top w:val="single" w:color="BFC9D6" w:sz="4"/>
+              <w:left w:val="single" w:color="BFC9D6" w:sz="4"/>
+              <w:bottom w:val="single" w:color="BFC9D6" w:sz="4"/>
+              <w:right w:val="single" w:color="BFC9D6" w:sz="4"/>
+            </w:tcBorders>
+            <w:shd w:fill="F5F8FC" w:color="auto" w:val="clear"/>
+            <w:tcMar>
+              <w:top w:type="dxa" w:w="50"/>
+              <w:left w:type="dxa" w:w="90"/>
+              <w:bottom w:type="dxa" w:w="50"/>
+              <w:right w:type="dxa" w:w="90"/>
+            </w:tcMar>
+            <w:vAlign w:val="top"/>
+          </w:tcPr>
+          <w:p>
+            <w:pPr>
+              <w:keepNext w:val="false"/>
+              <w:bidi/>
+              <w:spacing w:after="30" w:before="30" w:line="264"/>
+            </w:pPr>
+            <w:r>
+              <w:rPr>
+                <w:rFonts w:ascii="Arial" w:cs="Arial" w:eastAsia="Arial" w:hAnsi="Arial"/>
+                <w:b w:val="false"/>
+                <w:bCs w:val="false"/>
+                <w:sz w:val="18"/>
+                <w:szCs w:val="18"/>
+                <w:rtl/>
+              </w:rPr>
+              <w:t xml:space="preserve">طلبان على حد واحد: الثاني مرفوض حتى يُلغى الأول</w:t>
+            </w:r>
+          </w:p>
+        </w:tc>
+        <w:tc>
+          <w:tcPr>
+            <w:tcW w:type="dxa" w:w="4878"/>
+            <w:tcBorders>
+              <w:top w:val="single" w:color="BFC9D6" w:sz="4"/>
+              <w:left w:val="single" w:color="BFC9D6" w:sz="4"/>
+              <w:bottom w:val="single" w:color="BFC9D6" w:sz="4"/>
+              <w:right w:val="single" w:color="BFC9D6" w:sz="4"/>
+            </w:tcBorders>
+            <w:shd w:fill="F5F8FC" w:color="auto" w:val="clear"/>
+            <w:tcMar>
+              <w:top w:type="dxa" w:w="50"/>
+              <w:left w:type="dxa" w:w="90"/>
+              <w:bottom w:type="dxa" w:w="50"/>
+              <w:right w:type="dxa" w:w="90"/>
+            </w:tcMar>
+            <w:vAlign w:val="top"/>
+          </w:tcPr>
+          <w:p>
+            <w:pPr>
+              <w:keepNext w:val="false"/>
+              <w:bidi/>
+              <w:spacing w:after="30" w:before="30" w:line="264"/>
+            </w:pPr>
+            <w:r>
+              <w:rPr>
+                <w:rFonts w:ascii="Courier New" w:cs="Courier New" w:eastAsia="Courier New" w:hAnsi="Courier New"/>
+                <w:b w:val="false"/>
+                <w:bCs w:val="false"/>
+                <w:color w:val="1F2937"/>
+                <w:sz w:val="16"/>
+                <w:szCs w:val="16"/>
+                <w:shd w:fill="F1F3F5" w:color="auto" w:val="clear"/>
+                <w:rtl/>
+              </w:rPr>
+              <w:t xml:space="preserve">‎PurchaseLcTests.AC_WFL_3_*‎</w:t>
+            </w:r>
+          </w:p>
+        </w:tc>
+        <w:tc>
+          <w:tcPr>
+            <w:tcW w:type="dxa" w:w="1108"/>
+            <w:tcBorders>
+              <w:top w:val="single" w:color="BFC9D6" w:sz="4"/>
+              <w:left w:val="single" w:color="BFC9D6" w:sz="4"/>
+              <w:bottom w:val="single" w:color="BFC9D6" w:sz="4"/>
+              <w:right w:val="single" w:color="BFC9D6" w:sz="4"/>
+            </w:tcBorders>
+            <w:shd w:fill="F5F8FC" w:color="auto" w:val="clear"/>
+            <w:tcMar>
+              <w:top w:type="dxa" w:w="50"/>
+              <w:left w:type="dxa" w:w="90"/>
+              <w:bottom w:type="dxa" w:w="50"/>
+              <w:right w:type="dxa" w:w="90"/>
+            </w:tcMar>
+            <w:vAlign w:val="top"/>
+          </w:tcPr>
+          <w:p>
+            <w:pPr>
+              <w:keepNext w:val="false"/>
+              <w:bidi/>
+              <w:spacing w:after="30" w:before="30" w:line="264"/>
+            </w:pPr>
+            <w:r>
+              <w:rPr>
+                <w:rFonts w:ascii="Arial" w:cs="Arial" w:eastAsia="Arial" w:hAnsi="Arial"/>
+                <w:b w:val="false"/>
+                <w:bCs w:val="false"/>
+                <w:sz w:val="18"/>
+                <w:szCs w:val="18"/>
+                <w:rtl/>
+              </w:rPr>
+              <w:t xml:space="preserve">ناجح (f63a30e)</w:t>
+            </w:r>
+          </w:p>
+        </w:tc>
+      </w:tr>
+      <w:tr>
+        <w:trPr>
+          <w:cantSplit/>
+        </w:trPr>
+        <w:tc>
+          <w:tcPr>
+            <w:tcW w:type="dxa" w:w="1440"/>
+            <w:tcBorders>
+              <w:top w:val="single" w:color="BFC9D6" w:sz="4"/>
+              <w:left w:val="single" w:color="BFC9D6" w:sz="4"/>
+              <w:bottom w:val="single" w:color="BFC9D6" w:sz="4"/>
+              <w:right w:val="single" w:color="BFC9D6" w:sz="4"/>
+            </w:tcBorders>
+            <w:tcMar>
+              <w:top w:type="dxa" w:w="50"/>
+              <w:left w:type="dxa" w:w="90"/>
+              <w:bottom w:type="dxa" w:w="50"/>
+              <w:right w:type="dxa" w:w="90"/>
+            </w:tcMar>
+            <w:vAlign w:val="top"/>
+          </w:tcPr>
+          <w:p>
+            <w:pPr>
+              <w:keepNext w:val="false"/>
+              <w:bidi/>
+              <w:spacing w:after="30" w:before="30" w:line="264"/>
+            </w:pPr>
+            <w:r>
+              <w:rPr>
+                <w:rFonts w:ascii="Arial" w:cs="Arial" w:eastAsia="Arial" w:hAnsi="Arial"/>
+                <w:b w:val="false"/>
+                <w:bCs w:val="false"/>
+                <w:sz w:val="18"/>
+                <w:szCs w:val="18"/>
+                <w:rtl/>
+              </w:rPr>
+              <w:t xml:space="preserve">OQ-9 (فصل المهام)</w:t>
+            </w:r>
+          </w:p>
+        </w:tc>
+        <w:tc>
+          <w:tcPr>
+            <w:tcW w:type="dxa" w:w="2438"/>
+            <w:tcBorders>
+              <w:top w:val="single" w:color="BFC9D6" w:sz="4"/>
+              <w:left w:val="single" w:color="BFC9D6" w:sz="4"/>
+              <w:bottom w:val="single" w:color="BFC9D6" w:sz="4"/>
+              <w:right w:val="single" w:color="BFC9D6" w:sz="4"/>
+            </w:tcBorders>
+            <w:tcMar>
+              <w:top w:type="dxa" w:w="50"/>
+              <w:left w:type="dxa" w:w="90"/>
+              <w:bottom w:type="dxa" w:w="50"/>
+              <w:right w:type="dxa" w:w="90"/>
+            </w:tcMar>
+            <w:vAlign w:val="top"/>
+          </w:tcPr>
+          <w:p>
+            <w:pPr>
+              <w:keepNext w:val="false"/>
+              <w:bidi/>
+              <w:spacing w:after="30" w:before="30" w:line="264"/>
+            </w:pPr>
+            <w:r>
+              <w:rPr>
+                <w:rFonts w:ascii="Arial" w:cs="Arial" w:eastAsia="Arial" w:hAnsi="Arial"/>
+                <w:b w:val="false"/>
+                <w:bCs w:val="false"/>
+                <w:sz w:val="18"/>
+                <w:szCs w:val="18"/>
+                <w:rtl/>
+              </w:rPr>
+              <w:t xml:space="preserve">من اختار الخط لا يوافق على حجزه</w:t>
+            </w:r>
+          </w:p>
+        </w:tc>
+        <w:tc>
+          <w:tcPr>
+            <w:tcW w:type="dxa" w:w="4878"/>
+            <w:tcBorders>
+              <w:top w:val="single" w:color="BFC9D6" w:sz="4"/>
+              <w:left w:val="single" w:color="BFC9D6" w:sz="4"/>
+              <w:bottom w:val="single" w:color="BFC9D6" w:sz="4"/>
+              <w:right w:val="single" w:color="BFC9D6" w:sz="4"/>
+            </w:tcBorders>
+            <w:tcMar>
+              <w:top w:type="dxa" w:w="50"/>
+              <w:left w:type="dxa" w:w="90"/>
+              <w:bottom w:type="dxa" w:w="50"/>
+              <w:right w:type="dxa" w:w="90"/>
+            </w:tcMar>
+            <w:vAlign w:val="top"/>
+          </w:tcPr>
+          <w:p>
+            <w:pPr>
+              <w:keepNext w:val="false"/>
+              <w:bidi/>
+              <w:spacing w:after="30" w:before="30" w:line="264"/>
+            </w:pPr>
+            <w:r>
+              <w:rPr>
+                <w:rFonts w:ascii="Courier New" w:cs="Courier New" w:eastAsia="Courier New" w:hAnsi="Courier New"/>
+                <w:b w:val="false"/>
+                <w:bCs w:val="false"/>
+                <w:color w:val="1F2937"/>
+                <w:sz w:val="16"/>
+                <w:szCs w:val="16"/>
+                <w:shd w:fill="F1F3F5" w:color="auto" w:val="clear"/>
+                <w:rtl/>
+              </w:rPr>
+              <w:t xml:space="preserve">‎PurchaseLcTests.The_user_who_chose_*‎</w:t>
+            </w:r>
+          </w:p>
+        </w:tc>
+        <w:tc>
+          <w:tcPr>
+            <w:tcW w:type="dxa" w:w="1108"/>
+            <w:tcBorders>
+              <w:top w:val="single" w:color="BFC9D6" w:sz="4"/>
+              <w:left w:val="single" w:color="BFC9D6" w:sz="4"/>
+              <w:bottom w:val="single" w:color="BFC9D6" w:sz="4"/>
+              <w:right w:val="single" w:color="BFC9D6" w:sz="4"/>
+            </w:tcBorders>
+            <w:tcMar>
+              <w:top w:type="dxa" w:w="50"/>
+              <w:left w:type="dxa" w:w="90"/>
+              <w:bottom w:type="dxa" w:w="50"/>
+              <w:right w:type="dxa" w:w="90"/>
+            </w:tcMar>
+            <w:vAlign w:val="top"/>
+          </w:tcPr>
+          <w:p>
+            <w:pPr>
+              <w:keepNext w:val="false"/>
+              <w:bidi/>
+              <w:spacing w:after="30" w:before="30" w:line="264"/>
+            </w:pPr>
+            <w:r>
+              <w:rPr>
+                <w:rFonts w:ascii="Arial" w:cs="Arial" w:eastAsia="Arial" w:hAnsi="Arial"/>
+                <w:b w:val="false"/>
+                <w:bCs w:val="false"/>
+                <w:sz w:val="18"/>
+                <w:szCs w:val="18"/>
+                <w:rtl/>
+              </w:rPr>
+              <w:t xml:space="preserve">ناجح (e4f16c3)</w:t>
+            </w:r>
+          </w:p>
+        </w:tc>
+      </w:tr>
+      <w:tr>
+        <w:trPr>
+          <w:cantSplit/>
+        </w:trPr>
+        <w:tc>
+          <w:tcPr>
+            <w:tcW w:type="dxa" w:w="1440"/>
+            <w:tcBorders>
+              <w:top w:val="single" w:color="BFC9D6" w:sz="4"/>
+              <w:left w:val="single" w:color="BFC9D6" w:sz="4"/>
+              <w:bottom w:val="single" w:color="BFC9D6" w:sz="4"/>
+              <w:right w:val="single" w:color="BFC9D6" w:sz="4"/>
+            </w:tcBorders>
+            <w:shd w:fill="F5F8FC" w:color="auto" w:val="clear"/>
+            <w:tcMar>
+              <w:top w:type="dxa" w:w="50"/>
+              <w:left w:type="dxa" w:w="90"/>
+              <w:bottom w:type="dxa" w:w="50"/>
+              <w:right w:type="dxa" w:w="90"/>
+            </w:tcMar>
+            <w:vAlign w:val="top"/>
+          </w:tcPr>
+          <w:p>
+            <w:pPr>
+              <w:keepNext w:val="false"/>
+              <w:bidi/>
+              <w:spacing w:after="30" w:before="30" w:line="264"/>
+            </w:pPr>
+            <w:r>
+              <w:rPr>
+                <w:rFonts w:ascii="Arial" w:cs="Arial" w:eastAsia="Arial" w:hAnsi="Arial"/>
+                <w:b w:val="false"/>
+                <w:bCs w:val="false"/>
+                <w:sz w:val="18"/>
+                <w:szCs w:val="18"/>
+                <w:rtl/>
+              </w:rPr>
+              <w:t xml:space="preserve">انتهاء الحجز</w:t>
+            </w:r>
+          </w:p>
+        </w:tc>
+        <w:tc>
+          <w:tcPr>
+            <w:tcW w:type="dxa" w:w="2438"/>
+            <w:tcBorders>
+              <w:top w:val="single" w:color="BFC9D6" w:sz="4"/>
+              <w:left w:val="single" w:color="BFC9D6" w:sz="4"/>
+              <w:bottom w:val="single" w:color="BFC9D6" w:sz="4"/>
+              <w:right w:val="single" w:color="BFC9D6" w:sz="4"/>
+            </w:tcBorders>
+            <w:shd w:fill="F5F8FC" w:color="auto" w:val="clear"/>
+            <w:tcMar>
+              <w:top w:type="dxa" w:w="50"/>
+              <w:left w:type="dxa" w:w="90"/>
+              <w:bottom w:type="dxa" w:w="50"/>
+              <w:right w:type="dxa" w:w="90"/>
+            </w:tcMar>
+            <w:vAlign w:val="top"/>
+          </w:tcPr>
+          <w:p>
+            <w:pPr>
+              <w:keepNext w:val="false"/>
+              <w:bidi/>
+              <w:spacing w:after="30" w:before="30" w:line="264"/>
+            </w:pPr>
+            <w:r>
+              <w:rPr>
+                <w:rFonts w:ascii="Arial" w:cs="Arial" w:eastAsia="Arial" w:hAnsi="Arial"/>
+                <w:b w:val="false"/>
+                <w:bCs w:val="false"/>
+                <w:sz w:val="18"/>
+                <w:szCs w:val="18"/>
+                <w:rtl/>
+              </w:rPr>
+              <w:t xml:space="preserve">الحجز المنتهي يُفرج عنه ويفقده الطلب</w:t>
+            </w:r>
+          </w:p>
+        </w:tc>
+        <w:tc>
+          <w:tcPr>
+            <w:tcW w:type="dxa" w:w="4878"/>
+            <w:tcBorders>
+              <w:top w:val="single" w:color="BFC9D6" w:sz="4"/>
+              <w:left w:val="single" w:color="BFC9D6" w:sz="4"/>
+              <w:bottom w:val="single" w:color="BFC9D6" w:sz="4"/>
+              <w:right w:val="single" w:color="BFC9D6" w:sz="4"/>
+            </w:tcBorders>
+            <w:shd w:fill="F5F8FC" w:color="auto" w:val="clear"/>
+            <w:tcMar>
+              <w:top w:type="dxa" w:w="50"/>
+              <w:left w:type="dxa" w:w="90"/>
+              <w:bottom w:type="dxa" w:w="50"/>
+              <w:right w:type="dxa" w:w="90"/>
+            </w:tcMar>
+            <w:vAlign w:val="top"/>
+          </w:tcPr>
+          <w:p>
+            <w:pPr>
+              <w:keepNext w:val="false"/>
+              <w:bidi/>
+              <w:spacing w:after="30" w:before="30" w:line="264"/>
+            </w:pPr>
+            <w:r>
+              <w:rPr>
+                <w:rFonts w:ascii="Courier New" w:cs="Courier New" w:eastAsia="Courier New" w:hAnsi="Courier New"/>
+                <w:b w:val="false"/>
+                <w:bCs w:val="false"/>
+                <w:color w:val="1F2937"/>
+                <w:sz w:val="16"/>
+                <w:szCs w:val="16"/>
+                <w:shd w:fill="F1F3F5" w:color="auto" w:val="clear"/>
+                <w:rtl/>
+              </w:rPr>
+              <w:t xml:space="preserve">‎PurchaseLcTests.An_expired_reservation_*‎</w:t>
+            </w:r>
+          </w:p>
+        </w:tc>
+        <w:tc>
+          <w:tcPr>
+            <w:tcW w:type="dxa" w:w="1108"/>
+            <w:tcBorders>
+              <w:top w:val="single" w:color="BFC9D6" w:sz="4"/>
+              <w:left w:val="single" w:color="BFC9D6" w:sz="4"/>
+              <w:bottom w:val="single" w:color="BFC9D6" w:sz="4"/>
+              <w:right w:val="single" w:color="BFC9D6" w:sz="4"/>
+            </w:tcBorders>
+            <w:shd w:fill="F5F8FC" w:color="auto" w:val="clear"/>
+            <w:tcMar>
+              <w:top w:type="dxa" w:w="50"/>
+              <w:left w:type="dxa" w:w="90"/>
+              <w:bottom w:type="dxa" w:w="50"/>
+              <w:right w:type="dxa" w:w="90"/>
+            </w:tcMar>
+            <w:vAlign w:val="top"/>
+          </w:tcPr>
+          <w:p>
+            <w:pPr>
+              <w:keepNext w:val="false"/>
+              <w:bidi/>
+              <w:spacing w:after="30" w:before="30" w:line="264"/>
+            </w:pPr>
+            <w:r>
+              <w:rPr>
+                <w:rFonts w:ascii="Arial" w:cs="Arial" w:eastAsia="Arial" w:hAnsi="Arial"/>
+                <w:b w:val="false"/>
+                <w:bCs w:val="false"/>
+                <w:sz w:val="18"/>
+                <w:szCs w:val="18"/>
+                <w:rtl/>
+              </w:rPr>
+              <w:t xml:space="preserve">ناجح (f63a30e)</w:t>
+            </w:r>
+          </w:p>
+        </w:tc>
+      </w:tr>
+      <w:tr>
+        <w:trPr>
+          <w:cantSplit/>
+        </w:trPr>
+        <w:tc>
+          <w:tcPr>
+            <w:tcW w:type="dxa" w:w="1440"/>
+            <w:tcBorders>
+              <w:top w:val="single" w:color="BFC9D6" w:sz="4"/>
+              <w:left w:val="single" w:color="BFC9D6" w:sz="4"/>
+              <w:bottom w:val="single" w:color="BFC9D6" w:sz="4"/>
+              <w:right w:val="single" w:color="BFC9D6" w:sz="4"/>
+            </w:tcBorders>
+            <w:tcMar>
+              <w:top w:type="dxa" w:w="50"/>
+              <w:left w:type="dxa" w:w="90"/>
+              <w:bottom w:type="dxa" w:w="50"/>
+              <w:right w:type="dxa" w:w="90"/>
+            </w:tcMar>
+            <w:vAlign w:val="top"/>
+          </w:tcPr>
+          <w:p>
+            <w:pPr>
+              <w:keepNext w:val="false"/>
+              <w:bidi/>
+              <w:spacing w:after="30" w:before="30" w:line="264"/>
+            </w:pPr>
+            <w:r>
+              <w:rPr>
+                <w:rFonts w:ascii="Arial" w:cs="Arial" w:eastAsia="Arial" w:hAnsi="Arial"/>
+                <w:b w:val="false"/>
+                <w:bCs w:val="false"/>
+                <w:sz w:val="18"/>
+                <w:szCs w:val="18"/>
+                <w:rtl/>
+              </w:rPr>
+              <w:t xml:space="preserve">AC-WFL-1</w:t>
+            </w:r>
+          </w:p>
+        </w:tc>
+        <w:tc>
+          <w:tcPr>
+            <w:tcW w:type="dxa" w:w="2438"/>
+            <w:tcBorders>
+              <w:top w:val="single" w:color="BFC9D6" w:sz="4"/>
+              <w:left w:val="single" w:color="BFC9D6" w:sz="4"/>
+              <w:bottom w:val="single" w:color="BFC9D6" w:sz="4"/>
+              <w:right w:val="single" w:color="BFC9D6" w:sz="4"/>
+            </w:tcBorders>
+            <w:tcMar>
+              <w:top w:type="dxa" w:w="50"/>
+              <w:left w:type="dxa" w:w="90"/>
+              <w:bottom w:type="dxa" w:w="50"/>
+              <w:right w:type="dxa" w:w="90"/>
+            </w:tcMar>
+            <w:vAlign w:val="top"/>
+          </w:tcPr>
+          <w:p>
+            <w:pPr>
+              <w:keepNext w:val="false"/>
+              <w:bidi/>
+              <w:spacing w:after="30" w:before="30" w:line="264"/>
+            </w:pPr>
+            <w:r>
+              <w:rPr>
+                <w:rFonts w:ascii="Arial" w:cs="Arial" w:eastAsia="Arial" w:hAnsi="Arial"/>
+                <w:b w:val="false"/>
+                <w:bCs w:val="false"/>
+                <w:sz w:val="18"/>
+                <w:szCs w:val="18"/>
+                <w:rtl/>
+              </w:rPr>
+              <w:t xml:space="preserve">المفوَّض يوافق عن المدير، والتفويض الملغى لا يُظهر شيئًا</w:t>
+            </w:r>
+          </w:p>
+        </w:tc>
+        <w:tc>
+          <w:tcPr>
+            <w:tcW w:type="dxa" w:w="4878"/>
+            <w:tcBorders>
+              <w:top w:val="single" w:color="BFC9D6" w:sz="4"/>
+              <w:left w:val="single" w:color="BFC9D6" w:sz="4"/>
+              <w:bottom w:val="single" w:color="BFC9D6" w:sz="4"/>
+              <w:right w:val="single" w:color="BFC9D6" w:sz="4"/>
+            </w:tcBorders>
+            <w:tcMar>
+              <w:top w:type="dxa" w:w="50"/>
+              <w:left w:type="dxa" w:w="90"/>
+              <w:bottom w:type="dxa" w:w="50"/>
+              <w:right w:type="dxa" w:w="90"/>
+            </w:tcMar>
+            <w:vAlign w:val="top"/>
+          </w:tcPr>
+          <w:p>
+            <w:pPr>
+              <w:keepNext w:val="false"/>
+              <w:bidi/>
+              <w:spacing w:after="30" w:before="30" w:line="264"/>
+            </w:pPr>
+            <w:r>
+              <w:rPr>
+                <w:rFonts w:ascii="Courier New" w:cs="Courier New" w:eastAsia="Courier New" w:hAnsi="Courier New"/>
+                <w:b w:val="false"/>
+                <w:bCs w:val="false"/>
+                <w:color w:val="1F2937"/>
+                <w:sz w:val="16"/>
+                <w:szCs w:val="16"/>
+                <w:shd w:fill="F1F3F5" w:color="auto" w:val="clear"/>
+                <w:rtl/>
+              </w:rPr>
+              <w:t xml:space="preserve">‎WorkflowQueueTests.AC_WFL_1_*‎</w:t>
+            </w:r>
+          </w:p>
+        </w:tc>
+        <w:tc>
+          <w:tcPr>
+            <w:tcW w:type="dxa" w:w="1108"/>
+            <w:tcBorders>
+              <w:top w:val="single" w:color="BFC9D6" w:sz="4"/>
+              <w:left w:val="single" w:color="BFC9D6" w:sz="4"/>
+              <w:bottom w:val="single" w:color="BFC9D6" w:sz="4"/>
+              <w:right w:val="single" w:color="BFC9D6" w:sz="4"/>
+            </w:tcBorders>
+            <w:tcMar>
+              <w:top w:type="dxa" w:w="50"/>
+              <w:left w:type="dxa" w:w="90"/>
+              <w:bottom w:type="dxa" w:w="50"/>
+              <w:right w:type="dxa" w:w="90"/>
+            </w:tcMar>
+            <w:vAlign w:val="top"/>
+          </w:tcPr>
+          <w:p>
+            <w:pPr>
+              <w:keepNext w:val="false"/>
+              <w:bidi/>
+              <w:spacing w:after="30" w:before="30" w:line="264"/>
+            </w:pPr>
+            <w:r>
+              <w:rPr>
+                <w:rFonts w:ascii="Arial" w:cs="Arial" w:eastAsia="Arial" w:hAnsi="Arial"/>
+                <w:b w:val="false"/>
+                <w:bCs w:val="false"/>
+                <w:sz w:val="18"/>
+                <w:szCs w:val="18"/>
+                <w:rtl/>
+              </w:rPr>
+              <w:t xml:space="preserve">ناجح (f63a30e)</w:t>
+            </w:r>
+          </w:p>
+        </w:tc>
+      </w:tr>
+      <w:tr>
+        <w:trPr>
+          <w:cantSplit/>
+        </w:trPr>
+        <w:tc>
+          <w:tcPr>
+            <w:tcW w:type="dxa" w:w="1440"/>
+            <w:tcBorders>
+              <w:top w:val="single" w:color="BFC9D6" w:sz="4"/>
+              <w:left w:val="single" w:color="BFC9D6" w:sz="4"/>
+              <w:bottom w:val="single" w:color="BFC9D6" w:sz="4"/>
+              <w:right w:val="single" w:color="BFC9D6" w:sz="4"/>
+            </w:tcBorders>
+            <w:shd w:fill="F5F8FC" w:color="auto" w:val="clear"/>
+            <w:tcMar>
+              <w:top w:type="dxa" w:w="50"/>
+              <w:left w:type="dxa" w:w="90"/>
+              <w:bottom w:type="dxa" w:w="50"/>
+              <w:right w:type="dxa" w:w="90"/>
+            </w:tcMar>
+            <w:vAlign w:val="top"/>
+          </w:tcPr>
+          <w:p>
+            <w:pPr>
+              <w:keepNext w:val="false"/>
+              <w:bidi/>
+              <w:spacing w:after="30" w:before="30" w:line="264"/>
+            </w:pPr>
+            <w:r>
+              <w:rPr>
+                <w:rFonts w:ascii="Arial" w:cs="Arial" w:eastAsia="Arial" w:hAnsi="Arial"/>
+                <w:b w:val="false"/>
+                <w:bCs w:val="false"/>
+                <w:sz w:val="18"/>
+                <w:szCs w:val="18"/>
+                <w:rtl/>
+              </w:rPr>
+              <w:t xml:space="preserve">AC-WFL-2</w:t>
+            </w:r>
+          </w:p>
+        </w:tc>
+        <w:tc>
+          <w:tcPr>
+            <w:tcW w:type="dxa" w:w="2438"/>
+            <w:tcBorders>
+              <w:top w:val="single" w:color="BFC9D6" w:sz="4"/>
+              <w:left w:val="single" w:color="BFC9D6" w:sz="4"/>
+              <w:bottom w:val="single" w:color="BFC9D6" w:sz="4"/>
+              <w:right w:val="single" w:color="BFC9D6" w:sz="4"/>
+            </w:tcBorders>
+            <w:shd w:fill="F5F8FC" w:color="auto" w:val="clear"/>
+            <w:tcMar>
+              <w:top w:type="dxa" w:w="50"/>
+              <w:left w:type="dxa" w:w="90"/>
+              <w:bottom w:type="dxa" w:w="50"/>
+              <w:right w:type="dxa" w:w="90"/>
+            </w:tcMar>
+            <w:vAlign w:val="top"/>
+          </w:tcPr>
+          <w:p>
+            <w:pPr>
+              <w:keepNext w:val="false"/>
+              <w:bidi/>
+              <w:spacing w:after="30" w:before="30" w:line="264"/>
+            </w:pPr>
+            <w:r>
+              <w:rPr>
+                <w:rFonts w:ascii="Arial" w:cs="Arial" w:eastAsia="Arial" w:hAnsi="Arial"/>
+                <w:b w:val="false"/>
+                <w:bCs w:val="false"/>
+                <w:sz w:val="18"/>
+                <w:szCs w:val="18"/>
+                <w:rtl/>
+              </w:rPr>
+              <w:t xml:space="preserve">سباق الاستلام، والإفراج وإعادة الإسناد، والحالة الفرعية التي توقف المهلة</w:t>
+            </w:r>
+          </w:p>
+        </w:tc>
+        <w:tc>
+          <w:tcPr>
+            <w:tcW w:type="dxa" w:w="4878"/>
+            <w:tcBorders>
+              <w:top w:val="single" w:color="BFC9D6" w:sz="4"/>
+              <w:left w:val="single" w:color="BFC9D6" w:sz="4"/>
+              <w:bottom w:val="single" w:color="BFC9D6" w:sz="4"/>
+              <w:right w:val="single" w:color="BFC9D6" w:sz="4"/>
+            </w:tcBorders>
+            <w:shd w:fill="F5F8FC" w:color="auto" w:val="clear"/>
+            <w:tcMar>
+              <w:top w:type="dxa" w:w="50"/>
+              <w:left w:type="dxa" w:w="90"/>
+              <w:bottom w:type="dxa" w:w="50"/>
+              <w:right w:type="dxa" w:w="90"/>
+            </w:tcMar>
+            <w:vAlign w:val="top"/>
+          </w:tcPr>
+          <w:p>
+            <w:pPr>
+              <w:keepNext w:val="false"/>
+              <w:bidi/>
+              <w:spacing w:after="30" w:before="30" w:line="264"/>
+            </w:pPr>
+            <w:r>
+              <w:rPr>
+                <w:rFonts w:ascii="Courier New" w:cs="Courier New" w:eastAsia="Courier New" w:hAnsi="Courier New"/>
+                <w:b w:val="false"/>
+                <w:bCs w:val="false"/>
+                <w:color w:val="1F2937"/>
+                <w:sz w:val="16"/>
+                <w:szCs w:val="16"/>
+                <w:shd w:fill="F1F3F5" w:color="auto" w:val="clear"/>
+                <w:rtl/>
+              </w:rPr>
+              <w:t xml:space="preserve">‎WorkflowQueueTests.AC_WFL_2_*‎</w:t>
+            </w:r>
+          </w:p>
+        </w:tc>
+        <w:tc>
+          <w:tcPr>
+            <w:tcW w:type="dxa" w:w="1108"/>
+            <w:tcBorders>
+              <w:top w:val="single" w:color="BFC9D6" w:sz="4"/>
+              <w:left w:val="single" w:color="BFC9D6" w:sz="4"/>
+              <w:bottom w:val="single" w:color="BFC9D6" w:sz="4"/>
+              <w:right w:val="single" w:color="BFC9D6" w:sz="4"/>
+            </w:tcBorders>
+            <w:shd w:fill="F5F8FC" w:color="auto" w:val="clear"/>
+            <w:tcMar>
+              <w:top w:type="dxa" w:w="50"/>
+              <w:left w:type="dxa" w:w="90"/>
+              <w:bottom w:type="dxa" w:w="50"/>
+              <w:right w:type="dxa" w:w="90"/>
+            </w:tcMar>
+            <w:vAlign w:val="top"/>
+          </w:tcPr>
+          <w:p>
+            <w:pPr>
+              <w:keepNext w:val="false"/>
+              <w:bidi/>
+              <w:spacing w:after="30" w:before="30" w:line="264"/>
+            </w:pPr>
+            <w:r>
+              <w:rPr>
+                <w:rFonts w:ascii="Arial" w:cs="Arial" w:eastAsia="Arial" w:hAnsi="Arial"/>
+                <w:b w:val="false"/>
+                <w:bCs w:val="false"/>
+                <w:sz w:val="18"/>
+                <w:szCs w:val="18"/>
+                <w:rtl/>
+              </w:rPr>
+              <w:t xml:space="preserve">ناجح (f63a30e)</w:t>
+            </w:r>
+          </w:p>
+        </w:tc>
+      </w:tr>
+      <w:tr>
+        <w:trPr>
+          <w:cantSplit/>
+        </w:trPr>
+        <w:tc>
+          <w:tcPr>
+            <w:tcW w:type="dxa" w:w="1440"/>
+            <w:tcBorders>
+              <w:top w:val="single" w:color="BFC9D6" w:sz="4"/>
+              <w:left w:val="single" w:color="BFC9D6" w:sz="4"/>
+              <w:bottom w:val="single" w:color="BFC9D6" w:sz="4"/>
+              <w:right w:val="single" w:color="BFC9D6" w:sz="4"/>
+            </w:tcBorders>
+            <w:tcMar>
+              <w:top w:type="dxa" w:w="50"/>
+              <w:left w:type="dxa" w:w="90"/>
+              <w:bottom w:type="dxa" w:w="50"/>
+              <w:right w:type="dxa" w:w="90"/>
+            </w:tcMar>
+            <w:vAlign w:val="top"/>
+          </w:tcPr>
+          <w:p>
+            <w:pPr>
+              <w:keepNext w:val="false"/>
+              <w:bidi/>
+              <w:spacing w:after="30" w:before="30" w:line="264"/>
+            </w:pPr>
+            <w:r>
+              <w:rPr>
+                <w:rFonts w:ascii="Arial" w:cs="Arial" w:eastAsia="Arial" w:hAnsi="Arial"/>
+                <w:b w:val="false"/>
+                <w:bCs w:val="false"/>
+                <w:sz w:val="18"/>
+                <w:szCs w:val="18"/>
+                <w:rtl/>
+              </w:rPr>
+              <w:t xml:space="preserve">AC-WFL-5</w:t>
+            </w:r>
+          </w:p>
+        </w:tc>
+        <w:tc>
+          <w:tcPr>
+            <w:tcW w:type="dxa" w:w="2438"/>
+            <w:tcBorders>
+              <w:top w:val="single" w:color="BFC9D6" w:sz="4"/>
+              <w:left w:val="single" w:color="BFC9D6" w:sz="4"/>
+              <w:bottom w:val="single" w:color="BFC9D6" w:sz="4"/>
+              <w:right w:val="single" w:color="BFC9D6" w:sz="4"/>
+            </w:tcBorders>
+            <w:tcMar>
+              <w:top w:type="dxa" w:w="50"/>
+              <w:left w:type="dxa" w:w="90"/>
+              <w:bottom w:type="dxa" w:w="50"/>
+              <w:right w:type="dxa" w:w="90"/>
+            </w:tcMar>
+            <w:vAlign w:val="top"/>
+          </w:tcPr>
+          <w:p>
+            <w:pPr>
+              <w:keepNext w:val="false"/>
+              <w:bidi/>
+              <w:spacing w:after="30" w:before="30" w:line="264"/>
+            </w:pPr>
+            <w:r>
+              <w:rPr>
+                <w:rFonts w:ascii="Arial" w:cs="Arial" w:eastAsia="Arial" w:hAnsi="Arial"/>
+                <w:b w:val="false"/>
+                <w:bCs w:val="false"/>
+                <w:sz w:val="18"/>
+                <w:szCs w:val="18"/>
+                <w:rtl/>
+              </w:rPr>
+              <w:t xml:space="preserve">مهمة المهل: «في خطر» مرة، و«متجاوز» مرة، والتصعيد عند الفتح التالي</w:t>
+            </w:r>
+          </w:p>
+        </w:tc>
+        <w:tc>
+          <w:tcPr>
+            <w:tcW w:type="dxa" w:w="4878"/>
+            <w:tcBorders>
+              <w:top w:val="single" w:color="BFC9D6" w:sz="4"/>
+              <w:left w:val="single" w:color="BFC9D6" w:sz="4"/>
+              <w:bottom w:val="single" w:color="BFC9D6" w:sz="4"/>
+              <w:right w:val="single" w:color="BFC9D6" w:sz="4"/>
+            </w:tcBorders>
+            <w:tcMar>
+              <w:top w:type="dxa" w:w="50"/>
+              <w:left w:type="dxa" w:w="90"/>
+              <w:bottom w:type="dxa" w:w="50"/>
+              <w:right w:type="dxa" w:w="90"/>
+            </w:tcMar>
+            <w:vAlign w:val="top"/>
+          </w:tcPr>
+          <w:p>
+            <w:pPr>
+              <w:keepNext w:val="false"/>
+              <w:bidi/>
+              <w:spacing w:after="30" w:before="30" w:line="264"/>
+            </w:pPr>
+            <w:r>
+              <w:rPr>
+                <w:rFonts w:ascii="Courier New" w:cs="Courier New" w:eastAsia="Courier New" w:hAnsi="Courier New"/>
+                <w:b w:val="false"/>
+                <w:bCs w:val="false"/>
+                <w:color w:val="1F2937"/>
+                <w:sz w:val="16"/>
+                <w:szCs w:val="16"/>
+                <w:shd w:fill="F1F3F5" w:color="auto" w:val="clear"/>
+                <w:rtl/>
+              </w:rPr>
+              <w:t xml:space="preserve">‎WorkflowQueueTests.AC_WFL_5_*‎</w:t>
+            </w:r>
+          </w:p>
+        </w:tc>
+        <w:tc>
+          <w:tcPr>
+            <w:tcW w:type="dxa" w:w="1108"/>
+            <w:tcBorders>
+              <w:top w:val="single" w:color="BFC9D6" w:sz="4"/>
+              <w:left w:val="single" w:color="BFC9D6" w:sz="4"/>
+              <w:bottom w:val="single" w:color="BFC9D6" w:sz="4"/>
+              <w:right w:val="single" w:color="BFC9D6" w:sz="4"/>
+            </w:tcBorders>
+            <w:tcMar>
+              <w:top w:type="dxa" w:w="50"/>
+              <w:left w:type="dxa" w:w="90"/>
+              <w:bottom w:type="dxa" w:w="50"/>
+              <w:right w:type="dxa" w:w="90"/>
+            </w:tcMar>
+            <w:vAlign w:val="top"/>
+          </w:tcPr>
+          <w:p>
+            <w:pPr>
+              <w:keepNext w:val="false"/>
+              <w:bidi/>
+              <w:spacing w:after="30" w:before="30" w:line="264"/>
+            </w:pPr>
+            <w:r>
+              <w:rPr>
+                <w:rFonts w:ascii="Arial" w:cs="Arial" w:eastAsia="Arial" w:hAnsi="Arial"/>
+                <w:b w:val="false"/>
+                <w:bCs w:val="false"/>
+                <w:sz w:val="18"/>
+                <w:szCs w:val="18"/>
+                <w:rtl/>
+              </w:rPr>
+              <w:t xml:space="preserve">ناجح (f63a30e)</w:t>
+            </w:r>
+          </w:p>
+        </w:tc>
+      </w:tr>
+      <w:tr>
+        <w:trPr>
+          <w:cantSplit/>
+        </w:trPr>
+        <w:tc>
+          <w:tcPr>
+            <w:tcW w:type="dxa" w:w="1440"/>
+            <w:tcBorders>
+              <w:top w:val="single" w:color="BFC9D6" w:sz="4"/>
+              <w:left w:val="single" w:color="BFC9D6" w:sz="4"/>
+              <w:bottom w:val="single" w:color="BFC9D6" w:sz="4"/>
+              <w:right w:val="single" w:color="BFC9D6" w:sz="4"/>
+            </w:tcBorders>
+            <w:shd w:fill="F5F8FC" w:color="auto" w:val="clear"/>
+            <w:tcMar>
+              <w:top w:type="dxa" w:w="50"/>
+              <w:left w:type="dxa" w:w="90"/>
+              <w:bottom w:type="dxa" w:w="50"/>
+              <w:right w:type="dxa" w:w="90"/>
+            </w:tcMar>
+            <w:vAlign w:val="top"/>
+          </w:tcPr>
+          <w:p>
+            <w:pPr>
+              <w:keepNext w:val="false"/>
+              <w:bidi/>
+              <w:spacing w:after="30" w:before="30" w:line="264"/>
+            </w:pPr>
+            <w:r>
+              <w:rPr>
+                <w:rFonts w:ascii="Arial" w:cs="Arial" w:eastAsia="Arial" w:hAnsi="Arial"/>
+                <w:b w:val="false"/>
+                <w:bCs w:val="false"/>
+                <w:sz w:val="18"/>
+                <w:szCs w:val="18"/>
+                <w:rtl/>
+              </w:rPr>
+              <w:t xml:space="preserve">AC-WFL-10</w:t>
+            </w:r>
+          </w:p>
+        </w:tc>
+        <w:tc>
+          <w:tcPr>
+            <w:tcW w:type="dxa" w:w="2438"/>
+            <w:tcBorders>
+              <w:top w:val="single" w:color="BFC9D6" w:sz="4"/>
+              <w:left w:val="single" w:color="BFC9D6" w:sz="4"/>
+              <w:bottom w:val="single" w:color="BFC9D6" w:sz="4"/>
+              <w:right w:val="single" w:color="BFC9D6" w:sz="4"/>
+            </w:tcBorders>
+            <w:shd w:fill="F5F8FC" w:color="auto" w:val="clear"/>
+            <w:tcMar>
+              <w:top w:type="dxa" w:w="50"/>
+              <w:left w:type="dxa" w:w="90"/>
+              <w:bottom w:type="dxa" w:w="50"/>
+              <w:right w:type="dxa" w:w="90"/>
+            </w:tcMar>
+            <w:vAlign w:val="top"/>
+          </w:tcPr>
+          <w:p>
+            <w:pPr>
+              <w:keepNext w:val="false"/>
+              <w:bidi/>
+              <w:spacing w:after="30" w:before="30" w:line="264"/>
+            </w:pPr>
+            <w:r>
+              <w:rPr>
+                <w:rFonts w:ascii="Arial" w:cs="Arial" w:eastAsia="Arial" w:hAnsi="Arial"/>
+                <w:b w:val="false"/>
+                <w:bCs w:val="false"/>
+                <w:sz w:val="18"/>
+                <w:szCs w:val="18"/>
+                <w:rtl/>
+              </w:rPr>
+              <w:t xml:space="preserve">التذكير بعد 24 و48 و72 ساعة عمل، والموافقة تنهيه</w:t>
+            </w:r>
+          </w:p>
+        </w:tc>
+        <w:tc>
+          <w:tcPr>
+            <w:tcW w:type="dxa" w:w="4878"/>
+            <w:tcBorders>
+              <w:top w:val="single" w:color="BFC9D6" w:sz="4"/>
+              <w:left w:val="single" w:color="BFC9D6" w:sz="4"/>
+              <w:bottom w:val="single" w:color="BFC9D6" w:sz="4"/>
+              <w:right w:val="single" w:color="BFC9D6" w:sz="4"/>
+            </w:tcBorders>
+            <w:shd w:fill="F5F8FC" w:color="auto" w:val="clear"/>
+            <w:tcMar>
+              <w:top w:type="dxa" w:w="50"/>
+              <w:left w:type="dxa" w:w="90"/>
+              <w:bottom w:type="dxa" w:w="50"/>
+              <w:right w:type="dxa" w:w="90"/>
+            </w:tcMar>
+            <w:vAlign w:val="top"/>
+          </w:tcPr>
+          <w:p>
+            <w:pPr>
+              <w:keepNext w:val="false"/>
+              <w:bidi/>
+              <w:spacing w:after="30" w:before="30" w:line="264"/>
+            </w:pPr>
+            <w:r>
+              <w:rPr>
+                <w:rFonts w:ascii="Courier New" w:cs="Courier New" w:eastAsia="Courier New" w:hAnsi="Courier New"/>
+                <w:b w:val="false"/>
+                <w:bCs w:val="false"/>
+                <w:color w:val="1F2937"/>
+                <w:sz w:val="16"/>
+                <w:szCs w:val="16"/>
+                <w:shd w:fill="F1F3F5" w:color="auto" w:val="clear"/>
+                <w:rtl/>
+              </w:rPr>
+              <w:t xml:space="preserve">‎WorkflowQueueTests.AC_WFL_10_*‎</w:t>
+            </w:r>
+          </w:p>
+        </w:tc>
+        <w:tc>
+          <w:tcPr>
+            <w:tcW w:type="dxa" w:w="1108"/>
+            <w:tcBorders>
+              <w:top w:val="single" w:color="BFC9D6" w:sz="4"/>
+              <w:left w:val="single" w:color="BFC9D6" w:sz="4"/>
+              <w:bottom w:val="single" w:color="BFC9D6" w:sz="4"/>
+              <w:right w:val="single" w:color="BFC9D6" w:sz="4"/>
+            </w:tcBorders>
+            <w:shd w:fill="F5F8FC" w:color="auto" w:val="clear"/>
+            <w:tcMar>
+              <w:top w:type="dxa" w:w="50"/>
+              <w:left w:type="dxa" w:w="90"/>
+              <w:bottom w:type="dxa" w:w="50"/>
+              <w:right w:type="dxa" w:w="90"/>
+            </w:tcMar>
+            <w:vAlign w:val="top"/>
+          </w:tcPr>
+          <w:p>
+            <w:pPr>
+              <w:keepNext w:val="false"/>
+              <w:bidi/>
+              <w:spacing w:after="30" w:before="30" w:line="264"/>
+            </w:pPr>
+            <w:r>
+              <w:rPr>
+                <w:rFonts w:ascii="Arial" w:cs="Arial" w:eastAsia="Arial" w:hAnsi="Arial"/>
+                <w:b w:val="false"/>
+                <w:bCs w:val="false"/>
+                <w:sz w:val="18"/>
+                <w:szCs w:val="18"/>
+                <w:rtl/>
+              </w:rPr>
+              <w:t xml:space="preserve">ناجح (f63a30e)</w:t>
+            </w:r>
+          </w:p>
+        </w:tc>
+      </w:tr>
+      <w:tr>
+        <w:trPr>
+          <w:cantSplit/>
+        </w:trPr>
+        <w:tc>
+          <w:tcPr>
+            <w:tcW w:type="dxa" w:w="1440"/>
+            <w:tcBorders>
+              <w:top w:val="single" w:color="BFC9D6" w:sz="4"/>
+              <w:left w:val="single" w:color="BFC9D6" w:sz="4"/>
+              <w:bottom w:val="single" w:color="BFC9D6" w:sz="4"/>
+              <w:right w:val="single" w:color="BFC9D6" w:sz="4"/>
+            </w:tcBorders>
+            <w:tcMar>
+              <w:top w:type="dxa" w:w="50"/>
+              <w:left w:type="dxa" w:w="90"/>
+              <w:bottom w:type="dxa" w:w="50"/>
+              <w:right w:type="dxa" w:w="90"/>
+            </w:tcMar>
+            <w:vAlign w:val="top"/>
+          </w:tcPr>
+          <w:p>
+            <w:pPr>
+              <w:keepNext w:val="false"/>
+              <w:bidi/>
+              <w:spacing w:after="30" w:before="30" w:line="264"/>
+            </w:pPr>
+            <w:r>
+              <w:rPr>
+                <w:rFonts w:ascii="Arial" w:cs="Arial" w:eastAsia="Arial" w:hAnsi="Arial"/>
+                <w:b w:val="false"/>
+                <w:bCs w:val="false"/>
+                <w:sz w:val="18"/>
+                <w:szCs w:val="18"/>
+                <w:rtl/>
+              </w:rPr>
+              <w:t xml:space="preserve">AC-WFL-6</w:t>
+            </w:r>
+          </w:p>
+        </w:tc>
+        <w:tc>
+          <w:tcPr>
+            <w:tcW w:type="dxa" w:w="2438"/>
+            <w:tcBorders>
+              <w:top w:val="single" w:color="BFC9D6" w:sz="4"/>
+              <w:left w:val="single" w:color="BFC9D6" w:sz="4"/>
+              <w:bottom w:val="single" w:color="BFC9D6" w:sz="4"/>
+              <w:right w:val="single" w:color="BFC9D6" w:sz="4"/>
+            </w:tcBorders>
+            <w:tcMar>
+              <w:top w:type="dxa" w:w="50"/>
+              <w:left w:type="dxa" w:w="90"/>
+              <w:bottom w:type="dxa" w:w="50"/>
+              <w:right w:type="dxa" w:w="90"/>
+            </w:tcMar>
+            <w:vAlign w:val="top"/>
+          </w:tcPr>
+          <w:p>
+            <w:pPr>
+              <w:keepNext w:val="false"/>
+              <w:bidi/>
+              <w:spacing w:after="30" w:before="30" w:line="264"/>
+            </w:pPr>
+            <w:r>
+              <w:rPr>
+                <w:rFonts w:ascii="Arial" w:cs="Arial" w:eastAsia="Arial" w:hAnsi="Arial"/>
+                <w:b w:val="false"/>
+                <w:bCs w:val="false"/>
+                <w:sz w:val="18"/>
+                <w:szCs w:val="18"/>
+                <w:rtl/>
+              </w:rPr>
+              <w:t xml:space="preserve">القوالب الستة منشورة لكل مشترك جديد بخطافاتها، والمنشور لا يُعدّل</w:t>
+            </w:r>
+          </w:p>
+        </w:tc>
+        <w:tc>
+          <w:tcPr>
+            <w:tcW w:type="dxa" w:w="4878"/>
+            <w:tcBorders>
+              <w:top w:val="single" w:color="BFC9D6" w:sz="4"/>
+              <w:left w:val="single" w:color="BFC9D6" w:sz="4"/>
+              <w:bottom w:val="single" w:color="BFC9D6" w:sz="4"/>
+              <w:right w:val="single" w:color="BFC9D6" w:sz="4"/>
+            </w:tcBorders>
+            <w:tcMar>
+              <w:top w:type="dxa" w:w="50"/>
+              <w:left w:type="dxa" w:w="90"/>
+              <w:bottom w:type="dxa" w:w="50"/>
+              <w:right w:type="dxa" w:w="90"/>
+            </w:tcMar>
+            <w:vAlign w:val="top"/>
+          </w:tcPr>
+          <w:p>
+            <w:pPr>
+              <w:keepNext w:val="false"/>
+              <w:bidi/>
+              <w:spacing w:after="30" w:before="30" w:line="264"/>
+            </w:pPr>
+            <w:r>
+              <w:rPr>
+                <w:rFonts w:ascii="Courier New" w:cs="Courier New" w:eastAsia="Courier New" w:hAnsi="Courier New"/>
+                <w:b w:val="false"/>
+                <w:bCs w:val="false"/>
+                <w:color w:val="1F2937"/>
+                <w:sz w:val="16"/>
+                <w:szCs w:val="16"/>
+                <w:shd w:fill="F1F3F5" w:color="auto" w:val="clear"/>
+                <w:rtl/>
+              </w:rPr>
+              <w:t xml:space="preserve">‎WorkflowFoundationTests.A_new_account_*‎</w:t>
+            </w:r>
+          </w:p>
+        </w:tc>
+        <w:tc>
+          <w:tcPr>
+            <w:tcW w:type="dxa" w:w="1108"/>
+            <w:tcBorders>
+              <w:top w:val="single" w:color="BFC9D6" w:sz="4"/>
+              <w:left w:val="single" w:color="BFC9D6" w:sz="4"/>
+              <w:bottom w:val="single" w:color="BFC9D6" w:sz="4"/>
+              <w:right w:val="single" w:color="BFC9D6" w:sz="4"/>
+            </w:tcBorders>
+            <w:tcMar>
+              <w:top w:type="dxa" w:w="50"/>
+              <w:left w:type="dxa" w:w="90"/>
+              <w:bottom w:type="dxa" w:w="50"/>
+              <w:right w:type="dxa" w:w="90"/>
+            </w:tcMar>
+            <w:vAlign w:val="top"/>
+          </w:tcPr>
+          <w:p>
+            <w:pPr>
+              <w:keepNext w:val="false"/>
+              <w:bidi/>
+              <w:spacing w:after="30" w:before="30" w:line="264"/>
+            </w:pPr>
+            <w:r>
+              <w:rPr>
+                <w:rFonts w:ascii="Arial" w:cs="Arial" w:eastAsia="Arial" w:hAnsi="Arial"/>
+                <w:b w:val="false"/>
+                <w:bCs w:val="false"/>
+                <w:sz w:val="18"/>
+                <w:szCs w:val="18"/>
+                <w:rtl/>
+              </w:rPr>
+              <w:t xml:space="preserve">ناجح</w:t>
+            </w:r>
+          </w:p>
+        </w:tc>
+      </w:tr>
+      <w:tr>
+        <w:trPr>
+          <w:cantSplit/>
+        </w:trPr>
+        <w:tc>
+          <w:tcPr>
+            <w:tcW w:type="dxa" w:w="1440"/>
+            <w:tcBorders>
+              <w:top w:val="single" w:color="BFC9D6" w:sz="4"/>
+              <w:left w:val="single" w:color="BFC9D6" w:sz="4"/>
+              <w:bottom w:val="single" w:color="BFC9D6" w:sz="4"/>
+              <w:right w:val="single" w:color="BFC9D6" w:sz="4"/>
+            </w:tcBorders>
+            <w:shd w:fill="F5F8FC" w:color="auto" w:val="clear"/>
+            <w:tcMar>
+              <w:top w:type="dxa" w:w="50"/>
+              <w:left w:type="dxa" w:w="90"/>
+              <w:bottom w:type="dxa" w:w="50"/>
+              <w:right w:type="dxa" w:w="90"/>
+            </w:tcMar>
+            <w:vAlign w:val="top"/>
+          </w:tcPr>
+          <w:p>
+            <w:pPr>
+              <w:keepNext w:val="false"/>
+              <w:bidi/>
+              <w:spacing w:after="30" w:before="30" w:line="264"/>
+            </w:pPr>
+            <w:r>
+              <w:rPr>
+                <w:rFonts w:ascii="Arial" w:cs="Arial" w:eastAsia="Arial" w:hAnsi="Arial"/>
+                <w:b/>
+                <w:bCs/>
+                <w:sz w:val="18"/>
+                <w:szCs w:val="18"/>
+                <w:rtl/>
+              </w:rPr>
+              <w:t xml:space="preserve">AC-FAC-12 عبر الخطاف (NFR-PERF-03)</w:t>
+            </w:r>
+          </w:p>
+        </w:tc>
+        <w:tc>
+          <w:tcPr>
+            <w:tcW w:type="dxa" w:w="2438"/>
+            <w:tcBorders>
+              <w:top w:val="single" w:color="BFC9D6" w:sz="4"/>
+              <w:left w:val="single" w:color="BFC9D6" w:sz="4"/>
+              <w:bottom w:val="single" w:color="BFC9D6" w:sz="4"/>
+              <w:right w:val="single" w:color="BFC9D6" w:sz="4"/>
+            </w:tcBorders>
+            <w:shd w:fill="F5F8FC" w:color="auto" w:val="clear"/>
+            <w:tcMar>
+              <w:top w:type="dxa" w:w="50"/>
+              <w:left w:type="dxa" w:w="90"/>
+              <w:bottom w:type="dxa" w:w="50"/>
+              <w:right w:type="dxa" w:w="90"/>
+            </w:tcMar>
+            <w:vAlign w:val="top"/>
+          </w:tcPr>
+          <w:p>
+            <w:pPr>
+              <w:keepNext w:val="false"/>
+              <w:bidi/>
+              <w:spacing w:after="30" w:before="30" w:line="264"/>
+            </w:pPr>
+            <w:r>
+              <w:rPr>
+                <w:rFonts w:ascii="Arial" w:cs="Arial" w:eastAsia="Arial" w:hAnsi="Arial"/>
+                <w:b w:val="false"/>
+                <w:bCs w:val="false"/>
+                <w:sz w:val="18"/>
+                <w:szCs w:val="18"/>
+                <w:rtl/>
+              </w:rPr>
+              <w:t xml:space="preserve">مئة طلب بـ 100,000 بلا تسامح على خط 4,000,000، ومئة موافقة لمدير الخزينة في آن واحد: أربعون تنجح وتحجز 4,000,000، وستون مرفوضة INSUFFICIENT_AVAILABLE لا تحجز شيئًا؛ وإعادة الإرسال بالمفاتيح نفسها لا تغير شيئًا</w:t>
+            </w:r>
+          </w:p>
+        </w:tc>
+        <w:tc>
+          <w:tcPr>
+            <w:tcW w:type="dxa" w:w="4878"/>
+            <w:tcBorders>
+              <w:top w:val="single" w:color="BFC9D6" w:sz="4"/>
+              <w:left w:val="single" w:color="BFC9D6" w:sz="4"/>
+              <w:bottom w:val="single" w:color="BFC9D6" w:sz="4"/>
+              <w:right w:val="single" w:color="BFC9D6" w:sz="4"/>
+            </w:tcBorders>
+            <w:shd w:fill="F5F8FC" w:color="auto" w:val="clear"/>
+            <w:tcMar>
+              <w:top w:type="dxa" w:w="50"/>
+              <w:left w:type="dxa" w:w="90"/>
+              <w:bottom w:type="dxa" w:w="50"/>
+              <w:right w:type="dxa" w:w="90"/>
+            </w:tcMar>
+            <w:vAlign w:val="top"/>
+          </w:tcPr>
+          <w:p>
+            <w:pPr>
+              <w:keepNext w:val="false"/>
+              <w:bidi/>
+              <w:spacing w:after="30" w:before="30" w:line="264"/>
+            </w:pPr>
+            <w:r>
+              <w:rPr>
+                <w:rFonts w:ascii="Courier New" w:cs="Courier New" w:eastAsia="Courier New" w:hAnsi="Courier New"/>
+                <w:b w:val="false"/>
+                <w:bCs w:val="false"/>
+                <w:color w:val="1F2937"/>
+                <w:sz w:val="16"/>
+                <w:szCs w:val="16"/>
+                <w:shd w:fill="F1F3F5" w:color="auto" w:val="clear"/>
+                <w:rtl/>
+              </w:rPr>
+              <w:t xml:space="preserve">‎PurchaseLcTests.AC_FAC_12_*_over_HTTP‎</w:t>
+            </w:r>
+          </w:p>
+        </w:tc>
+        <w:tc>
+          <w:tcPr>
+            <w:tcW w:type="dxa" w:w="1108"/>
+            <w:tcBorders>
+              <w:top w:val="single" w:color="BFC9D6" w:sz="4"/>
+              <w:left w:val="single" w:color="BFC9D6" w:sz="4"/>
+              <w:bottom w:val="single" w:color="BFC9D6" w:sz="4"/>
+              <w:right w:val="single" w:color="BFC9D6" w:sz="4"/>
+            </w:tcBorders>
+            <w:shd w:fill="F5F8FC" w:color="auto" w:val="clear"/>
+            <w:tcMar>
+              <w:top w:type="dxa" w:w="50"/>
+              <w:left w:type="dxa" w:w="90"/>
+              <w:bottom w:type="dxa" w:w="50"/>
+              <w:right w:type="dxa" w:w="90"/>
+            </w:tcMar>
+            <w:vAlign w:val="top"/>
+          </w:tcPr>
+          <w:p>
+            <w:pPr>
+              <w:keepNext w:val="false"/>
+              <w:bidi/>
+              <w:spacing w:after="30" w:before="30" w:line="264"/>
+            </w:pPr>
+            <w:r>
+              <w:rPr>
+                <w:rFonts w:ascii="Arial" w:cs="Arial" w:eastAsia="Arial" w:hAnsi="Arial"/>
+                <w:b w:val="false"/>
+                <w:bCs w:val="false"/>
+                <w:sz w:val="18"/>
+                <w:szCs w:val="18"/>
+                <w:rtl/>
+              </w:rPr>
+              <w:t xml:space="preserve">مكتوب</w:t>
+            </w:r>
+          </w:p>
+        </w:tc>
+      </w:tr>
+      <w:tr>
+        <w:trPr>
+          <w:cantSplit/>
+        </w:trPr>
+        <w:tc>
+          <w:tcPr>
+            <w:tcW w:type="dxa" w:w="1440"/>
+            <w:tcBorders>
+              <w:top w:val="single" w:color="BFC9D6" w:sz="4"/>
+              <w:left w:val="single" w:color="BFC9D6" w:sz="4"/>
+              <w:bottom w:val="single" w:color="BFC9D6" w:sz="4"/>
+              <w:right w:val="single" w:color="BFC9D6" w:sz="4"/>
+            </w:tcBorders>
+            <w:tcMar>
+              <w:top w:type="dxa" w:w="50"/>
+              <w:left w:type="dxa" w:w="90"/>
+              <w:bottom w:type="dxa" w:w="50"/>
+              <w:right w:type="dxa" w:w="90"/>
+            </w:tcMar>
+            <w:vAlign w:val="top"/>
+          </w:tcPr>
+          <w:p>
+            <w:pPr>
+              <w:keepNext w:val="false"/>
+              <w:bidi/>
+              <w:spacing w:after="30" w:before="30" w:line="264"/>
+            </w:pPr>
+            <w:r>
+              <w:rPr>
+                <w:rFonts w:ascii="Arial" w:cs="Arial" w:eastAsia="Arial" w:hAnsi="Arial"/>
+                <w:b w:val="false"/>
+                <w:bCs w:val="false"/>
+                <w:sz w:val="18"/>
+                <w:szCs w:val="18"/>
+                <w:rtl/>
+              </w:rPr>
+              <w:t xml:space="preserve">رقم IBAN والطباعة ونموذج البنك واللوحات</w:t>
+            </w:r>
+          </w:p>
+        </w:tc>
+        <w:tc>
+          <w:tcPr>
+            <w:tcW w:type="dxa" w:w="2438"/>
+            <w:tcBorders>
+              <w:top w:val="single" w:color="BFC9D6" w:sz="4"/>
+              <w:left w:val="single" w:color="BFC9D6" w:sz="4"/>
+              <w:bottom w:val="single" w:color="BFC9D6" w:sz="4"/>
+              <w:right w:val="single" w:color="BFC9D6" w:sz="4"/>
+            </w:tcBorders>
+            <w:tcMar>
+              <w:top w:type="dxa" w:w="50"/>
+              <w:left w:type="dxa" w:w="90"/>
+              <w:bottom w:type="dxa" w:w="50"/>
+              <w:right w:type="dxa" w:w="90"/>
+            </w:tcMar>
+            <w:vAlign w:val="top"/>
+          </w:tcPr>
+          <w:p>
+            <w:pPr>
+              <w:keepNext w:val="false"/>
+              <w:bidi/>
+              <w:spacing w:after="30" w:before="30" w:line="264"/>
+            </w:pPr>
+            <w:r>
+              <w:rPr>
+                <w:rFonts w:ascii="Arial" w:cs="Arial" w:eastAsia="Arial" w:hAnsi="Arial"/>
+                <w:b w:val="false"/>
+                <w:bCs w:val="false"/>
+                <w:sz w:val="18"/>
+                <w:szCs w:val="18"/>
+                <w:rtl/>
+              </w:rPr>
+              <w:t xml:space="preserve">IBAN مرفوض برقم تحقق خاطئ، ويُختم ويُعرض مقنّعًا، ويُقفل مع الشروط، ولا يُكشف إلا لحامل lc.view.internal بسبب؛ الشروط المطبوعة بسياسة CSP خاصة وحاشية UCP لا تُطفأ ما دامت مادة مستعملة غير محققة؛ نموذج البنك ينتظر قالبًا فعالًا ثم يملأ أهدافه ويعدّ الناقص الإلزامي؛ واللوحات الثلاث بحسب الصلاحية</w:t>
+            </w:r>
+          </w:p>
+        </w:tc>
+        <w:tc>
+          <w:tcPr>
+            <w:tcW w:type="dxa" w:w="4878"/>
+            <w:tcBorders>
+              <w:top w:val="single" w:color="BFC9D6" w:sz="4"/>
+              <w:left w:val="single" w:color="BFC9D6" w:sz="4"/>
+              <w:bottom w:val="single" w:color="BFC9D6" w:sz="4"/>
+              <w:right w:val="single" w:color="BFC9D6" w:sz="4"/>
+            </w:tcBorders>
+            <w:tcMar>
+              <w:top w:type="dxa" w:w="50"/>
+              <w:left w:type="dxa" w:w="90"/>
+              <w:bottom w:type="dxa" w:w="50"/>
+              <w:right w:type="dxa" w:w="90"/>
+            </w:tcMar>
+            <w:vAlign w:val="top"/>
+          </w:tcPr>
+          <w:p>
+            <w:pPr>
+              <w:keepNext w:val="false"/>
+              <w:bidi/>
+              <w:spacing w:after="30" w:before="30" w:line="264"/>
+            </w:pPr>
+            <w:r>
+              <w:rPr>
+                <w:rFonts w:ascii="Courier New" w:cs="Courier New" w:eastAsia="Courier New" w:hAnsi="Courier New"/>
+                <w:b w:val="false"/>
+                <w:bCs w:val="false"/>
+                <w:color w:val="1F2937"/>
+                <w:sz w:val="16"/>
+                <w:szCs w:val="16"/>
+                <w:shd w:fill="F1F3F5" w:color="auto" w:val="clear"/>
+                <w:rtl/>
+              </w:rPr>
+              <w:t xml:space="preserve">‎PurchaseLcTests.The_IBAN_the_printed_terms_*‎</w:t>
+            </w:r>
+          </w:p>
+        </w:tc>
+        <w:tc>
+          <w:tcPr>
+            <w:tcW w:type="dxa" w:w="1108"/>
+            <w:tcBorders>
+              <w:top w:val="single" w:color="BFC9D6" w:sz="4"/>
+              <w:left w:val="single" w:color="BFC9D6" w:sz="4"/>
+              <w:bottom w:val="single" w:color="BFC9D6" w:sz="4"/>
+              <w:right w:val="single" w:color="BFC9D6" w:sz="4"/>
+            </w:tcBorders>
+            <w:tcMar>
+              <w:top w:type="dxa" w:w="50"/>
+              <w:left w:type="dxa" w:w="90"/>
+              <w:bottom w:type="dxa" w:w="50"/>
+              <w:right w:type="dxa" w:w="90"/>
+            </w:tcMar>
+            <w:vAlign w:val="top"/>
+          </w:tcPr>
+          <w:p>
+            <w:pPr>
+              <w:keepNext w:val="false"/>
+              <w:bidi/>
+              <w:spacing w:after="30" w:before="30" w:line="264"/>
+            </w:pPr>
+            <w:r>
+              <w:rPr>
+                <w:rFonts w:ascii="Arial" w:cs="Arial" w:eastAsia="Arial" w:hAnsi="Arial"/>
+                <w:b w:val="false"/>
+                <w:bCs w:val="false"/>
+                <w:sz w:val="18"/>
+                <w:szCs w:val="18"/>
+                <w:rtl/>
+              </w:rPr>
+              <w:t xml:space="preserve">مكتوب</w:t>
+            </w:r>
+          </w:p>
+        </w:tc>
+      </w:tr>
+      <w:tr>
+        <w:trPr>
+          <w:cantSplit/>
+        </w:trPr>
+        <w:tc>
+          <w:tcPr>
+            <w:tcW w:type="dxa" w:w="1440"/>
+            <w:tcBorders>
+              <w:top w:val="single" w:color="BFC9D6" w:sz="4"/>
+              <w:left w:val="single" w:color="BFC9D6" w:sz="4"/>
+              <w:bottom w:val="single" w:color="BFC9D6" w:sz="4"/>
+              <w:right w:val="single" w:color="BFC9D6" w:sz="4"/>
+            </w:tcBorders>
+            <w:shd w:fill="F5F8FC" w:color="auto" w:val="clear"/>
+            <w:tcMar>
+              <w:top w:type="dxa" w:w="50"/>
+              <w:left w:type="dxa" w:w="90"/>
+              <w:bottom w:type="dxa" w:w="50"/>
+              <w:right w:type="dxa" w:w="90"/>
+            </w:tcMar>
+            <w:vAlign w:val="top"/>
+          </w:tcPr>
+          <w:p>
+            <w:pPr>
+              <w:keepNext w:val="false"/>
+              <w:bidi/>
+              <w:spacing w:after="30" w:before="30" w:line="264"/>
+            </w:pPr>
+            <w:r>
+              <w:rPr>
+                <w:rFonts w:ascii="Arial" w:cs="Arial" w:eastAsia="Arial" w:hAnsi="Arial"/>
+                <w:b/>
+                <w:bCs/>
+                <w:sz w:val="18"/>
+                <w:szCs w:val="18"/>
+                <w:rtl/>
+              </w:rPr>
+              <w:t xml:space="preserve">خروج S3 على DS-LC-C (OQ-13)</w:t>
+            </w:r>
+          </w:p>
+        </w:tc>
+        <w:tc>
+          <w:tcPr>
+            <w:tcW w:type="dxa" w:w="2438"/>
+            <w:tcBorders>
+              <w:top w:val="single" w:color="BFC9D6" w:sz="4"/>
+              <w:left w:val="single" w:color="BFC9D6" w:sz="4"/>
+              <w:bottom w:val="single" w:color="BFC9D6" w:sz="4"/>
+              <w:right w:val="single" w:color="BFC9D6" w:sz="4"/>
+            </w:tcBorders>
+            <w:shd w:fill="F5F8FC" w:color="auto" w:val="clear"/>
+            <w:tcMar>
+              <w:top w:type="dxa" w:w="50"/>
+              <w:left w:type="dxa" w:w="90"/>
+              <w:bottom w:type="dxa" w:w="50"/>
+              <w:right w:type="dxa" w:w="90"/>
+            </w:tcMar>
+            <w:vAlign w:val="top"/>
+          </w:tcPr>
+          <w:p>
+            <w:pPr>
+              <w:keepNext w:val="false"/>
+              <w:bidi/>
+              <w:spacing w:after="30" w:before="30" w:line="264"/>
+            </w:pPr>
+            <w:r>
+              <w:rPr>
+                <w:rFonts w:ascii="Arial" w:cs="Arial" w:eastAsia="Arial" w:hAnsi="Arial"/>
+                <w:b w:val="false"/>
+                <w:bCs w:val="false"/>
+                <w:sz w:val="18"/>
+                <w:szCs w:val="18"/>
+                <w:rtl/>
+              </w:rPr>
+              <w:t xml:space="preserve">خط الاعتمادات في الاتفاقية C (50,000,000) مع الاعتمادات الأربعة في الحزمة: اثنان يُصدران (13,200,000 و21,000,000)، والأول يُسحب منه 5,000,000 ويُسدد؛ والثالث يُعتمد ويبقى حجزه 19,800,000؛ والرابع يحتاج 2,000,000 والمتبقي 1,000,000 فتُرفض موافقته. وأرقام الخط بعد كل خطوة كما في الحزمة</w:t>
+            </w:r>
+          </w:p>
+        </w:tc>
+        <w:tc>
+          <w:tcPr>
+            <w:tcW w:type="dxa" w:w="4878"/>
+            <w:tcBorders>
+              <w:top w:val="single" w:color="BFC9D6" w:sz="4"/>
+              <w:left w:val="single" w:color="BFC9D6" w:sz="4"/>
+              <w:bottom w:val="single" w:color="BFC9D6" w:sz="4"/>
+              <w:right w:val="single" w:color="BFC9D6" w:sz="4"/>
+            </w:tcBorders>
+            <w:shd w:fill="F5F8FC" w:color="auto" w:val="clear"/>
+            <w:tcMar>
+              <w:top w:type="dxa" w:w="50"/>
+              <w:left w:type="dxa" w:w="90"/>
+              <w:bottom w:type="dxa" w:w="50"/>
+              <w:right w:type="dxa" w:w="90"/>
+            </w:tcMar>
+            <w:vAlign w:val="top"/>
+          </w:tcPr>
+          <w:p>
+            <w:pPr>
+              <w:keepNext w:val="false"/>
+              <w:bidi/>
+              <w:spacing w:after="30" w:before="30" w:line="264"/>
+            </w:pPr>
+            <w:r>
+              <w:rPr>
+                <w:rFonts w:ascii="Courier New" w:cs="Courier New" w:eastAsia="Courier New" w:hAnsi="Courier New"/>
+                <w:b w:val="false"/>
+                <w:bCs w:val="false"/>
+                <w:color w:val="1F2937"/>
+                <w:sz w:val="16"/>
+                <w:szCs w:val="16"/>
+                <w:shd w:fill="F1F3F5" w:color="auto" w:val="clear"/>
+                <w:rtl/>
+              </w:rPr>
+              <w:t xml:space="preserve">‎PurchaseLcTests.S3_exit_*‎</w:t>
+            </w:r>
+          </w:p>
+        </w:tc>
+        <w:tc>
+          <w:tcPr>
+            <w:tcW w:type="dxa" w:w="1108"/>
+            <w:tcBorders>
+              <w:top w:val="single" w:color="BFC9D6" w:sz="4"/>
+              <w:left w:val="single" w:color="BFC9D6" w:sz="4"/>
+              <w:bottom w:val="single" w:color="BFC9D6" w:sz="4"/>
+              <w:right w:val="single" w:color="BFC9D6" w:sz="4"/>
+            </w:tcBorders>
+            <w:shd w:fill="F5F8FC" w:color="auto" w:val="clear"/>
+            <w:tcMar>
+              <w:top w:type="dxa" w:w="50"/>
+              <w:left w:type="dxa" w:w="90"/>
+              <w:bottom w:type="dxa" w:w="50"/>
+              <w:right w:type="dxa" w:w="90"/>
+            </w:tcMar>
+            <w:vAlign w:val="top"/>
+          </w:tcPr>
+          <w:p>
+            <w:pPr>
+              <w:keepNext w:val="false"/>
+              <w:bidi/>
+              <w:spacing w:after="30" w:before="30" w:line="264"/>
+            </w:pPr>
+            <w:r>
+              <w:rPr>
+                <w:rFonts w:ascii="Arial" w:cs="Arial" w:eastAsia="Arial" w:hAnsi="Arial"/>
+                <w:b w:val="false"/>
+                <w:bCs w:val="false"/>
+                <w:sz w:val="18"/>
+                <w:szCs w:val="18"/>
+                <w:rtl/>
+              </w:rPr>
+              <w:t xml:space="preserve">مكتوب</w:t>
+            </w:r>
+          </w:p>
+        </w:tc>
+      </w:tr>
+      <w:tr>
+        <w:trPr>
+          <w:cantSplit/>
+        </w:trPr>
+        <w:tc>
+          <w:tcPr>
+            <w:tcW w:type="dxa" w:w="1440"/>
+            <w:tcBorders>
+              <w:top w:val="single" w:color="BFC9D6" w:sz="4"/>
+              <w:left w:val="single" w:color="BFC9D6" w:sz="4"/>
+              <w:bottom w:val="single" w:color="BFC9D6" w:sz="4"/>
+              <w:right w:val="single" w:color="BFC9D6" w:sz="4"/>
+            </w:tcBorders>
+            <w:tcMar>
+              <w:top w:type="dxa" w:w="50"/>
+              <w:left w:type="dxa" w:w="90"/>
+              <w:bottom w:type="dxa" w:w="50"/>
+              <w:right w:type="dxa" w:w="90"/>
+            </w:tcMar>
+            <w:vAlign w:val="top"/>
+          </w:tcPr>
+          <w:p>
+            <w:pPr>
+              <w:keepNext w:val="false"/>
+              <w:bidi/>
+              <w:spacing w:after="30" w:before="30" w:line="264"/>
+            </w:pPr>
+            <w:r>
+              <w:rPr>
+                <w:rFonts w:ascii="Arial" w:cs="Arial" w:eastAsia="Arial" w:hAnsi="Arial"/>
+                <w:b w:val="false"/>
+                <w:bCs w:val="false"/>
+                <w:sz w:val="18"/>
+                <w:szCs w:val="18"/>
+                <w:rtl/>
+              </w:rPr>
+              <w:t xml:space="preserve">الطلب العام ومحرك الطلبات</w:t>
+            </w:r>
+          </w:p>
+        </w:tc>
+        <w:tc>
+          <w:tcPr>
+            <w:tcW w:type="dxa" w:w="2438"/>
+            <w:tcBorders>
+              <w:top w:val="single" w:color="BFC9D6" w:sz="4"/>
+              <w:left w:val="single" w:color="BFC9D6" w:sz="4"/>
+              <w:bottom w:val="single" w:color="BFC9D6" w:sz="4"/>
+              <w:right w:val="single" w:color="BFC9D6" w:sz="4"/>
+            </w:tcBorders>
+            <w:tcMar>
+              <w:top w:type="dxa" w:w="50"/>
+              <w:left w:type="dxa" w:w="90"/>
+              <w:bottom w:type="dxa" w:w="50"/>
+              <w:right w:type="dxa" w:w="90"/>
+            </w:tcMar>
+            <w:vAlign w:val="top"/>
+          </w:tcPr>
+          <w:p>
+            <w:pPr>
+              <w:keepNext w:val="false"/>
+              <w:bidi/>
+              <w:spacing w:after="30" w:before="30" w:line="264"/>
+            </w:pPr>
+            <w:r>
+              <w:rPr>
+                <w:rFonts w:ascii="Arial" w:cs="Arial" w:eastAsia="Arial" w:hAnsi="Arial"/>
+                <w:b w:val="false"/>
+                <w:bCs w:val="false"/>
+                <w:sz w:val="18"/>
+                <w:szCs w:val="18"/>
+                <w:rtl/>
+              </w:rPr>
+              <w:t xml:space="preserve">من المسودة إلى الإغلاق، والإعادة دورة جديدة، والتعليقات الداخلية، والاستلامان المتزامنان، والإلغاء</w:t>
+            </w:r>
+          </w:p>
+        </w:tc>
+        <w:tc>
+          <w:tcPr>
+            <w:tcW w:type="dxa" w:w="4878"/>
+            <w:tcBorders>
+              <w:top w:val="single" w:color="BFC9D6" w:sz="4"/>
+              <w:left w:val="single" w:color="BFC9D6" w:sz="4"/>
+              <w:bottom w:val="single" w:color="BFC9D6" w:sz="4"/>
+              <w:right w:val="single" w:color="BFC9D6" w:sz="4"/>
+            </w:tcBorders>
+            <w:tcMar>
+              <w:top w:type="dxa" w:w="50"/>
+              <w:left w:type="dxa" w:w="90"/>
+              <w:bottom w:type="dxa" w:w="50"/>
+              <w:right w:type="dxa" w:w="90"/>
+            </w:tcMar>
+            <w:vAlign w:val="top"/>
+          </w:tcPr>
+          <w:p>
+            <w:pPr>
+              <w:keepNext w:val="false"/>
+              <w:bidi/>
+              <w:spacing w:after="30" w:before="30" w:line="264"/>
+            </w:pPr>
+            <w:r>
+              <w:rPr>
+                <w:rFonts w:ascii="Courier New" w:cs="Courier New" w:eastAsia="Courier New" w:hAnsi="Courier New"/>
+                <w:b w:val="false"/>
+                <w:bCs w:val="false"/>
+                <w:color w:val="1F2937"/>
+                <w:sz w:val="16"/>
+                <w:szCs w:val="16"/>
+                <w:shd w:fill="F1F3F5" w:color="auto" w:val="clear"/>
+                <w:rtl/>
+              </w:rPr>
+              <w:t xml:space="preserve">‎RequestEngineTests‎</w:t>
+            </w:r>
+            <w:r>
+              <w:rPr>
+                <w:rFonts w:ascii="Arial" w:cs="Arial" w:eastAsia="Arial" w:hAnsi="Arial"/>
+                <w:b w:val="false"/>
+                <w:bCs w:val="false"/>
+                <w:sz w:val="18"/>
+                <w:szCs w:val="18"/>
+                <w:rtl/>
+              </w:rPr>
+              <w:t xml:space="preserve"> (أربعة)</w:t>
+            </w:r>
+          </w:p>
+        </w:tc>
+        <w:tc>
+          <w:tcPr>
+            <w:tcW w:type="dxa" w:w="1108"/>
+            <w:tcBorders>
+              <w:top w:val="single" w:color="BFC9D6" w:sz="4"/>
+              <w:left w:val="single" w:color="BFC9D6" w:sz="4"/>
+              <w:bottom w:val="single" w:color="BFC9D6" w:sz="4"/>
+              <w:right w:val="single" w:color="BFC9D6" w:sz="4"/>
+            </w:tcBorders>
+            <w:tcMar>
+              <w:top w:type="dxa" w:w="50"/>
+              <w:left w:type="dxa" w:w="90"/>
+              <w:bottom w:type="dxa" w:w="50"/>
+              <w:right w:type="dxa" w:w="90"/>
+            </w:tcMar>
+            <w:vAlign w:val="top"/>
+          </w:tcPr>
+          <w:p>
+            <w:pPr>
+              <w:keepNext w:val="false"/>
+              <w:bidi/>
+              <w:spacing w:after="30" w:before="30" w:line="264"/>
+            </w:pPr>
+            <w:r>
+              <w:rPr>
+                <w:rFonts w:ascii="Arial" w:cs="Arial" w:eastAsia="Arial" w:hAnsi="Arial"/>
+                <w:b w:val="false"/>
+                <w:bCs w:val="false"/>
+                <w:sz w:val="18"/>
+                <w:szCs w:val="18"/>
+                <w:rtl/>
+              </w:rPr>
+              <w:t xml:space="preserve">ناجح</w:t>
+            </w:r>
+          </w:p>
+        </w:tc>
+      </w:tr>
+      <w:tr>
+        <w:trPr>
+          <w:cantSplit/>
+        </w:trPr>
+        <w:tc>
+          <w:tcPr>
+            <w:tcW w:type="dxa" w:w="1440"/>
+            <w:tcBorders>
+              <w:top w:val="single" w:color="BFC9D6" w:sz="4"/>
+              <w:left w:val="single" w:color="BFC9D6" w:sz="4"/>
+              <w:bottom w:val="single" w:color="BFC9D6" w:sz="4"/>
+              <w:right w:val="single" w:color="BFC9D6" w:sz="4"/>
+            </w:tcBorders>
+            <w:shd w:fill="F5F8FC" w:color="auto" w:val="clear"/>
+            <w:tcMar>
+              <w:top w:type="dxa" w:w="50"/>
+              <w:left w:type="dxa" w:w="90"/>
+              <w:bottom w:type="dxa" w:w="50"/>
+              <w:right w:type="dxa" w:w="90"/>
+            </w:tcMar>
+            <w:vAlign w:val="top"/>
+          </w:tcPr>
+          <w:p>
+            <w:pPr>
+              <w:keepNext w:val="false"/>
+              <w:bidi/>
+              <w:spacing w:after="30" w:before="30" w:line="264"/>
+            </w:pPr>
+            <w:r>
+              <w:rPr>
+                <w:rFonts w:ascii="Arial" w:cs="Arial" w:eastAsia="Arial" w:hAnsi="Arial"/>
+                <w:b w:val="false"/>
+                <w:bCs w:val="false"/>
+                <w:sz w:val="18"/>
+                <w:szCs w:val="18"/>
+                <w:rtl/>
+              </w:rPr>
+              <w:t xml:space="preserve">نص البنود وتحويل الحقول</w:t>
+            </w:r>
+          </w:p>
+        </w:tc>
+        <w:tc>
+          <w:tcPr>
+            <w:tcW w:type="dxa" w:w="2438"/>
+            <w:tcBorders>
+              <w:top w:val="single" w:color="BFC9D6" w:sz="4"/>
+              <w:left w:val="single" w:color="BFC9D6" w:sz="4"/>
+              <w:bottom w:val="single" w:color="BFC9D6" w:sz="4"/>
+              <w:right w:val="single" w:color="BFC9D6" w:sz="4"/>
+            </w:tcBorders>
+            <w:shd w:fill="F5F8FC" w:color="auto" w:val="clear"/>
+            <w:tcMar>
+              <w:top w:type="dxa" w:w="50"/>
+              <w:left w:type="dxa" w:w="90"/>
+              <w:bottom w:type="dxa" w:w="50"/>
+              <w:right w:type="dxa" w:w="90"/>
+            </w:tcMar>
+            <w:vAlign w:val="top"/>
+          </w:tcPr>
+          <w:p>
+            <w:pPr>
+              <w:keepNext w:val="false"/>
+              <w:bidi/>
+              <w:spacing w:after="30" w:before="30" w:line="264"/>
+            </w:pPr>
+            <w:r>
+              <w:rPr>
+                <w:rFonts w:ascii="Arial" w:cs="Arial" w:eastAsia="Arial" w:hAnsi="Arial"/>
+                <w:b w:val="false"/>
+                <w:bCs w:val="false"/>
+                <w:sz w:val="18"/>
+                <w:szCs w:val="18"/>
+                <w:rtl/>
+              </w:rPr>
+              <w:t xml:space="preserve">تعبئة نص البند من المعاملات، ومراجع UCP، وتحويلات النموذج (الحروف الكبيرة والتاريخ والهجري والمربع)</w:t>
+            </w:r>
+          </w:p>
+        </w:tc>
+        <w:tc>
+          <w:tcPr>
+            <w:tcW w:type="dxa" w:w="4878"/>
+            <w:tcBorders>
+              <w:top w:val="single" w:color="BFC9D6" w:sz="4"/>
+              <w:left w:val="single" w:color="BFC9D6" w:sz="4"/>
+              <w:bottom w:val="single" w:color="BFC9D6" w:sz="4"/>
+              <w:right w:val="single" w:color="BFC9D6" w:sz="4"/>
+            </w:tcBorders>
+            <w:shd w:fill="F5F8FC" w:color="auto" w:val="clear"/>
+            <w:tcMar>
+              <w:top w:type="dxa" w:w="50"/>
+              <w:left w:type="dxa" w:w="90"/>
+              <w:bottom w:type="dxa" w:w="50"/>
+              <w:right w:type="dxa" w:w="90"/>
+            </w:tcMar>
+            <w:vAlign w:val="top"/>
+          </w:tcPr>
+          <w:p>
+            <w:pPr>
+              <w:keepNext w:val="false"/>
+              <w:bidi/>
+              <w:spacing w:after="30" w:before="30" w:line="264"/>
+            </w:pPr>
+            <w:r>
+              <w:rPr>
+                <w:rFonts w:ascii="Courier New" w:cs="Courier New" w:eastAsia="Courier New" w:hAnsi="Courier New"/>
+                <w:b w:val="false"/>
+                <w:bCs w:val="false"/>
+                <w:color w:val="1F2937"/>
+                <w:sz w:val="16"/>
+                <w:szCs w:val="16"/>
+                <w:shd w:fill="F1F3F5" w:color="auto" w:val="clear"/>
+                <w:rtl/>
+              </w:rPr>
+              <w:t xml:space="preserve">‎ClauseTextTests‎</w:t>
+            </w:r>
+            <w:r>
+              <w:rPr>
+                <w:rFonts w:ascii="Arial" w:cs="Arial" w:eastAsia="Arial" w:hAnsi="Arial"/>
+                <w:b w:val="false"/>
+                <w:bCs w:val="false"/>
+                <w:sz w:val="18"/>
+                <w:szCs w:val="18"/>
+                <w:rtl/>
+              </w:rPr>
+              <w:t xml:space="preserve"> و</w:t>
+            </w:r>
+            <w:r>
+              <w:rPr>
+                <w:rFonts w:ascii="Courier New" w:cs="Courier New" w:eastAsia="Courier New" w:hAnsi="Courier New"/>
+                <w:b w:val="false"/>
+                <w:bCs w:val="false"/>
+                <w:color w:val="1F2937"/>
+                <w:sz w:val="16"/>
+                <w:szCs w:val="16"/>
+                <w:shd w:fill="F1F3F5" w:color="auto" w:val="clear"/>
+                <w:rtl/>
+              </w:rPr>
+              <w:t xml:space="preserve">‎FormFieldTransformTests‎</w:t>
+            </w:r>
+            <w:r>
+              <w:rPr>
+                <w:rFonts w:ascii="Arial" w:cs="Arial" w:eastAsia="Arial" w:hAnsi="Arial"/>
+                <w:b w:val="false"/>
+                <w:bCs w:val="false"/>
+                <w:sz w:val="18"/>
+                <w:szCs w:val="18"/>
+                <w:rtl/>
+              </w:rPr>
+              <w:t xml:space="preserve"> (وحدة)</w:t>
+            </w:r>
+          </w:p>
+        </w:tc>
+        <w:tc>
+          <w:tcPr>
+            <w:tcW w:type="dxa" w:w="1108"/>
+            <w:tcBorders>
+              <w:top w:val="single" w:color="BFC9D6" w:sz="4"/>
+              <w:left w:val="single" w:color="BFC9D6" w:sz="4"/>
+              <w:bottom w:val="single" w:color="BFC9D6" w:sz="4"/>
+              <w:right w:val="single" w:color="BFC9D6" w:sz="4"/>
+            </w:tcBorders>
+            <w:shd w:fill="F5F8FC" w:color="auto" w:val="clear"/>
+            <w:tcMar>
+              <w:top w:type="dxa" w:w="50"/>
+              <w:left w:type="dxa" w:w="90"/>
+              <w:bottom w:type="dxa" w:w="50"/>
+              <w:right w:type="dxa" w:w="90"/>
+            </w:tcMar>
+            <w:vAlign w:val="top"/>
+          </w:tcPr>
+          <w:p>
+            <w:pPr>
+              <w:keepNext w:val="false"/>
+              <w:bidi/>
+              <w:spacing w:after="30" w:before="30" w:line="264"/>
+            </w:pPr>
+            <w:r>
+              <w:rPr>
+                <w:rFonts w:ascii="Arial" w:cs="Arial" w:eastAsia="Arial" w:hAnsi="Arial"/>
+                <w:b w:val="false"/>
+                <w:bCs w:val="false"/>
+                <w:sz w:val="18"/>
+                <w:szCs w:val="18"/>
+                <w:rtl/>
+              </w:rPr>
+              <w:t xml:space="preserve">ناجح</w:t>
+            </w:r>
+          </w:p>
+        </w:tc>
+      </w:tr>
+      <w:tr>
+        <w:trPr>
+          <w:cantSplit/>
+        </w:trPr>
+        <w:tc>
+          <w:tcPr>
+            <w:tcW w:type="dxa" w:w="1440"/>
+            <w:tcBorders>
+              <w:top w:val="single" w:color="BFC9D6" w:sz="4"/>
+              <w:left w:val="single" w:color="BFC9D6" w:sz="4"/>
+              <w:bottom w:val="single" w:color="BFC9D6" w:sz="4"/>
+              <w:right w:val="single" w:color="BFC9D6" w:sz="4"/>
+            </w:tcBorders>
+            <w:tcMar>
+              <w:top w:type="dxa" w:w="50"/>
+              <w:left w:type="dxa" w:w="90"/>
+              <w:bottom w:type="dxa" w:w="50"/>
+              <w:right w:type="dxa" w:w="90"/>
+            </w:tcMar>
+            <w:vAlign w:val="top"/>
+          </w:tcPr>
+          <w:p>
+            <w:pPr>
+              <w:keepNext w:val="false"/>
+              <w:bidi/>
+              <w:spacing w:after="30" w:before="30" w:line="264"/>
+            </w:pPr>
+            <w:r>
+              <w:rPr>
+                <w:rFonts w:ascii="Arial" w:cs="Arial" w:eastAsia="Arial" w:hAnsi="Arial"/>
+                <w:b w:val="false"/>
+                <w:bCs w:val="false"/>
+                <w:sz w:val="18"/>
+                <w:szCs w:val="18"/>
+                <w:rtl/>
+              </w:rPr>
+              <w:t xml:space="preserve">اختبار المتصفح (مقطع S3)</w:t>
+            </w:r>
+          </w:p>
+        </w:tc>
+        <w:tc>
+          <w:tcPr>
+            <w:tcW w:type="dxa" w:w="2438"/>
+            <w:tcBorders>
+              <w:top w:val="single" w:color="BFC9D6" w:sz="4"/>
+              <w:left w:val="single" w:color="BFC9D6" w:sz="4"/>
+              <w:bottom w:val="single" w:color="BFC9D6" w:sz="4"/>
+              <w:right w:val="single" w:color="BFC9D6" w:sz="4"/>
+            </w:tcBorders>
+            <w:tcMar>
+              <w:top w:type="dxa" w:w="50"/>
+              <w:left w:type="dxa" w:w="90"/>
+              <w:bottom w:type="dxa" w:w="50"/>
+              <w:right w:type="dxa" w:w="90"/>
+            </w:tcMar>
+            <w:vAlign w:val="top"/>
+          </w:tcPr>
+          <w:p>
+            <w:pPr>
+              <w:keepNext w:val="false"/>
+              <w:bidi/>
+              <w:spacing w:after="30" w:before="30" w:line="264"/>
+            </w:pPr>
+            <w:r>
+              <w:rPr>
+                <w:rFonts w:ascii="Arial" w:cs="Arial" w:eastAsia="Arial" w:hAnsi="Arial"/>
+                <w:b w:val="false"/>
+                <w:bCs w:val="false"/>
+                <w:sz w:val="18"/>
+                <w:szCs w:val="18"/>
+                <w:rtl/>
+              </w:rPr>
+              <w:t xml:space="preserve">لوحة المدير، وصندوق المهام، وقوالب نماذج البنوك في بوابة المشترك</w:t>
+            </w:r>
+          </w:p>
+        </w:tc>
+        <w:tc>
+          <w:tcPr>
+            <w:tcW w:type="dxa" w:w="4878"/>
+            <w:tcBorders>
+              <w:top w:val="single" w:color="BFC9D6" w:sz="4"/>
+              <w:left w:val="single" w:color="BFC9D6" w:sz="4"/>
+              <w:bottom w:val="single" w:color="BFC9D6" w:sz="4"/>
+              <w:right w:val="single" w:color="BFC9D6" w:sz="4"/>
+            </w:tcBorders>
+            <w:tcMar>
+              <w:top w:type="dxa" w:w="50"/>
+              <w:left w:type="dxa" w:w="90"/>
+              <w:bottom w:type="dxa" w:w="50"/>
+              <w:right w:type="dxa" w:w="90"/>
+            </w:tcMar>
+            <w:vAlign w:val="top"/>
+          </w:tcPr>
+          <w:p>
+            <w:pPr>
+              <w:keepNext w:val="false"/>
+              <w:bidi/>
+              <w:spacing w:after="30" w:before="30" w:line="264"/>
+            </w:pPr>
+            <w:r>
+              <w:rPr>
+                <w:rFonts w:ascii="Courier New" w:cs="Courier New" w:eastAsia="Courier New" w:hAnsi="Courier New"/>
+                <w:b w:val="false"/>
+                <w:bCs w:val="false"/>
+                <w:color w:val="1F2937"/>
+                <w:sz w:val="16"/>
+                <w:szCs w:val="16"/>
+                <w:shd w:fill="F1F3F5" w:color="auto" w:val="clear"/>
+                <w:rtl/>
+              </w:rPr>
+              <w:t xml:space="preserve">‎e2e/s0.spec.ts‎</w:t>
+            </w:r>
+          </w:p>
+        </w:tc>
+        <w:tc>
+          <w:tcPr>
+            <w:tcW w:type="dxa" w:w="1108"/>
+            <w:tcBorders>
+              <w:top w:val="single" w:color="BFC9D6" w:sz="4"/>
+              <w:left w:val="single" w:color="BFC9D6" w:sz="4"/>
+              <w:bottom w:val="single" w:color="BFC9D6" w:sz="4"/>
+              <w:right w:val="single" w:color="BFC9D6" w:sz="4"/>
+            </w:tcBorders>
+            <w:tcMar>
+              <w:top w:type="dxa" w:w="50"/>
+              <w:left w:type="dxa" w:w="90"/>
+              <w:bottom w:type="dxa" w:w="50"/>
+              <w:right w:type="dxa" w:w="90"/>
+            </w:tcMar>
+            <w:vAlign w:val="top"/>
+          </w:tcPr>
+          <w:p>
+            <w:pPr>
+              <w:keepNext w:val="false"/>
+              <w:bidi/>
+              <w:spacing w:after="30" w:before="30" w:line="264"/>
+            </w:pPr>
+            <w:r>
+              <w:rPr>
+                <w:rFonts w:ascii="Arial" w:cs="Arial" w:eastAsia="Arial" w:hAnsi="Arial"/>
+                <w:b w:val="false"/>
+                <w:bCs w:val="false"/>
+                <w:sz w:val="18"/>
+                <w:szCs w:val="18"/>
+                <w:rtl/>
+              </w:rPr>
+              <w:t xml:space="preserve">مكتوب</w:t>
+            </w:r>
+          </w:p>
+        </w:tc>
+      </w:tr>
+    </w:tbl>
+    <w:p>
+      <w:pPr>
+        <w:bidi/>
+        <w:spacing w:after="120" w:before="0"/>
+      </w:pPr>
+    </w:p>
+    <w:p>
+      <w:pPr>
+        <w:bidi/>
+        <w:spacing w:after="110" w:before="0" w:line="312"/>
+      </w:pPr>
+      <w:r>
+        <w:rPr>
+          <w:rFonts w:ascii="Arial" w:cs="Arial" w:eastAsia="Arial" w:hAnsi="Arial"/>
+          <w:b w:val="false"/>
+          <w:bCs w:val="false"/>
+          <w:sz w:val="21"/>
+          <w:szCs w:val="21"/>
+          <w:rtl/>
+        </w:rPr>
+        <w:t xml:space="preserve">تنبيه على الحزمة DS-LC-C: كتبها وكيل ذكاء اصطناعي، وأرقامها ومورّدوها مخترعون. تُحمَّل الاتفاقية C في الاختبار بعد نقل تواريخها بأشهر كاملة لتكون سارية في يوم التشغيل؛ والملف نفسه لا يتغير وبصمته تُفحص. أدوار المُعِدّ والمراجع والمعتمِد تُوقَّع قبل UAT، وحالتها في البيان PROPOSED.</w:t>
       </w:r>
     </w:p>
     <w:sectPr>
@@ -44846,7 +47890,7 @@
         <w:szCs w:val="17"/>
         <w:rtl/>
       </w:rPr>
-      <w:t xml:space="preserve">DOC-B02 · BankFas · مستندات الجاهزية P0 · 0.1 مسودة</w:t>
+      <w:t xml:space="preserve">DOC-B02 · سجل سيناريوهات القبول · BankFas</w:t>
     </w:r>
   </w:p>
 </w:hdr>

</xml_diff>

<commit_message>
Full check passed; the pack checker and database tests follow S3 and the reference
- app_ci passed on 5991dad: 157 unit tests, the browser test, 104 integration
  tests. DOC-B02 section 12, docs/48 sections 5 and 6, docs/31, ADR 0045 and
  the Word files record it, with read isolation (READ_COMMITTED_SNAPSHOT) as
  the administrator's open decision.
- tenant_packs.py: ref.UcpArticle resolves from db/seed/103; LeadDays may end
  on 0 (the day itself); WFL.BASE declares its WFL.* SeedKey prefix. These
  checks had not run since S3-A.
- db/tests and the perf seed give the facilities they activate a platform
  reference (BR-FAC-021).

Co-Authored-By: Claude Opus 5.5 <noreply@anthropic.com>
Claude-Session: https://claude.ai/code/session_012HHcRrzuvMBTL2FYxXtsyv
</commit_message>
<xml_diff>
--- a/treasury-platform/docs/30-readiness/word/DOC-B02-acceptance-criteria-register-s0-s1.docx
+++ b/treasury-platform/docs/30-readiness/word/DOC-B02-acceptance-criteria-register-s0-s1.docx
@@ -44875,7 +44875,31 @@
           <w:szCs w:val="21"/>
           <w:rtl/>
         </w:rPr>
-        <w:t xml:space="preserve"> بطلب المالك («اكمل البناء ليتم الفحص لاحقا بعد اكتمال البناء») كُتبت الاختبارات المعلَّمة «مكتوب» وجُمِّعت دون تشغيل. تُشغَّل كلها في دورة CI واحدة بعد اكتمال البناء، ويُحدَّث هذا الجدول بنتيجتها. «ناجح» معناه أنه نجح في CI على الالتزام f63a30e أو eaff077 أو e4f16c3.</w:t>
+        <w:t xml:space="preserve"> كُتبت الاختبارات مع البناء ثم شُغِّلت كلها في الفحص الكامل (</w:t>
+      </w:r>
+      <w:r>
+        <w:rPr>
+          <w:rFonts w:ascii="Courier New" w:cs="Courier New" w:eastAsia="Courier New" w:hAnsi="Courier New"/>
+          <w:b w:val="false"/>
+          <w:bCs w:val="false"/>
+          <w:color w:val="1F2937"/>
+          <w:sz w:val="18"/>
+          <w:szCs w:val="18"/>
+          <w:shd w:fill="F1F3F5" w:color="auto" w:val="clear"/>
+          <w:rtl/>
+        </w:rPr>
+        <w:t xml:space="preserve">‎tools/ci/app_ci.sh‎</w:t>
+      </w:r>
+      <w:r>
+        <w:rPr>
+          <w:rFonts w:ascii="Arial" w:cs="Arial" w:eastAsia="Arial" w:hAnsi="Arial"/>
+          <w:b w:val="false"/>
+          <w:bCs w:val="false"/>
+          <w:sz w:val="21"/>
+          <w:szCs w:val="21"/>
+          <w:rtl/>
+        </w:rPr>
+        <w:t xml:space="preserve">) على الإيداع 5991dad: 157 اختبار وحدة، واختبار المتصفح، و104 اختبارات تكامل، كلها ناجحة. وكشفت الدورات قبله أخطاء أُصلحت (§5 من docs/48): كلمة محجوزة في لوحة المدير، وجمود في قاعدة البيانات تحت التزامن، وساعة التفويض.</w:t>
       </w:r>
     </w:p>
     <w:tbl>
@@ -44892,10 +44916,10 @@
         </w:tblBorders>
       </w:tblPr>
       <w:tblGrid>
-        <w:gridCol w:w="1440"/>
-        <w:gridCol w:w="2438"/>
-        <w:gridCol w:w="4878"/>
-        <w:gridCol w:w="1108"/>
+        <w:gridCol w:w="1463"/>
+        <w:gridCol w:w="2476"/>
+        <w:gridCol w:w="4955"/>
+        <w:gridCol w:w="970"/>
       </w:tblGrid>
       <w:tr>
         <w:trPr>
@@ -44904,7 +44928,7 @@
         </w:trPr>
         <w:tc>
           <w:tcPr>
-            <w:tcW w:type="dxa" w:w="1440"/>
+            <w:tcW w:type="dxa" w:w="1463"/>
             <w:tcBorders>
               <w:top w:val="single" w:color="BFC9D6" w:sz="4"/>
               <w:left w:val="single" w:color="BFC9D6" w:sz="4"/>
@@ -44942,7 +44966,7 @@
         </w:tc>
         <w:tc>
           <w:tcPr>
-            <w:tcW w:type="dxa" w:w="2438"/>
+            <w:tcW w:type="dxa" w:w="2476"/>
             <w:tcBorders>
               <w:top w:val="single" w:color="BFC9D6" w:sz="4"/>
               <w:left w:val="single" w:color="BFC9D6" w:sz="4"/>
@@ -44980,7 +45004,7 @@
         </w:tc>
         <w:tc>
           <w:tcPr>
-            <w:tcW w:type="dxa" w:w="4878"/>
+            <w:tcW w:type="dxa" w:w="4955"/>
             <w:tcBorders>
               <w:top w:val="single" w:color="BFC9D6" w:sz="4"/>
               <w:left w:val="single" w:color="BFC9D6" w:sz="4"/>
@@ -45018,7 +45042,7 @@
         </w:tc>
         <w:tc>
           <w:tcPr>
-            <w:tcW w:type="dxa" w:w="1108"/>
+            <w:tcW w:type="dxa" w:w="970"/>
             <w:tcBorders>
               <w:top w:val="single" w:color="BFC9D6" w:sz="4"/>
               <w:left w:val="single" w:color="BFC9D6" w:sz="4"/>
@@ -45061,7 +45085,7 @@
         </w:trPr>
         <w:tc>
           <w:tcPr>
-            <w:tcW w:type="dxa" w:w="1440"/>
+            <w:tcW w:type="dxa" w:w="1463"/>
             <w:tcBorders>
               <w:top w:val="single" w:color="BFC9D6" w:sz="4"/>
               <w:left w:val="single" w:color="BFC9D6" w:sz="4"/>
@@ -45097,7 +45121,7 @@
         </w:tc>
         <w:tc>
           <w:tcPr>
-            <w:tcW w:type="dxa" w:w="2438"/>
+            <w:tcW w:type="dxa" w:w="2476"/>
             <w:tcBorders>
               <w:top w:val="single" w:color="BFC9D6" w:sz="4"/>
               <w:left w:val="single" w:color="BFC9D6" w:sz="4"/>
@@ -45133,7 +45157,7 @@
         </w:tc>
         <w:tc>
           <w:tcPr>
-            <w:tcW w:type="dxa" w:w="4878"/>
+            <w:tcW w:type="dxa" w:w="4955"/>
             <w:tcBorders>
               <w:top w:val="single" w:color="BFC9D6" w:sz="4"/>
               <w:left w:val="single" w:color="BFC9D6" w:sz="4"/>
@@ -45171,37 +45195,37 @@
         </w:tc>
         <w:tc>
           <w:tcPr>
-            <w:tcW w:type="dxa" w:w="1108"/>
-            <w:tcBorders>
-              <w:top w:val="single" w:color="BFC9D6" w:sz="4"/>
-              <w:left w:val="single" w:color="BFC9D6" w:sz="4"/>
-              <w:bottom w:val="single" w:color="BFC9D6" w:sz="4"/>
-              <w:right w:val="single" w:color="BFC9D6" w:sz="4"/>
-            </w:tcBorders>
-            <w:tcMar>
-              <w:top w:type="dxa" w:w="50"/>
-              <w:left w:type="dxa" w:w="90"/>
-              <w:bottom w:type="dxa" w:w="50"/>
-              <w:right w:type="dxa" w:w="90"/>
-            </w:tcMar>
-            <w:vAlign w:val="top"/>
-          </w:tcPr>
-          <w:p>
-            <w:pPr>
-              <w:keepNext w:val="false"/>
-              <w:bidi/>
-              <w:spacing w:after="30" w:before="30" w:line="264"/>
-            </w:pPr>
-            <w:r>
-              <w:rPr>
-                <w:rFonts w:ascii="Arial" w:cs="Arial" w:eastAsia="Arial" w:hAnsi="Arial"/>
-                <w:b w:val="false"/>
-                <w:bCs w:val="false"/>
-                <w:sz w:val="18"/>
-                <w:szCs w:val="18"/>
-                <w:rtl/>
-              </w:rPr>
-              <w:t xml:space="preserve">ناجح (eaff077)؛ يُعاد بعد إضافة التنفيذ والإيصال</w:t>
+            <w:tcW w:type="dxa" w:w="970"/>
+            <w:tcBorders>
+              <w:top w:val="single" w:color="BFC9D6" w:sz="4"/>
+              <w:left w:val="single" w:color="BFC9D6" w:sz="4"/>
+              <w:bottom w:val="single" w:color="BFC9D6" w:sz="4"/>
+              <w:right w:val="single" w:color="BFC9D6" w:sz="4"/>
+            </w:tcBorders>
+            <w:tcMar>
+              <w:top w:type="dxa" w:w="50"/>
+              <w:left w:type="dxa" w:w="90"/>
+              <w:bottom w:type="dxa" w:w="50"/>
+              <w:right w:type="dxa" w:w="90"/>
+            </w:tcMar>
+            <w:vAlign w:val="top"/>
+          </w:tcPr>
+          <w:p>
+            <w:pPr>
+              <w:keepNext w:val="false"/>
+              <w:bidi/>
+              <w:spacing w:after="30" w:before="30" w:line="264"/>
+            </w:pPr>
+            <w:r>
+              <w:rPr>
+                <w:rFonts w:ascii="Arial" w:cs="Arial" w:eastAsia="Arial" w:hAnsi="Arial"/>
+                <w:b w:val="false"/>
+                <w:bCs w:val="false"/>
+                <w:sz w:val="18"/>
+                <w:szCs w:val="18"/>
+                <w:rtl/>
+              </w:rPr>
+              <w:t xml:space="preserve">ناجح</w:t>
             </w:r>
           </w:p>
         </w:tc>
@@ -45212,7 +45236,7 @@
         </w:trPr>
         <w:tc>
           <w:tcPr>
-            <w:tcW w:type="dxa" w:w="1440"/>
+            <w:tcW w:type="dxa" w:w="1463"/>
             <w:tcBorders>
               <w:top w:val="single" w:color="BFC9D6" w:sz="4"/>
               <w:left w:val="single" w:color="BFC9D6" w:sz="4"/>
@@ -45249,7 +45273,7 @@
         </w:tc>
         <w:tc>
           <w:tcPr>
-            <w:tcW w:type="dxa" w:w="2438"/>
+            <w:tcW w:type="dxa" w:w="2476"/>
             <w:tcBorders>
               <w:top w:val="single" w:color="BFC9D6" w:sz="4"/>
               <w:left w:val="single" w:color="BFC9D6" w:sz="4"/>
@@ -45286,7 +45310,7 @@
         </w:tc>
         <w:tc>
           <w:tcPr>
-            <w:tcW w:type="dxa" w:w="4878"/>
+            <w:tcW w:type="dxa" w:w="4955"/>
             <w:tcBorders>
               <w:top w:val="single" w:color="BFC9D6" w:sz="4"/>
               <w:left w:val="single" w:color="BFC9D6" w:sz="4"/>
@@ -45325,7 +45349,7 @@
         </w:tc>
         <w:tc>
           <w:tcPr>
-            <w:tcW w:type="dxa" w:w="1108"/>
+            <w:tcW w:type="dxa" w:w="970"/>
             <w:tcBorders>
               <w:top w:val="single" w:color="BFC9D6" w:sz="4"/>
               <w:left w:val="single" w:color="BFC9D6" w:sz="4"/>
@@ -45356,7 +45380,7 @@
                 <w:szCs w:val="18"/>
                 <w:rtl/>
               </w:rPr>
-              <w:t xml:space="preserve">ناجح (eaff077)؛ يُعاد بعد إضافة الإيصال</w:t>
+              <w:t xml:space="preserve">ناجح</w:t>
             </w:r>
           </w:p>
         </w:tc>
@@ -45367,7 +45391,7 @@
         </w:trPr>
         <w:tc>
           <w:tcPr>
-            <w:tcW w:type="dxa" w:w="1440"/>
+            <w:tcW w:type="dxa" w:w="1463"/>
             <w:tcBorders>
               <w:top w:val="single" w:color="BFC9D6" w:sz="4"/>
               <w:left w:val="single" w:color="BFC9D6" w:sz="4"/>
@@ -45403,7 +45427,7 @@
         </w:tc>
         <w:tc>
           <w:tcPr>
-            <w:tcW w:type="dxa" w:w="2438"/>
+            <w:tcW w:type="dxa" w:w="2476"/>
             <w:tcBorders>
               <w:top w:val="single" w:color="BFC9D6" w:sz="4"/>
               <w:left w:val="single" w:color="BFC9D6" w:sz="4"/>
@@ -45439,7 +45463,7 @@
         </w:tc>
         <w:tc>
           <w:tcPr>
-            <w:tcW w:type="dxa" w:w="4878"/>
+            <w:tcW w:type="dxa" w:w="4955"/>
             <w:tcBorders>
               <w:top w:val="single" w:color="BFC9D6" w:sz="4"/>
               <w:left w:val="single" w:color="BFC9D6" w:sz="4"/>
@@ -45477,37 +45501,37 @@
         </w:tc>
         <w:tc>
           <w:tcPr>
-            <w:tcW w:type="dxa" w:w="1108"/>
-            <w:tcBorders>
-              <w:top w:val="single" w:color="BFC9D6" w:sz="4"/>
-              <w:left w:val="single" w:color="BFC9D6" w:sz="4"/>
-              <w:bottom w:val="single" w:color="BFC9D6" w:sz="4"/>
-              <w:right w:val="single" w:color="BFC9D6" w:sz="4"/>
-            </w:tcBorders>
-            <w:tcMar>
-              <w:top w:type="dxa" w:w="50"/>
-              <w:left w:type="dxa" w:w="90"/>
-              <w:bottom w:type="dxa" w:w="50"/>
-              <w:right w:type="dxa" w:w="90"/>
-            </w:tcMar>
-            <w:vAlign w:val="top"/>
-          </w:tcPr>
-          <w:p>
-            <w:pPr>
-              <w:keepNext w:val="false"/>
-              <w:bidi/>
-              <w:spacing w:after="30" w:before="30" w:line="264"/>
-            </w:pPr>
-            <w:r>
-              <w:rPr>
-                <w:rFonts w:ascii="Arial" w:cs="Arial" w:eastAsia="Arial" w:hAnsi="Arial"/>
-                <w:b w:val="false"/>
-                <w:bCs w:val="false"/>
-                <w:sz w:val="18"/>
-                <w:szCs w:val="18"/>
-                <w:rtl/>
-              </w:rPr>
-              <w:t xml:space="preserve">ناجح (eaff077)؛ يُعاد بعد إضافة الإيصال</w:t>
+            <w:tcW w:type="dxa" w:w="970"/>
+            <w:tcBorders>
+              <w:top w:val="single" w:color="BFC9D6" w:sz="4"/>
+              <w:left w:val="single" w:color="BFC9D6" w:sz="4"/>
+              <w:bottom w:val="single" w:color="BFC9D6" w:sz="4"/>
+              <w:right w:val="single" w:color="BFC9D6" w:sz="4"/>
+            </w:tcBorders>
+            <w:tcMar>
+              <w:top w:type="dxa" w:w="50"/>
+              <w:left w:type="dxa" w:w="90"/>
+              <w:bottom w:type="dxa" w:w="50"/>
+              <w:right w:type="dxa" w:w="90"/>
+            </w:tcMar>
+            <w:vAlign w:val="top"/>
+          </w:tcPr>
+          <w:p>
+            <w:pPr>
+              <w:keepNext w:val="false"/>
+              <w:bidi/>
+              <w:spacing w:after="30" w:before="30" w:line="264"/>
+            </w:pPr>
+            <w:r>
+              <w:rPr>
+                <w:rFonts w:ascii="Arial" w:cs="Arial" w:eastAsia="Arial" w:hAnsi="Arial"/>
+                <w:b w:val="false"/>
+                <w:bCs w:val="false"/>
+                <w:sz w:val="18"/>
+                <w:szCs w:val="18"/>
+                <w:rtl/>
+              </w:rPr>
+              <w:t xml:space="preserve">ناجح</w:t>
             </w:r>
           </w:p>
         </w:tc>
@@ -45518,7 +45542,7 @@
         </w:trPr>
         <w:tc>
           <w:tcPr>
-            <w:tcW w:type="dxa" w:w="1440"/>
+            <w:tcW w:type="dxa" w:w="1463"/>
             <w:tcBorders>
               <w:top w:val="single" w:color="BFC9D6" w:sz="4"/>
               <w:left w:val="single" w:color="BFC9D6" w:sz="4"/>
@@ -45555,7 +45579,7 @@
         </w:tc>
         <w:tc>
           <w:tcPr>
-            <w:tcW w:type="dxa" w:w="2438"/>
+            <w:tcW w:type="dxa" w:w="2476"/>
             <w:tcBorders>
               <w:top w:val="single" w:color="BFC9D6" w:sz="4"/>
               <w:left w:val="single" w:color="BFC9D6" w:sz="4"/>
@@ -45592,7 +45616,7 @@
         </w:tc>
         <w:tc>
           <w:tcPr>
-            <w:tcW w:type="dxa" w:w="4878"/>
+            <w:tcW w:type="dxa" w:w="4955"/>
             <w:tcBorders>
               <w:top w:val="single" w:color="BFC9D6" w:sz="4"/>
               <w:left w:val="single" w:color="BFC9D6" w:sz="4"/>
@@ -45631,7 +45655,7 @@
         </w:tc>
         <w:tc>
           <w:tcPr>
-            <w:tcW w:type="dxa" w:w="1108"/>
+            <w:tcW w:type="dxa" w:w="970"/>
             <w:tcBorders>
               <w:top w:val="single" w:color="BFC9D6" w:sz="4"/>
               <w:left w:val="single" w:color="BFC9D6" w:sz="4"/>
@@ -45662,7 +45686,7 @@
                 <w:szCs w:val="18"/>
                 <w:rtl/>
               </w:rPr>
-              <w:t xml:space="preserve">ناجح (f63a30e)</w:t>
+              <w:t xml:space="preserve">ناجح</w:t>
             </w:r>
           </w:p>
         </w:tc>
@@ -45673,7 +45697,7 @@
         </w:trPr>
         <w:tc>
           <w:tcPr>
-            <w:tcW w:type="dxa" w:w="1440"/>
+            <w:tcW w:type="dxa" w:w="1463"/>
             <w:tcBorders>
               <w:top w:val="single" w:color="BFC9D6" w:sz="4"/>
               <w:left w:val="single" w:color="BFC9D6" w:sz="4"/>
@@ -45709,7 +45733,7 @@
         </w:tc>
         <w:tc>
           <w:tcPr>
-            <w:tcW w:type="dxa" w:w="2438"/>
+            <w:tcW w:type="dxa" w:w="2476"/>
             <w:tcBorders>
               <w:top w:val="single" w:color="BFC9D6" w:sz="4"/>
               <w:left w:val="single" w:color="BFC9D6" w:sz="4"/>
@@ -45745,7 +45769,7 @@
         </w:tc>
         <w:tc>
           <w:tcPr>
-            <w:tcW w:type="dxa" w:w="4878"/>
+            <w:tcW w:type="dxa" w:w="4955"/>
             <w:tcBorders>
               <w:top w:val="single" w:color="BFC9D6" w:sz="4"/>
               <w:left w:val="single" w:color="BFC9D6" w:sz="4"/>
@@ -45783,37 +45807,37 @@
         </w:tc>
         <w:tc>
           <w:tcPr>
-            <w:tcW w:type="dxa" w:w="1108"/>
-            <w:tcBorders>
-              <w:top w:val="single" w:color="BFC9D6" w:sz="4"/>
-              <w:left w:val="single" w:color="BFC9D6" w:sz="4"/>
-              <w:bottom w:val="single" w:color="BFC9D6" w:sz="4"/>
-              <w:right w:val="single" w:color="BFC9D6" w:sz="4"/>
-            </w:tcBorders>
-            <w:tcMar>
-              <w:top w:type="dxa" w:w="50"/>
-              <w:left w:type="dxa" w:w="90"/>
-              <w:bottom w:type="dxa" w:w="50"/>
-              <w:right w:type="dxa" w:w="90"/>
-            </w:tcMar>
-            <w:vAlign w:val="top"/>
-          </w:tcPr>
-          <w:p>
-            <w:pPr>
-              <w:keepNext w:val="false"/>
-              <w:bidi/>
-              <w:spacing w:after="30" w:before="30" w:line="264"/>
-            </w:pPr>
-            <w:r>
-              <w:rPr>
-                <w:rFonts w:ascii="Arial" w:cs="Arial" w:eastAsia="Arial" w:hAnsi="Arial"/>
-                <w:b w:val="false"/>
-                <w:bCs w:val="false"/>
-                <w:sz w:val="18"/>
-                <w:szCs w:val="18"/>
-                <w:rtl/>
-              </w:rPr>
-              <w:t xml:space="preserve">ناجح (e4f16c3)</w:t>
+            <w:tcW w:type="dxa" w:w="970"/>
+            <w:tcBorders>
+              <w:top w:val="single" w:color="BFC9D6" w:sz="4"/>
+              <w:left w:val="single" w:color="BFC9D6" w:sz="4"/>
+              <w:bottom w:val="single" w:color="BFC9D6" w:sz="4"/>
+              <w:right w:val="single" w:color="BFC9D6" w:sz="4"/>
+            </w:tcBorders>
+            <w:tcMar>
+              <w:top w:type="dxa" w:w="50"/>
+              <w:left w:type="dxa" w:w="90"/>
+              <w:bottom w:type="dxa" w:w="50"/>
+              <w:right w:type="dxa" w:w="90"/>
+            </w:tcMar>
+            <w:vAlign w:val="top"/>
+          </w:tcPr>
+          <w:p>
+            <w:pPr>
+              <w:keepNext w:val="false"/>
+              <w:bidi/>
+              <w:spacing w:after="30" w:before="30" w:line="264"/>
+            </w:pPr>
+            <w:r>
+              <w:rPr>
+                <w:rFonts w:ascii="Arial" w:cs="Arial" w:eastAsia="Arial" w:hAnsi="Arial"/>
+                <w:b w:val="false"/>
+                <w:bCs w:val="false"/>
+                <w:sz w:val="18"/>
+                <w:szCs w:val="18"/>
+                <w:rtl/>
+              </w:rPr>
+              <w:t xml:space="preserve">ناجح</w:t>
             </w:r>
           </w:p>
         </w:tc>
@@ -45824,7 +45848,7 @@
         </w:trPr>
         <w:tc>
           <w:tcPr>
-            <w:tcW w:type="dxa" w:w="1440"/>
+            <w:tcW w:type="dxa" w:w="1463"/>
             <w:tcBorders>
               <w:top w:val="single" w:color="BFC9D6" w:sz="4"/>
               <w:left w:val="single" w:color="BFC9D6" w:sz="4"/>
@@ -45861,7 +45885,7 @@
         </w:tc>
         <w:tc>
           <w:tcPr>
-            <w:tcW w:type="dxa" w:w="2438"/>
+            <w:tcW w:type="dxa" w:w="2476"/>
             <w:tcBorders>
               <w:top w:val="single" w:color="BFC9D6" w:sz="4"/>
               <w:left w:val="single" w:color="BFC9D6" w:sz="4"/>
@@ -45898,7 +45922,7 @@
         </w:tc>
         <w:tc>
           <w:tcPr>
-            <w:tcW w:type="dxa" w:w="4878"/>
+            <w:tcW w:type="dxa" w:w="4955"/>
             <w:tcBorders>
               <w:top w:val="single" w:color="BFC9D6" w:sz="4"/>
               <w:left w:val="single" w:color="BFC9D6" w:sz="4"/>
@@ -45937,7 +45961,7 @@
         </w:tc>
         <w:tc>
           <w:tcPr>
-            <w:tcW w:type="dxa" w:w="1108"/>
+            <w:tcW w:type="dxa" w:w="970"/>
             <w:tcBorders>
               <w:top w:val="single" w:color="BFC9D6" w:sz="4"/>
               <w:left w:val="single" w:color="BFC9D6" w:sz="4"/>
@@ -45968,7 +45992,7 @@
                 <w:szCs w:val="18"/>
                 <w:rtl/>
               </w:rPr>
-              <w:t xml:space="preserve">ناجح (f63a30e)</w:t>
+              <w:t xml:space="preserve">ناجح</w:t>
             </w:r>
           </w:p>
         </w:tc>
@@ -45979,7 +46003,7 @@
         </w:trPr>
         <w:tc>
           <w:tcPr>
-            <w:tcW w:type="dxa" w:w="1440"/>
+            <w:tcW w:type="dxa" w:w="1463"/>
             <w:tcBorders>
               <w:top w:val="single" w:color="BFC9D6" w:sz="4"/>
               <w:left w:val="single" w:color="BFC9D6" w:sz="4"/>
@@ -46015,7 +46039,7 @@
         </w:tc>
         <w:tc>
           <w:tcPr>
-            <w:tcW w:type="dxa" w:w="2438"/>
+            <w:tcW w:type="dxa" w:w="2476"/>
             <w:tcBorders>
               <w:top w:val="single" w:color="BFC9D6" w:sz="4"/>
               <w:left w:val="single" w:color="BFC9D6" w:sz="4"/>
@@ -46051,7 +46075,7 @@
         </w:tc>
         <w:tc>
           <w:tcPr>
-            <w:tcW w:type="dxa" w:w="4878"/>
+            <w:tcW w:type="dxa" w:w="4955"/>
             <w:tcBorders>
               <w:top w:val="single" w:color="BFC9D6" w:sz="4"/>
               <w:left w:val="single" w:color="BFC9D6" w:sz="4"/>
@@ -46089,37 +46113,37 @@
         </w:tc>
         <w:tc>
           <w:tcPr>
-            <w:tcW w:type="dxa" w:w="1108"/>
-            <w:tcBorders>
-              <w:top w:val="single" w:color="BFC9D6" w:sz="4"/>
-              <w:left w:val="single" w:color="BFC9D6" w:sz="4"/>
-              <w:bottom w:val="single" w:color="BFC9D6" w:sz="4"/>
-              <w:right w:val="single" w:color="BFC9D6" w:sz="4"/>
-            </w:tcBorders>
-            <w:tcMar>
-              <w:top w:type="dxa" w:w="50"/>
-              <w:left w:type="dxa" w:w="90"/>
-              <w:bottom w:type="dxa" w:w="50"/>
-              <w:right w:type="dxa" w:w="90"/>
-            </w:tcMar>
-            <w:vAlign w:val="top"/>
-          </w:tcPr>
-          <w:p>
-            <w:pPr>
-              <w:keepNext w:val="false"/>
-              <w:bidi/>
-              <w:spacing w:after="30" w:before="30" w:line="264"/>
-            </w:pPr>
-            <w:r>
-              <w:rPr>
-                <w:rFonts w:ascii="Arial" w:cs="Arial" w:eastAsia="Arial" w:hAnsi="Arial"/>
-                <w:b w:val="false"/>
-                <w:bCs w:val="false"/>
-                <w:sz w:val="18"/>
-                <w:szCs w:val="18"/>
-                <w:rtl/>
-              </w:rPr>
-              <w:t xml:space="preserve">ناجح (f63a30e)</w:t>
+            <w:tcW w:type="dxa" w:w="970"/>
+            <w:tcBorders>
+              <w:top w:val="single" w:color="BFC9D6" w:sz="4"/>
+              <w:left w:val="single" w:color="BFC9D6" w:sz="4"/>
+              <w:bottom w:val="single" w:color="BFC9D6" w:sz="4"/>
+              <w:right w:val="single" w:color="BFC9D6" w:sz="4"/>
+            </w:tcBorders>
+            <w:tcMar>
+              <w:top w:type="dxa" w:w="50"/>
+              <w:left w:type="dxa" w:w="90"/>
+              <w:bottom w:type="dxa" w:w="50"/>
+              <w:right w:type="dxa" w:w="90"/>
+            </w:tcMar>
+            <w:vAlign w:val="top"/>
+          </w:tcPr>
+          <w:p>
+            <w:pPr>
+              <w:keepNext w:val="false"/>
+              <w:bidi/>
+              <w:spacing w:after="30" w:before="30" w:line="264"/>
+            </w:pPr>
+            <w:r>
+              <w:rPr>
+                <w:rFonts w:ascii="Arial" w:cs="Arial" w:eastAsia="Arial" w:hAnsi="Arial"/>
+                <w:b w:val="false"/>
+                <w:bCs w:val="false"/>
+                <w:sz w:val="18"/>
+                <w:szCs w:val="18"/>
+                <w:rtl/>
+              </w:rPr>
+              <w:t xml:space="preserve">ناجح</w:t>
             </w:r>
           </w:p>
         </w:tc>
@@ -46130,7 +46154,7 @@
         </w:trPr>
         <w:tc>
           <w:tcPr>
-            <w:tcW w:type="dxa" w:w="1440"/>
+            <w:tcW w:type="dxa" w:w="1463"/>
             <w:tcBorders>
               <w:top w:val="single" w:color="BFC9D6" w:sz="4"/>
               <w:left w:val="single" w:color="BFC9D6" w:sz="4"/>
@@ -46167,7 +46191,7 @@
         </w:tc>
         <w:tc>
           <w:tcPr>
-            <w:tcW w:type="dxa" w:w="2438"/>
+            <w:tcW w:type="dxa" w:w="2476"/>
             <w:tcBorders>
               <w:top w:val="single" w:color="BFC9D6" w:sz="4"/>
               <w:left w:val="single" w:color="BFC9D6" w:sz="4"/>
@@ -46204,7 +46228,7 @@
         </w:tc>
         <w:tc>
           <w:tcPr>
-            <w:tcW w:type="dxa" w:w="4878"/>
+            <w:tcW w:type="dxa" w:w="4955"/>
             <w:tcBorders>
               <w:top w:val="single" w:color="BFC9D6" w:sz="4"/>
               <w:left w:val="single" w:color="BFC9D6" w:sz="4"/>
@@ -46243,7 +46267,7 @@
         </w:tc>
         <w:tc>
           <w:tcPr>
-            <w:tcW w:type="dxa" w:w="1108"/>
+            <w:tcW w:type="dxa" w:w="970"/>
             <w:tcBorders>
               <w:top w:val="single" w:color="BFC9D6" w:sz="4"/>
               <w:left w:val="single" w:color="BFC9D6" w:sz="4"/>
@@ -46274,7 +46298,7 @@
                 <w:szCs w:val="18"/>
                 <w:rtl/>
               </w:rPr>
-              <w:t xml:space="preserve">ناجح (f63a30e)</w:t>
+              <w:t xml:space="preserve">ناجح</w:t>
             </w:r>
           </w:p>
         </w:tc>
@@ -46285,7 +46309,7 @@
         </w:trPr>
         <w:tc>
           <w:tcPr>
-            <w:tcW w:type="dxa" w:w="1440"/>
+            <w:tcW w:type="dxa" w:w="1463"/>
             <w:tcBorders>
               <w:top w:val="single" w:color="BFC9D6" w:sz="4"/>
               <w:left w:val="single" w:color="BFC9D6" w:sz="4"/>
@@ -46321,7 +46345,7 @@
         </w:tc>
         <w:tc>
           <w:tcPr>
-            <w:tcW w:type="dxa" w:w="2438"/>
+            <w:tcW w:type="dxa" w:w="2476"/>
             <w:tcBorders>
               <w:top w:val="single" w:color="BFC9D6" w:sz="4"/>
               <w:left w:val="single" w:color="BFC9D6" w:sz="4"/>
@@ -46357,7 +46381,7 @@
         </w:tc>
         <w:tc>
           <w:tcPr>
-            <w:tcW w:type="dxa" w:w="4878"/>
+            <w:tcW w:type="dxa" w:w="4955"/>
             <w:tcBorders>
               <w:top w:val="single" w:color="BFC9D6" w:sz="4"/>
               <w:left w:val="single" w:color="BFC9D6" w:sz="4"/>
@@ -46395,37 +46419,37 @@
         </w:tc>
         <w:tc>
           <w:tcPr>
-            <w:tcW w:type="dxa" w:w="1108"/>
-            <w:tcBorders>
-              <w:top w:val="single" w:color="BFC9D6" w:sz="4"/>
-              <w:left w:val="single" w:color="BFC9D6" w:sz="4"/>
-              <w:bottom w:val="single" w:color="BFC9D6" w:sz="4"/>
-              <w:right w:val="single" w:color="BFC9D6" w:sz="4"/>
-            </w:tcBorders>
-            <w:tcMar>
-              <w:top w:type="dxa" w:w="50"/>
-              <w:left w:type="dxa" w:w="90"/>
-              <w:bottom w:type="dxa" w:w="50"/>
-              <w:right w:type="dxa" w:w="90"/>
-            </w:tcMar>
-            <w:vAlign w:val="top"/>
-          </w:tcPr>
-          <w:p>
-            <w:pPr>
-              <w:keepNext w:val="false"/>
-              <w:bidi/>
-              <w:spacing w:after="30" w:before="30" w:line="264"/>
-            </w:pPr>
-            <w:r>
-              <w:rPr>
-                <w:rFonts w:ascii="Arial" w:cs="Arial" w:eastAsia="Arial" w:hAnsi="Arial"/>
-                <w:b w:val="false"/>
-                <w:bCs w:val="false"/>
-                <w:sz w:val="18"/>
-                <w:szCs w:val="18"/>
-                <w:rtl/>
-              </w:rPr>
-              <w:t xml:space="preserve">ناجح (f63a30e)</w:t>
+            <w:tcW w:type="dxa" w:w="970"/>
+            <w:tcBorders>
+              <w:top w:val="single" w:color="BFC9D6" w:sz="4"/>
+              <w:left w:val="single" w:color="BFC9D6" w:sz="4"/>
+              <w:bottom w:val="single" w:color="BFC9D6" w:sz="4"/>
+              <w:right w:val="single" w:color="BFC9D6" w:sz="4"/>
+            </w:tcBorders>
+            <w:tcMar>
+              <w:top w:type="dxa" w:w="50"/>
+              <w:left w:type="dxa" w:w="90"/>
+              <w:bottom w:type="dxa" w:w="50"/>
+              <w:right w:type="dxa" w:w="90"/>
+            </w:tcMar>
+            <w:vAlign w:val="top"/>
+          </w:tcPr>
+          <w:p>
+            <w:pPr>
+              <w:keepNext w:val="false"/>
+              <w:bidi/>
+              <w:spacing w:after="30" w:before="30" w:line="264"/>
+            </w:pPr>
+            <w:r>
+              <w:rPr>
+                <w:rFonts w:ascii="Arial" w:cs="Arial" w:eastAsia="Arial" w:hAnsi="Arial"/>
+                <w:b w:val="false"/>
+                <w:bCs w:val="false"/>
+                <w:sz w:val="18"/>
+                <w:szCs w:val="18"/>
+                <w:rtl/>
+              </w:rPr>
+              <w:t xml:space="preserve">ناجح</w:t>
             </w:r>
           </w:p>
         </w:tc>
@@ -46436,7 +46460,7 @@
         </w:trPr>
         <w:tc>
           <w:tcPr>
-            <w:tcW w:type="dxa" w:w="1440"/>
+            <w:tcW w:type="dxa" w:w="1463"/>
             <w:tcBorders>
               <w:top w:val="single" w:color="BFC9D6" w:sz="4"/>
               <w:left w:val="single" w:color="BFC9D6" w:sz="4"/>
@@ -46473,7 +46497,7 @@
         </w:tc>
         <w:tc>
           <w:tcPr>
-            <w:tcW w:type="dxa" w:w="2438"/>
+            <w:tcW w:type="dxa" w:w="2476"/>
             <w:tcBorders>
               <w:top w:val="single" w:color="BFC9D6" w:sz="4"/>
               <w:left w:val="single" w:color="BFC9D6" w:sz="4"/>
@@ -46510,7 +46534,7 @@
         </w:tc>
         <w:tc>
           <w:tcPr>
-            <w:tcW w:type="dxa" w:w="4878"/>
+            <w:tcW w:type="dxa" w:w="4955"/>
             <w:tcBorders>
               <w:top w:val="single" w:color="BFC9D6" w:sz="4"/>
               <w:left w:val="single" w:color="BFC9D6" w:sz="4"/>
@@ -46549,7 +46573,7 @@
         </w:tc>
         <w:tc>
           <w:tcPr>
-            <w:tcW w:type="dxa" w:w="1108"/>
+            <w:tcW w:type="dxa" w:w="970"/>
             <w:tcBorders>
               <w:top w:val="single" w:color="BFC9D6" w:sz="4"/>
               <w:left w:val="single" w:color="BFC9D6" w:sz="4"/>
@@ -46580,7 +46604,7 @@
                 <w:szCs w:val="18"/>
                 <w:rtl/>
               </w:rPr>
-              <w:t xml:space="preserve">ناجح (f63a30e)</w:t>
+              <w:t xml:space="preserve">ناجح</w:t>
             </w:r>
           </w:p>
         </w:tc>
@@ -46591,7 +46615,7 @@
         </w:trPr>
         <w:tc>
           <w:tcPr>
-            <w:tcW w:type="dxa" w:w="1440"/>
+            <w:tcW w:type="dxa" w:w="1463"/>
             <w:tcBorders>
               <w:top w:val="single" w:color="BFC9D6" w:sz="4"/>
               <w:left w:val="single" w:color="BFC9D6" w:sz="4"/>
@@ -46627,7 +46651,7 @@
         </w:tc>
         <w:tc>
           <w:tcPr>
-            <w:tcW w:type="dxa" w:w="2438"/>
+            <w:tcW w:type="dxa" w:w="2476"/>
             <w:tcBorders>
               <w:top w:val="single" w:color="BFC9D6" w:sz="4"/>
               <w:left w:val="single" w:color="BFC9D6" w:sz="4"/>
@@ -46663,7 +46687,7 @@
         </w:tc>
         <w:tc>
           <w:tcPr>
-            <w:tcW w:type="dxa" w:w="4878"/>
+            <w:tcW w:type="dxa" w:w="4955"/>
             <w:tcBorders>
               <w:top w:val="single" w:color="BFC9D6" w:sz="4"/>
               <w:left w:val="single" w:color="BFC9D6" w:sz="4"/>
@@ -46701,7 +46725,7 @@
         </w:tc>
         <w:tc>
           <w:tcPr>
-            <w:tcW w:type="dxa" w:w="1108"/>
+            <w:tcW w:type="dxa" w:w="970"/>
             <w:tcBorders>
               <w:top w:val="single" w:color="BFC9D6" w:sz="4"/>
               <w:left w:val="single" w:color="BFC9D6" w:sz="4"/>
@@ -46742,7 +46766,7 @@
         </w:trPr>
         <w:tc>
           <w:tcPr>
-            <w:tcW w:type="dxa" w:w="1440"/>
+            <w:tcW w:type="dxa" w:w="1463"/>
             <w:tcBorders>
               <w:top w:val="single" w:color="BFC9D6" w:sz="4"/>
               <w:left w:val="single" w:color="BFC9D6" w:sz="4"/>
@@ -46779,7 +46803,7 @@
         </w:tc>
         <w:tc>
           <w:tcPr>
-            <w:tcW w:type="dxa" w:w="2438"/>
+            <w:tcW w:type="dxa" w:w="2476"/>
             <w:tcBorders>
               <w:top w:val="single" w:color="BFC9D6" w:sz="4"/>
               <w:left w:val="single" w:color="BFC9D6" w:sz="4"/>
@@ -46810,13 +46834,13 @@
                 <w:szCs w:val="18"/>
                 <w:rtl/>
               </w:rPr>
-              <w:t xml:space="preserve">مئة طلب بـ 100,000 بلا تسامح على خط 4,000,000، ومئة موافقة لمدير الخزينة في آن واحد: أربعون تنجح وتحجز 4,000,000، وستون مرفوضة INSUFFICIENT_AVAILABLE لا تحجز شيئًا؛ وإعادة الإرسال بالمفاتيح نفسها لا تغير شيئًا</w:t>
-            </w:r>
-          </w:p>
-        </w:tc>
-        <w:tc>
-          <w:tcPr>
-            <w:tcW w:type="dxa" w:w="4878"/>
+              <w:t xml:space="preserve">مئة طلب بـ 100,000 بلا تسامح على خط 4,000,000، تُعدّ واحدًا بعد واحد، ثم مئة موافقة لمدير الخزينة في آن واحد: أربعون تنجح وتحجز 4,000,000، وستون مرفوضة INSUFFICIENT_AVAILABLE لا تحجز شيئًا؛ وإعادة الإرسال بالمفاتيح نفسها لا تغير شيئًا</w:t>
+            </w:r>
+          </w:p>
+        </w:tc>
+        <w:tc>
+          <w:tcPr>
+            <w:tcW w:type="dxa" w:w="4955"/>
             <w:tcBorders>
               <w:top w:val="single" w:color="BFC9D6" w:sz="4"/>
               <w:left w:val="single" w:color="BFC9D6" w:sz="4"/>
@@ -46855,7 +46879,7 @@
         </w:tc>
         <w:tc>
           <w:tcPr>
-            <w:tcW w:type="dxa" w:w="1108"/>
+            <w:tcW w:type="dxa" w:w="970"/>
             <w:tcBorders>
               <w:top w:val="single" w:color="BFC9D6" w:sz="4"/>
               <w:left w:val="single" w:color="BFC9D6" w:sz="4"/>
@@ -46886,7 +46910,7 @@
                 <w:szCs w:val="18"/>
                 <w:rtl/>
               </w:rPr>
-              <w:t xml:space="preserve">مكتوب</w:t>
+              <w:t xml:space="preserve">ناجح</w:t>
             </w:r>
           </w:p>
         </w:tc>
@@ -46897,7 +46921,7 @@
         </w:trPr>
         <w:tc>
           <w:tcPr>
-            <w:tcW w:type="dxa" w:w="1440"/>
+            <w:tcW w:type="dxa" w:w="1463"/>
             <w:tcBorders>
               <w:top w:val="single" w:color="BFC9D6" w:sz="4"/>
               <w:left w:val="single" w:color="BFC9D6" w:sz="4"/>
@@ -46933,7 +46957,7 @@
         </w:tc>
         <w:tc>
           <w:tcPr>
-            <w:tcW w:type="dxa" w:w="2438"/>
+            <w:tcW w:type="dxa" w:w="2476"/>
             <w:tcBorders>
               <w:top w:val="single" w:color="BFC9D6" w:sz="4"/>
               <w:left w:val="single" w:color="BFC9D6" w:sz="4"/>
@@ -46969,7 +46993,7 @@
         </w:tc>
         <w:tc>
           <w:tcPr>
-            <w:tcW w:type="dxa" w:w="4878"/>
+            <w:tcW w:type="dxa" w:w="4955"/>
             <w:tcBorders>
               <w:top w:val="single" w:color="BFC9D6" w:sz="4"/>
               <w:left w:val="single" w:color="BFC9D6" w:sz="4"/>
@@ -47007,37 +47031,37 @@
         </w:tc>
         <w:tc>
           <w:tcPr>
-            <w:tcW w:type="dxa" w:w="1108"/>
-            <w:tcBorders>
-              <w:top w:val="single" w:color="BFC9D6" w:sz="4"/>
-              <w:left w:val="single" w:color="BFC9D6" w:sz="4"/>
-              <w:bottom w:val="single" w:color="BFC9D6" w:sz="4"/>
-              <w:right w:val="single" w:color="BFC9D6" w:sz="4"/>
-            </w:tcBorders>
-            <w:tcMar>
-              <w:top w:type="dxa" w:w="50"/>
-              <w:left w:type="dxa" w:w="90"/>
-              <w:bottom w:type="dxa" w:w="50"/>
-              <w:right w:type="dxa" w:w="90"/>
-            </w:tcMar>
-            <w:vAlign w:val="top"/>
-          </w:tcPr>
-          <w:p>
-            <w:pPr>
-              <w:keepNext w:val="false"/>
-              <w:bidi/>
-              <w:spacing w:after="30" w:before="30" w:line="264"/>
-            </w:pPr>
-            <w:r>
-              <w:rPr>
-                <w:rFonts w:ascii="Arial" w:cs="Arial" w:eastAsia="Arial" w:hAnsi="Arial"/>
-                <w:b w:val="false"/>
-                <w:bCs w:val="false"/>
-                <w:sz w:val="18"/>
-                <w:szCs w:val="18"/>
-                <w:rtl/>
-              </w:rPr>
-              <w:t xml:space="preserve">مكتوب</w:t>
+            <w:tcW w:type="dxa" w:w="970"/>
+            <w:tcBorders>
+              <w:top w:val="single" w:color="BFC9D6" w:sz="4"/>
+              <w:left w:val="single" w:color="BFC9D6" w:sz="4"/>
+              <w:bottom w:val="single" w:color="BFC9D6" w:sz="4"/>
+              <w:right w:val="single" w:color="BFC9D6" w:sz="4"/>
+            </w:tcBorders>
+            <w:tcMar>
+              <w:top w:type="dxa" w:w="50"/>
+              <w:left w:type="dxa" w:w="90"/>
+              <w:bottom w:type="dxa" w:w="50"/>
+              <w:right w:type="dxa" w:w="90"/>
+            </w:tcMar>
+            <w:vAlign w:val="top"/>
+          </w:tcPr>
+          <w:p>
+            <w:pPr>
+              <w:keepNext w:val="false"/>
+              <w:bidi/>
+              <w:spacing w:after="30" w:before="30" w:line="264"/>
+            </w:pPr>
+            <w:r>
+              <w:rPr>
+                <w:rFonts w:ascii="Arial" w:cs="Arial" w:eastAsia="Arial" w:hAnsi="Arial"/>
+                <w:b w:val="false"/>
+                <w:bCs w:val="false"/>
+                <w:sz w:val="18"/>
+                <w:szCs w:val="18"/>
+                <w:rtl/>
+              </w:rPr>
+              <w:t xml:space="preserve">ناجح</w:t>
             </w:r>
           </w:p>
         </w:tc>
@@ -47048,7 +47072,7 @@
         </w:trPr>
         <w:tc>
           <w:tcPr>
-            <w:tcW w:type="dxa" w:w="1440"/>
+            <w:tcW w:type="dxa" w:w="1463"/>
             <w:tcBorders>
               <w:top w:val="single" w:color="BFC9D6" w:sz="4"/>
               <w:left w:val="single" w:color="BFC9D6" w:sz="4"/>
@@ -47085,7 +47109,7 @@
         </w:tc>
         <w:tc>
           <w:tcPr>
-            <w:tcW w:type="dxa" w:w="2438"/>
+            <w:tcW w:type="dxa" w:w="2476"/>
             <w:tcBorders>
               <w:top w:val="single" w:color="BFC9D6" w:sz="4"/>
               <w:left w:val="single" w:color="BFC9D6" w:sz="4"/>
@@ -47122,7 +47146,7 @@
         </w:tc>
         <w:tc>
           <w:tcPr>
-            <w:tcW w:type="dxa" w:w="4878"/>
+            <w:tcW w:type="dxa" w:w="4955"/>
             <w:tcBorders>
               <w:top w:val="single" w:color="BFC9D6" w:sz="4"/>
               <w:left w:val="single" w:color="BFC9D6" w:sz="4"/>
@@ -47161,7 +47185,7 @@
         </w:tc>
         <w:tc>
           <w:tcPr>
-            <w:tcW w:type="dxa" w:w="1108"/>
+            <w:tcW w:type="dxa" w:w="970"/>
             <w:tcBorders>
               <w:top w:val="single" w:color="BFC9D6" w:sz="4"/>
               <w:left w:val="single" w:color="BFC9D6" w:sz="4"/>
@@ -47192,7 +47216,7 @@
                 <w:szCs w:val="18"/>
                 <w:rtl/>
               </w:rPr>
-              <w:t xml:space="preserve">مكتوب</w:t>
+              <w:t xml:space="preserve">ناجح</w:t>
             </w:r>
           </w:p>
         </w:tc>
@@ -47203,7 +47227,7 @@
         </w:trPr>
         <w:tc>
           <w:tcPr>
-            <w:tcW w:type="dxa" w:w="1440"/>
+            <w:tcW w:type="dxa" w:w="1463"/>
             <w:tcBorders>
               <w:top w:val="single" w:color="BFC9D6" w:sz="4"/>
               <w:left w:val="single" w:color="BFC9D6" w:sz="4"/>
@@ -47239,7 +47263,7 @@
         </w:tc>
         <w:tc>
           <w:tcPr>
-            <w:tcW w:type="dxa" w:w="2438"/>
+            <w:tcW w:type="dxa" w:w="2476"/>
             <w:tcBorders>
               <w:top w:val="single" w:color="BFC9D6" w:sz="4"/>
               <w:left w:val="single" w:color="BFC9D6" w:sz="4"/>
@@ -47275,7 +47299,7 @@
         </w:tc>
         <w:tc>
           <w:tcPr>
-            <w:tcW w:type="dxa" w:w="4878"/>
+            <w:tcW w:type="dxa" w:w="4955"/>
             <w:tcBorders>
               <w:top w:val="single" w:color="BFC9D6" w:sz="4"/>
               <w:left w:val="single" w:color="BFC9D6" w:sz="4"/>
@@ -47324,7 +47348,7 @@
         </w:tc>
         <w:tc>
           <w:tcPr>
-            <w:tcW w:type="dxa" w:w="1108"/>
+            <w:tcW w:type="dxa" w:w="970"/>
             <w:tcBorders>
               <w:top w:val="single" w:color="BFC9D6" w:sz="4"/>
               <w:left w:val="single" w:color="BFC9D6" w:sz="4"/>
@@ -47365,7 +47389,7 @@
         </w:trPr>
         <w:tc>
           <w:tcPr>
-            <w:tcW w:type="dxa" w:w="1440"/>
+            <w:tcW w:type="dxa" w:w="1463"/>
             <w:tcBorders>
               <w:top w:val="single" w:color="BFC9D6" w:sz="4"/>
               <w:left w:val="single" w:color="BFC9D6" w:sz="4"/>
@@ -47402,7 +47426,7 @@
         </w:tc>
         <w:tc>
           <w:tcPr>
-            <w:tcW w:type="dxa" w:w="2438"/>
+            <w:tcW w:type="dxa" w:w="2476"/>
             <w:tcBorders>
               <w:top w:val="single" w:color="BFC9D6" w:sz="4"/>
               <w:left w:val="single" w:color="BFC9D6" w:sz="4"/>
@@ -47439,7 +47463,7 @@
         </w:tc>
         <w:tc>
           <w:tcPr>
-            <w:tcW w:type="dxa" w:w="4878"/>
+            <w:tcW w:type="dxa" w:w="4955"/>
             <w:tcBorders>
               <w:top w:val="single" w:color="BFC9D6" w:sz="4"/>
               <w:left w:val="single" w:color="BFC9D6" w:sz="4"/>
@@ -47513,7 +47537,7 @@
         </w:tc>
         <w:tc>
           <w:tcPr>
-            <w:tcW w:type="dxa" w:w="1108"/>
+            <w:tcW w:type="dxa" w:w="970"/>
             <w:tcBorders>
               <w:top w:val="single" w:color="BFC9D6" w:sz="4"/>
               <w:left w:val="single" w:color="BFC9D6" w:sz="4"/>
@@ -47555,99 +47579,74 @@
         </w:trPr>
         <w:tc>
           <w:tcPr>
-            <w:tcW w:type="dxa" w:w="1440"/>
-            <w:tcBorders>
-              <w:top w:val="single" w:color="BFC9D6" w:sz="4"/>
-              <w:left w:val="single" w:color="BFC9D6" w:sz="4"/>
-              <w:bottom w:val="single" w:color="BFC9D6" w:sz="4"/>
-              <w:right w:val="single" w:color="BFC9D6" w:sz="4"/>
-            </w:tcBorders>
-            <w:tcMar>
-              <w:top w:type="dxa" w:w="50"/>
-              <w:left w:type="dxa" w:w="90"/>
-              <w:bottom w:type="dxa" w:w="50"/>
-              <w:right w:type="dxa" w:w="90"/>
-            </w:tcMar>
-            <w:vAlign w:val="top"/>
-          </w:tcPr>
-          <w:p>
-            <w:pPr>
-              <w:keepNext w:val="false"/>
-              <w:bidi/>
-              <w:spacing w:after="30" w:before="30" w:line="264"/>
-            </w:pPr>
-            <w:r>
-              <w:rPr>
-                <w:rFonts w:ascii="Arial" w:cs="Arial" w:eastAsia="Arial" w:hAnsi="Arial"/>
-                <w:b w:val="false"/>
-                <w:bCs w:val="false"/>
-                <w:sz w:val="18"/>
-                <w:szCs w:val="18"/>
-                <w:rtl/>
-              </w:rPr>
-              <w:t xml:space="preserve">اختبار المتصفح (مقطع S3)</w:t>
-            </w:r>
-          </w:p>
-        </w:tc>
-        <w:tc>
-          <w:tcPr>
-            <w:tcW w:type="dxa" w:w="2438"/>
-            <w:tcBorders>
-              <w:top w:val="single" w:color="BFC9D6" w:sz="4"/>
-              <w:left w:val="single" w:color="BFC9D6" w:sz="4"/>
-              <w:bottom w:val="single" w:color="BFC9D6" w:sz="4"/>
-              <w:right w:val="single" w:color="BFC9D6" w:sz="4"/>
-            </w:tcBorders>
-            <w:tcMar>
-              <w:top w:type="dxa" w:w="50"/>
-              <w:left w:type="dxa" w:w="90"/>
-              <w:bottom w:type="dxa" w:w="50"/>
-              <w:right w:type="dxa" w:w="90"/>
-            </w:tcMar>
-            <w:vAlign w:val="top"/>
-          </w:tcPr>
-          <w:p>
-            <w:pPr>
-              <w:keepNext w:val="false"/>
-              <w:bidi/>
-              <w:spacing w:after="30" w:before="30" w:line="264"/>
-            </w:pPr>
-            <w:r>
-              <w:rPr>
-                <w:rFonts w:ascii="Arial" w:cs="Arial" w:eastAsia="Arial" w:hAnsi="Arial"/>
-                <w:b w:val="false"/>
-                <w:bCs w:val="false"/>
-                <w:sz w:val="18"/>
-                <w:szCs w:val="18"/>
-                <w:rtl/>
-              </w:rPr>
-              <w:t xml:space="preserve">لوحة المدير، وصندوق المهام، وقوالب نماذج البنوك في بوابة المشترك</w:t>
-            </w:r>
-          </w:p>
-        </w:tc>
-        <w:tc>
-          <w:tcPr>
-            <w:tcW w:type="dxa" w:w="4878"/>
-            <w:tcBorders>
-              <w:top w:val="single" w:color="BFC9D6" w:sz="4"/>
-              <w:left w:val="single" w:color="BFC9D6" w:sz="4"/>
-              <w:bottom w:val="single" w:color="BFC9D6" w:sz="4"/>
-              <w:right w:val="single" w:color="BFC9D6" w:sz="4"/>
-            </w:tcBorders>
-            <w:tcMar>
-              <w:top w:type="dxa" w:w="50"/>
-              <w:left w:type="dxa" w:w="90"/>
-              <w:bottom w:type="dxa" w:w="50"/>
-              <w:right w:type="dxa" w:w="90"/>
-            </w:tcMar>
-            <w:vAlign w:val="top"/>
-          </w:tcPr>
-          <w:p>
-            <w:pPr>
-              <w:keepNext w:val="false"/>
-              <w:bidi/>
-              <w:spacing w:after="30" w:before="30" w:line="264"/>
-            </w:pPr>
+            <w:tcW w:type="dxa" w:w="1463"/>
+            <w:tcBorders>
+              <w:top w:val="single" w:color="BFC9D6" w:sz="4"/>
+              <w:left w:val="single" w:color="BFC9D6" w:sz="4"/>
+              <w:bottom w:val="single" w:color="BFC9D6" w:sz="4"/>
+              <w:right w:val="single" w:color="BFC9D6" w:sz="4"/>
+            </w:tcBorders>
+            <w:tcMar>
+              <w:top w:type="dxa" w:w="50"/>
+              <w:left w:type="dxa" w:w="90"/>
+              <w:bottom w:type="dxa" w:w="50"/>
+              <w:right w:type="dxa" w:w="90"/>
+            </w:tcMar>
+            <w:vAlign w:val="top"/>
+          </w:tcPr>
+          <w:p>
+            <w:pPr>
+              <w:keepNext w:val="false"/>
+              <w:bidi/>
+              <w:spacing w:after="30" w:before="30" w:line="264"/>
+            </w:pPr>
+            <w:r>
+              <w:rPr>
+                <w:rFonts w:ascii="Arial" w:cs="Arial" w:eastAsia="Arial" w:hAnsi="Arial"/>
+                <w:b/>
+                <w:bCs/>
+                <w:sz w:val="18"/>
+                <w:szCs w:val="18"/>
+                <w:rtl/>
+              </w:rPr>
+              <w:t xml:space="preserve">BR-FAC-021 مرجع المنصة (طلب المالك)</w:t>
+            </w:r>
+          </w:p>
+        </w:tc>
+        <w:tc>
+          <w:tcPr>
+            <w:tcW w:type="dxa" w:w="2476"/>
+            <w:tcBorders>
+              <w:top w:val="single" w:color="BFC9D6" w:sz="4"/>
+              <w:left w:val="single" w:color="BFC9D6" w:sz="4"/>
+              <w:bottom w:val="single" w:color="BFC9D6" w:sz="4"/>
+              <w:right w:val="single" w:color="BFC9D6" w:sz="4"/>
+            </w:tcBorders>
+            <w:tcMar>
+              <w:top w:type="dxa" w:w="50"/>
+              <w:left w:type="dxa" w:w="90"/>
+              <w:bottom w:type="dxa" w:w="50"/>
+              <w:right w:type="dxa" w:w="90"/>
+            </w:tcMar>
+            <w:vAlign w:val="top"/>
+          </w:tcPr>
+          <w:p>
+            <w:pPr>
+              <w:keepNext w:val="false"/>
+              <w:bidi/>
+              <w:spacing w:after="30" w:before="30" w:line="264"/>
+            </w:pPr>
+            <w:r>
+              <w:rPr>
+                <w:rFonts w:ascii="Arial" w:cs="Arial" w:eastAsia="Arial" w:hAnsi="Arial"/>
+                <w:b w:val="false"/>
+                <w:bCs w:val="false"/>
+                <w:sz w:val="18"/>
+                <w:szCs w:val="18"/>
+                <w:rtl/>
+              </w:rPr>
+              <w:t xml:space="preserve">رمزا الشركة والبنك يؤخذان من رمزيهما، والرمز بشكل آخر مرفوض، ورمز البنك المكرر مرفوض؛ تسهيل بلا فئة لا يُعتمد (V-FAC-REF)؛ الاعتماد الأول يكتب </w:t>
+            </w:r>
             <w:r>
               <w:rPr>
                 <w:rFonts w:ascii="Courier New" w:cs="Courier New" w:eastAsia="Courier New" w:hAnsi="Courier New"/>
@@ -47659,43 +47658,306 @@
                 <w:shd w:fill="F1F3F5" w:color="auto" w:val="clear"/>
                 <w:rtl/>
               </w:rPr>
+              <w:t xml:space="preserve">‎IMP-SNB-CAP-yy‎</w:t>
+            </w:r>
+            <w:r>
+              <w:rPr>
+                <w:rFonts w:ascii="Arial" w:cs="Arial" w:eastAsia="Arial" w:hAnsi="Arial"/>
+                <w:b w:val="false"/>
+                <w:bCs w:val="false"/>
+                <w:sz w:val="18"/>
+                <w:szCs w:val="18"/>
+                <w:rtl/>
+              </w:rPr>
+              <w:t xml:space="preserve">، والفئة لا تتغير بعده، وتغيير رمز الشركة لا يغير المرجع المكتوب؛ تسهيل ثانٍ </w:t>
+            </w:r>
+            <w:r>
+              <w:rPr>
+                <w:rFonts w:ascii="Courier New" w:cs="Courier New" w:eastAsia="Courier New" w:hAnsi="Courier New"/>
+                <w:b w:val="false"/>
+                <w:bCs w:val="false"/>
+                <w:color w:val="1F2937"/>
+                <w:sz w:val="16"/>
+                <w:szCs w:val="16"/>
+                <w:shd w:fill="F1F3F5" w:color="auto" w:val="clear"/>
+                <w:rtl/>
+              </w:rPr>
+              <w:t xml:space="preserve">‎-2‎</w:t>
+            </w:r>
+            <w:r>
+              <w:rPr>
+                <w:rFonts w:ascii="Arial" w:cs="Arial" w:eastAsia="Arial" w:hAnsi="Arial"/>
+                <w:b w:val="false"/>
+                <w:bCs w:val="false"/>
+                <w:sz w:val="18"/>
+                <w:szCs w:val="18"/>
+                <w:rtl/>
+              </w:rPr>
+              <w:t xml:space="preserve">، والبحث يجده؛ والتجديد يرث الجذع بسنته</w:t>
+            </w:r>
+          </w:p>
+        </w:tc>
+        <w:tc>
+          <w:tcPr>
+            <w:tcW w:type="dxa" w:w="4955"/>
+            <w:tcBorders>
+              <w:top w:val="single" w:color="BFC9D6" w:sz="4"/>
+              <w:left w:val="single" w:color="BFC9D6" w:sz="4"/>
+              <w:bottom w:val="single" w:color="BFC9D6" w:sz="4"/>
+              <w:right w:val="single" w:color="BFC9D6" w:sz="4"/>
+            </w:tcBorders>
+            <w:tcMar>
+              <w:top w:type="dxa" w:w="50"/>
+              <w:left w:type="dxa" w:w="90"/>
+              <w:bottom w:type="dxa" w:w="50"/>
+              <w:right w:type="dxa" w:w="90"/>
+            </w:tcMar>
+            <w:vAlign w:val="top"/>
+          </w:tcPr>
+          <w:p>
+            <w:pPr>
+              <w:keepNext w:val="false"/>
+              <w:bidi/>
+              <w:spacing w:after="30" w:before="30" w:line="264"/>
+            </w:pPr>
+            <w:r>
+              <w:rPr>
+                <w:rFonts w:ascii="Courier New" w:cs="Courier New" w:eastAsia="Courier New" w:hAnsi="Courier New"/>
+                <w:b w:val="false"/>
+                <w:bCs w:val="false"/>
+                <w:color w:val="1F2937"/>
+                <w:sz w:val="16"/>
+                <w:szCs w:val="16"/>
+                <w:shd w:fill="F1F3F5" w:color="auto" w:val="clear"/>
+                <w:rtl/>
+              </w:rPr>
+              <w:t xml:space="preserve">‎FacilityTests.BR_FAC_021_*‎</w:t>
+            </w:r>
+            <w:r>
+              <w:rPr>
+                <w:rFonts w:ascii="Arial" w:cs="Arial" w:eastAsia="Arial" w:hAnsi="Arial"/>
+                <w:b w:val="false"/>
+                <w:bCs w:val="false"/>
+                <w:sz w:val="18"/>
+                <w:szCs w:val="18"/>
+                <w:rtl/>
+              </w:rPr>
+              <w:t xml:space="preserve"> و</w:t>
+            </w:r>
+            <w:r>
+              <w:rPr>
+                <w:rFonts w:ascii="Courier New" w:cs="Courier New" w:eastAsia="Courier New" w:hAnsi="Courier New"/>
+                <w:b w:val="false"/>
+                <w:bCs w:val="false"/>
+                <w:color w:val="1F2937"/>
+                <w:sz w:val="16"/>
+                <w:szCs w:val="16"/>
+                <w:shd w:fill="F1F3F5" w:color="auto" w:val="clear"/>
+                <w:rtl/>
+              </w:rPr>
+              <w:t xml:space="preserve">‎FacilityReferenceTests‎</w:t>
+            </w:r>
+            <w:r>
+              <w:rPr>
+                <w:rFonts w:ascii="Arial" w:cs="Arial" w:eastAsia="Arial" w:hAnsi="Arial"/>
+                <w:b w:val="false"/>
+                <w:bCs w:val="false"/>
+                <w:sz w:val="18"/>
+                <w:szCs w:val="18"/>
+                <w:rtl/>
+              </w:rPr>
+              <w:t xml:space="preserve"> (وحدة)</w:t>
+            </w:r>
+          </w:p>
+        </w:tc>
+        <w:tc>
+          <w:tcPr>
+            <w:tcW w:type="dxa" w:w="970"/>
+            <w:tcBorders>
+              <w:top w:val="single" w:color="BFC9D6" w:sz="4"/>
+              <w:left w:val="single" w:color="BFC9D6" w:sz="4"/>
+              <w:bottom w:val="single" w:color="BFC9D6" w:sz="4"/>
+              <w:right w:val="single" w:color="BFC9D6" w:sz="4"/>
+            </w:tcBorders>
+            <w:tcMar>
+              <w:top w:type="dxa" w:w="50"/>
+              <w:left w:type="dxa" w:w="90"/>
+              <w:bottom w:type="dxa" w:w="50"/>
+              <w:right w:type="dxa" w:w="90"/>
+            </w:tcMar>
+            <w:vAlign w:val="top"/>
+          </w:tcPr>
+          <w:p>
+            <w:pPr>
+              <w:keepNext w:val="false"/>
+              <w:bidi/>
+              <w:spacing w:after="30" w:before="30" w:line="264"/>
+            </w:pPr>
+            <w:r>
+              <w:rPr>
+                <w:rFonts w:ascii="Arial" w:cs="Arial" w:eastAsia="Arial" w:hAnsi="Arial"/>
+                <w:b w:val="false"/>
+                <w:bCs w:val="false"/>
+                <w:sz w:val="18"/>
+                <w:szCs w:val="18"/>
+                <w:rtl/>
+              </w:rPr>
+              <w:t xml:space="preserve">ناجح</w:t>
+            </w:r>
+          </w:p>
+        </w:tc>
+      </w:tr>
+      <w:tr>
+        <w:trPr>
+          <w:cantSplit/>
+        </w:trPr>
+        <w:tc>
+          <w:tcPr>
+            <w:tcW w:type="dxa" w:w="1463"/>
+            <w:tcBorders>
+              <w:top w:val="single" w:color="BFC9D6" w:sz="4"/>
+              <w:left w:val="single" w:color="BFC9D6" w:sz="4"/>
+              <w:bottom w:val="single" w:color="BFC9D6" w:sz="4"/>
+              <w:right w:val="single" w:color="BFC9D6" w:sz="4"/>
+            </w:tcBorders>
+            <w:shd w:fill="F5F8FC" w:color="auto" w:val="clear"/>
+            <w:tcMar>
+              <w:top w:type="dxa" w:w="50"/>
+              <w:left w:type="dxa" w:w="90"/>
+              <w:bottom w:type="dxa" w:w="50"/>
+              <w:right w:type="dxa" w:w="90"/>
+            </w:tcMar>
+            <w:vAlign w:val="top"/>
+          </w:tcPr>
+          <w:p>
+            <w:pPr>
+              <w:keepNext w:val="false"/>
+              <w:bidi/>
+              <w:spacing w:after="30" w:before="30" w:line="264"/>
+            </w:pPr>
+            <w:r>
+              <w:rPr>
+                <w:rFonts w:ascii="Arial" w:cs="Arial" w:eastAsia="Arial" w:hAnsi="Arial"/>
+                <w:b w:val="false"/>
+                <w:bCs w:val="false"/>
+                <w:sz w:val="18"/>
+                <w:szCs w:val="18"/>
+                <w:rtl/>
+              </w:rPr>
+              <w:t xml:space="preserve">اختبار المتصفح (مقطع S3)</w:t>
+            </w:r>
+          </w:p>
+        </w:tc>
+        <w:tc>
+          <w:tcPr>
+            <w:tcW w:type="dxa" w:w="2476"/>
+            <w:tcBorders>
+              <w:top w:val="single" w:color="BFC9D6" w:sz="4"/>
+              <w:left w:val="single" w:color="BFC9D6" w:sz="4"/>
+              <w:bottom w:val="single" w:color="BFC9D6" w:sz="4"/>
+              <w:right w:val="single" w:color="BFC9D6" w:sz="4"/>
+            </w:tcBorders>
+            <w:shd w:fill="F5F8FC" w:color="auto" w:val="clear"/>
+            <w:tcMar>
+              <w:top w:type="dxa" w:w="50"/>
+              <w:left w:type="dxa" w:w="90"/>
+              <w:bottom w:type="dxa" w:w="50"/>
+              <w:right w:type="dxa" w:w="90"/>
+            </w:tcMar>
+            <w:vAlign w:val="top"/>
+          </w:tcPr>
+          <w:p>
+            <w:pPr>
+              <w:keepNext w:val="false"/>
+              <w:bidi/>
+              <w:spacing w:after="30" w:before="30" w:line="264"/>
+            </w:pPr>
+            <w:r>
+              <w:rPr>
+                <w:rFonts w:ascii="Arial" w:cs="Arial" w:eastAsia="Arial" w:hAnsi="Arial"/>
+                <w:b w:val="false"/>
+                <w:bCs w:val="false"/>
+                <w:sz w:val="18"/>
+                <w:szCs w:val="18"/>
+                <w:rtl/>
+              </w:rPr>
+              <w:t xml:space="preserve">لوحة المدير، وصندوق المهام، وقوالب نماذج البنوك في بوابة المشترك</w:t>
+            </w:r>
+          </w:p>
+        </w:tc>
+        <w:tc>
+          <w:tcPr>
+            <w:tcW w:type="dxa" w:w="4955"/>
+            <w:tcBorders>
+              <w:top w:val="single" w:color="BFC9D6" w:sz="4"/>
+              <w:left w:val="single" w:color="BFC9D6" w:sz="4"/>
+              <w:bottom w:val="single" w:color="BFC9D6" w:sz="4"/>
+              <w:right w:val="single" w:color="BFC9D6" w:sz="4"/>
+            </w:tcBorders>
+            <w:shd w:fill="F5F8FC" w:color="auto" w:val="clear"/>
+            <w:tcMar>
+              <w:top w:type="dxa" w:w="50"/>
+              <w:left w:type="dxa" w:w="90"/>
+              <w:bottom w:type="dxa" w:w="50"/>
+              <w:right w:type="dxa" w:w="90"/>
+            </w:tcMar>
+            <w:vAlign w:val="top"/>
+          </w:tcPr>
+          <w:p>
+            <w:pPr>
+              <w:keepNext w:val="false"/>
+              <w:bidi/>
+              <w:spacing w:after="30" w:before="30" w:line="264"/>
+            </w:pPr>
+            <w:r>
+              <w:rPr>
+                <w:rFonts w:ascii="Courier New" w:cs="Courier New" w:eastAsia="Courier New" w:hAnsi="Courier New"/>
+                <w:b w:val="false"/>
+                <w:bCs w:val="false"/>
+                <w:color w:val="1F2937"/>
+                <w:sz w:val="16"/>
+                <w:szCs w:val="16"/>
+                <w:shd w:fill="F1F3F5" w:color="auto" w:val="clear"/>
+                <w:rtl/>
+              </w:rPr>
               <w:t xml:space="preserve">‎e2e/s0.spec.ts‎</w:t>
             </w:r>
           </w:p>
         </w:tc>
         <w:tc>
           <w:tcPr>
-            <w:tcW w:type="dxa" w:w="1108"/>
-            <w:tcBorders>
-              <w:top w:val="single" w:color="BFC9D6" w:sz="4"/>
-              <w:left w:val="single" w:color="BFC9D6" w:sz="4"/>
-              <w:bottom w:val="single" w:color="BFC9D6" w:sz="4"/>
-              <w:right w:val="single" w:color="BFC9D6" w:sz="4"/>
-            </w:tcBorders>
-            <w:tcMar>
-              <w:top w:type="dxa" w:w="50"/>
-              <w:left w:type="dxa" w:w="90"/>
-              <w:bottom w:type="dxa" w:w="50"/>
-              <w:right w:type="dxa" w:w="90"/>
-            </w:tcMar>
-            <w:vAlign w:val="top"/>
-          </w:tcPr>
-          <w:p>
-            <w:pPr>
-              <w:keepNext w:val="false"/>
-              <w:bidi/>
-              <w:spacing w:after="30" w:before="30" w:line="264"/>
-            </w:pPr>
-            <w:r>
-              <w:rPr>
-                <w:rFonts w:ascii="Arial" w:cs="Arial" w:eastAsia="Arial" w:hAnsi="Arial"/>
-                <w:b w:val="false"/>
-                <w:bCs w:val="false"/>
-                <w:sz w:val="18"/>
-                <w:szCs w:val="18"/>
-                <w:rtl/>
-              </w:rPr>
-              <w:t xml:space="preserve">مكتوب</w:t>
+            <w:tcW w:type="dxa" w:w="970"/>
+            <w:tcBorders>
+              <w:top w:val="single" w:color="BFC9D6" w:sz="4"/>
+              <w:left w:val="single" w:color="BFC9D6" w:sz="4"/>
+              <w:bottom w:val="single" w:color="BFC9D6" w:sz="4"/>
+              <w:right w:val="single" w:color="BFC9D6" w:sz="4"/>
+            </w:tcBorders>
+            <w:shd w:fill="F5F8FC" w:color="auto" w:val="clear"/>
+            <w:tcMar>
+              <w:top w:type="dxa" w:w="50"/>
+              <w:left w:type="dxa" w:w="90"/>
+              <w:bottom w:type="dxa" w:w="50"/>
+              <w:right w:type="dxa" w:w="90"/>
+            </w:tcMar>
+            <w:vAlign w:val="top"/>
+          </w:tcPr>
+          <w:p>
+            <w:pPr>
+              <w:keepNext w:val="false"/>
+              <w:bidi/>
+              <w:spacing w:after="30" w:before="30" w:line="264"/>
+            </w:pPr>
+            <w:r>
+              <w:rPr>
+                <w:rFonts w:ascii="Arial" w:cs="Arial" w:eastAsia="Arial" w:hAnsi="Arial"/>
+                <w:b w:val="false"/>
+                <w:bCs w:val="false"/>
+                <w:sz w:val="18"/>
+                <w:szCs w:val="18"/>
+                <w:rtl/>
+              </w:rPr>
+              <w:t xml:space="preserve">ناجح</w:t>
             </w:r>
           </w:p>
         </w:tc>

</xml_diff>

<commit_message>
docs/48 and DOC-B02: the database check passed on a9f8d5f
Co-Authored-By: Claude Opus 5.5 <noreply@anthropic.com>
Claude-Session: https://claude.ai/code/session_012HHcRrzuvMBTL2FYxXtsyv
</commit_message>
<xml_diff>
--- a/treasury-platform/docs/30-readiness/word/DOC-B02-acceptance-criteria-register-s0-s1.docx
+++ b/treasury-platform/docs/30-readiness/word/DOC-B02-acceptance-criteria-register-s0-s1.docx
@@ -44899,7 +44899,31 @@
           <w:szCs w:val="21"/>
           <w:rtl/>
         </w:rPr>
-        <w:t xml:space="preserve">) على الإيداع 5991dad: 157 اختبار وحدة، واختبار المتصفح، و104 اختبارات تكامل، كلها ناجحة. وكشفت الدورات قبله أخطاء أُصلحت (§5 من docs/48): كلمة محجوزة في لوحة المدير، وجمود في قاعدة البيانات تحت التزامن، وساعة التفويض.</w:t>
+        <w:t xml:space="preserve">) على الإيداع 5991dad: 157 اختبار وحدة، واختبار المتصفح، و104 اختبارات تكامل، كلها ناجحة. ونجح فحص قاعدة البيانات (</w:t>
+      </w:r>
+      <w:r>
+        <w:rPr>
+          <w:rFonts w:ascii="Courier New" w:cs="Courier New" w:eastAsia="Courier New" w:hAnsi="Courier New"/>
+          <w:b w:val="false"/>
+          <w:bCs w:val="false"/>
+          <w:color w:val="1F2937"/>
+          <w:sz w:val="18"/>
+          <w:szCs w:val="18"/>
+          <w:shd w:fill="F1F3F5" w:color="auto" w:val="clear"/>
+          <w:rtl/>
+        </w:rPr>
+        <w:t xml:space="preserve">‎tools/ci/db_ci.sh‎</w:t>
+      </w:r>
+      <w:r>
+        <w:rPr>
+          <w:rFonts w:ascii="Arial" w:cs="Arial" w:eastAsia="Arial" w:hAnsi="Arial"/>
+          <w:b w:val="false"/>
+          <w:bCs w:val="false"/>
+          <w:sz w:val="21"/>
+          <w:szCs w:val="21"/>
+          <w:rtl/>
+        </w:rPr>
+        <w:t xml:space="preserve">) كله على a9f8d5f. وكشفت الدورات قبله أخطاء أُصلحت (§5 من docs/48): كلمة محجوزة في لوحة المدير، وجمود في قاعدة البيانات تحت التزامن، وساعة التفويض.</w:t>
       </w:r>
     </w:p>
     <w:tbl>

</xml_diff>